<commit_message>
updated details with ml logic
updated fs with ML logic
</commit_message>
<xml_diff>
--- a/docs/Master Business Requirement Document-MFS.docx
+++ b/docs/Master Business Requirement Document-MFS.docx
@@ -2765,6 +2765,9 @@
     </w:p>
     <w:p>
       <w:pPr>
+        <w:pBdr>
+          <w:bottom w:val="single" w:sz="6" w:space="1" w:color="auto"/>
+        </w:pBdr>
         <w:spacing w:before="100" w:beforeAutospacing="1" w:after="100" w:afterAutospacing="1" w:line="240" w:lineRule="auto"/>
         <w:rPr>
           <w:rFonts w:ascii="Times New Roman" w:eastAsia="Times New Roman" w:hAnsi="Times New Roman" w:cs="Times New Roman"/>
@@ -2783,6 +2786,2495 @@
           <w:lang w:eastAsia="en-IN" w:bidi="ta-IN"/>
         </w:rPr>
         <w:t>Would you like me to generate the "Sprint 0: Database Schema Design" showing exactly how the MongoDB and PostgreSQL tables will talk to each other?</w:t>
+      </w:r>
+    </w:p>
+    <w:p/>
+    <w:p>
+      <w:pPr>
+        <w:pStyle w:val="Heading1"/>
+      </w:pPr>
+      <w:r>
+        <w:t>Updated on 28-</w:t>
+      </w:r>
+      <w:proofErr w:type="gramStart"/>
+      <w:r>
+        <w:t>02 :</w:t>
+      </w:r>
+      <w:proofErr w:type="gramEnd"/>
+      <w:r>
+        <w:t xml:space="preserve"> this is related to ML </w:t>
+      </w:r>
+      <w:proofErr w:type="spellStart"/>
+      <w:r>
+        <w:t>Algo</w:t>
+      </w:r>
+      <w:proofErr w:type="spellEnd"/>
+      <w:r>
+        <w:t xml:space="preserve"> for the shadow phase. </w:t>
+      </w:r>
+    </w:p>
+    <w:p/>
+    <w:p>
+      <w:pPr>
+        <w:spacing w:before="100" w:beforeAutospacing="1" w:after="100" w:afterAutospacing="1" w:line="240" w:lineRule="auto"/>
+        <w:rPr>
+          <w:rFonts w:ascii="Times New Roman" w:eastAsia="Times New Roman" w:hAnsi="Times New Roman" w:cs="Times New Roman"/>
+          <w:sz w:val="24"/>
+          <w:szCs w:val="24"/>
+          <w:lang w:eastAsia="en-IN" w:bidi="ta-IN"/>
+        </w:rPr>
+      </w:pPr>
+      <w:r>
+        <w:rPr>
+          <w:rFonts w:ascii="Times New Roman" w:eastAsia="Times New Roman" w:hAnsi="Times New Roman" w:cs="Times New Roman"/>
+          <w:sz w:val="24"/>
+          <w:szCs w:val="24"/>
+          <w:lang w:eastAsia="en-IN" w:bidi="ta-IN"/>
+        </w:rPr>
+        <w:t xml:space="preserve">This update officially integrates the </w:t>
+      </w:r>
+      <w:r>
+        <w:rPr>
+          <w:rFonts w:ascii="Times New Roman" w:eastAsia="Times New Roman" w:hAnsi="Times New Roman" w:cs="Times New Roman"/>
+          <w:b/>
+          <w:bCs/>
+          <w:sz w:val="24"/>
+          <w:szCs w:val="24"/>
+          <w:lang w:eastAsia="en-IN" w:bidi="ta-IN"/>
+        </w:rPr>
+        <w:t>"Your Partner in Kitchen"</w:t>
+      </w:r>
+      <w:r>
+        <w:rPr>
+          <w:rFonts w:ascii="Times New Roman" w:eastAsia="Times New Roman" w:hAnsi="Times New Roman" w:cs="Times New Roman"/>
+          <w:sz w:val="24"/>
+          <w:szCs w:val="24"/>
+          <w:lang w:eastAsia="en-IN" w:bidi="ta-IN"/>
+        </w:rPr>
+        <w:t xml:space="preserve"> branding and the </w:t>
+      </w:r>
+      <w:r>
+        <w:rPr>
+          <w:rFonts w:ascii="Times New Roman" w:eastAsia="Times New Roman" w:hAnsi="Times New Roman" w:cs="Times New Roman"/>
+          <w:b/>
+          <w:bCs/>
+          <w:sz w:val="24"/>
+          <w:szCs w:val="24"/>
+          <w:lang w:eastAsia="en-IN" w:bidi="ta-IN"/>
+        </w:rPr>
+        <w:t>Autonomous AI Master Feature</w:t>
+      </w:r>
+      <w:r>
+        <w:rPr>
+          <w:rFonts w:ascii="Times New Roman" w:eastAsia="Times New Roman" w:hAnsi="Times New Roman" w:cs="Times New Roman"/>
+          <w:sz w:val="24"/>
+          <w:szCs w:val="24"/>
+          <w:lang w:eastAsia="en-IN" w:bidi="ta-IN"/>
+        </w:rPr>
+        <w:t xml:space="preserve"> into your core project documentation.</w:t>
+      </w:r>
+    </w:p>
+    <w:p>
+      <w:pPr>
+        <w:spacing w:before="100" w:beforeAutospacing="1" w:after="100" w:afterAutospacing="1" w:line="240" w:lineRule="auto"/>
+        <w:outlineLvl w:val="2"/>
+        <w:rPr>
+          <w:rFonts w:ascii="Times New Roman" w:eastAsia="Times New Roman" w:hAnsi="Times New Roman" w:cs="Times New Roman"/>
+          <w:b/>
+          <w:bCs/>
+          <w:sz w:val="27"/>
+          <w:szCs w:val="27"/>
+          <w:lang w:eastAsia="en-IN" w:bidi="ta-IN"/>
+        </w:rPr>
+      </w:pPr>
+      <w:r>
+        <w:rPr>
+          <w:rFonts w:ascii="Times New Roman" w:eastAsia="Times New Roman" w:hAnsi="Times New Roman" w:cs="Times New Roman"/>
+          <w:b/>
+          <w:bCs/>
+          <w:sz w:val="27"/>
+          <w:szCs w:val="27"/>
+          <w:lang w:eastAsia="en-IN" w:bidi="ta-IN"/>
+        </w:rPr>
+        <w:lastRenderedPageBreak/>
+        <w:t>Document Update Summary</w:t>
+      </w:r>
+    </w:p>
+    <w:tbl>
+      <w:tblPr>
+        <w:tblW w:w="0" w:type="auto"/>
+        <w:tblCellSpacing w:w="15" w:type="dxa"/>
+        <w:tblCellMar>
+          <w:top w:w="15" w:type="dxa"/>
+          <w:left w:w="15" w:type="dxa"/>
+          <w:bottom w:w="15" w:type="dxa"/>
+          <w:right w:w="15" w:type="dxa"/>
+        </w:tblCellMar>
+        <w:tblLook w:val="04A0" w:firstRow="1" w:lastRow="0" w:firstColumn="1" w:lastColumn="0" w:noHBand="0" w:noVBand="1"/>
+      </w:tblPr>
+      <w:tblGrid>
+        <w:gridCol w:w="1462"/>
+        <w:gridCol w:w="1676"/>
+        <w:gridCol w:w="6008"/>
+      </w:tblGrid>
+      <w:tr>
+        <w:trPr>
+          <w:tblHeader/>
+          <w:tblCellSpacing w:w="15" w:type="dxa"/>
+        </w:trPr>
+        <w:tc>
+          <w:tcPr>
+            <w:tcW w:w="0" w:type="auto"/>
+            <w:tcBorders>
+              <w:top w:val="single" w:sz="6" w:space="0" w:color="auto"/>
+              <w:left w:val="single" w:sz="6" w:space="0" w:color="auto"/>
+              <w:bottom w:val="single" w:sz="6" w:space="0" w:color="auto"/>
+              <w:right w:val="single" w:sz="6" w:space="0" w:color="auto"/>
+            </w:tcBorders>
+            <w:vAlign w:val="center"/>
+            <w:hideMark/>
+          </w:tcPr>
+          <w:p>
+            <w:pPr>
+              <w:spacing w:after="480" w:line="240" w:lineRule="auto"/>
+              <w:rPr>
+                <w:rFonts w:ascii="Times New Roman" w:eastAsia="Times New Roman" w:hAnsi="Times New Roman" w:cs="Times New Roman"/>
+                <w:sz w:val="24"/>
+                <w:szCs w:val="24"/>
+                <w:lang w:eastAsia="en-IN" w:bidi="ta-IN"/>
+              </w:rPr>
+            </w:pPr>
+            <w:r>
+              <w:rPr>
+                <w:rFonts w:ascii="Times New Roman" w:eastAsia="Times New Roman" w:hAnsi="Times New Roman" w:cs="Times New Roman"/>
+                <w:b/>
+                <w:bCs/>
+                <w:sz w:val="24"/>
+                <w:szCs w:val="24"/>
+                <w:lang w:eastAsia="en-IN" w:bidi="ta-IN"/>
+              </w:rPr>
+              <w:t>Document</w:t>
+            </w:r>
+          </w:p>
+        </w:tc>
+        <w:tc>
+          <w:tcPr>
+            <w:tcW w:w="0" w:type="auto"/>
+            <w:tcBorders>
+              <w:top w:val="single" w:sz="6" w:space="0" w:color="auto"/>
+              <w:left w:val="single" w:sz="6" w:space="0" w:color="auto"/>
+              <w:bottom w:val="single" w:sz="6" w:space="0" w:color="auto"/>
+              <w:right w:val="single" w:sz="6" w:space="0" w:color="auto"/>
+            </w:tcBorders>
+            <w:vAlign w:val="center"/>
+            <w:hideMark/>
+          </w:tcPr>
+          <w:p>
+            <w:pPr>
+              <w:spacing w:after="480" w:line="240" w:lineRule="auto"/>
+              <w:rPr>
+                <w:rFonts w:ascii="Times New Roman" w:eastAsia="Times New Roman" w:hAnsi="Times New Roman" w:cs="Times New Roman"/>
+                <w:sz w:val="24"/>
+                <w:szCs w:val="24"/>
+                <w:lang w:eastAsia="en-IN" w:bidi="ta-IN"/>
+              </w:rPr>
+            </w:pPr>
+            <w:r>
+              <w:rPr>
+                <w:rFonts w:ascii="Times New Roman" w:eastAsia="Times New Roman" w:hAnsi="Times New Roman" w:cs="Times New Roman"/>
+                <w:b/>
+                <w:bCs/>
+                <w:sz w:val="24"/>
+                <w:szCs w:val="24"/>
+                <w:lang w:eastAsia="en-IN" w:bidi="ta-IN"/>
+              </w:rPr>
+              <w:t>Section Updated</w:t>
+            </w:r>
+          </w:p>
+        </w:tc>
+        <w:tc>
+          <w:tcPr>
+            <w:tcW w:w="0" w:type="auto"/>
+            <w:tcBorders>
+              <w:top w:val="single" w:sz="6" w:space="0" w:color="auto"/>
+              <w:left w:val="single" w:sz="6" w:space="0" w:color="auto"/>
+              <w:bottom w:val="single" w:sz="6" w:space="0" w:color="auto"/>
+              <w:right w:val="single" w:sz="6" w:space="0" w:color="auto"/>
+            </w:tcBorders>
+            <w:vAlign w:val="center"/>
+            <w:hideMark/>
+          </w:tcPr>
+          <w:p>
+            <w:pPr>
+              <w:spacing w:after="480" w:line="240" w:lineRule="auto"/>
+              <w:rPr>
+                <w:rFonts w:ascii="Times New Roman" w:eastAsia="Times New Roman" w:hAnsi="Times New Roman" w:cs="Times New Roman"/>
+                <w:sz w:val="24"/>
+                <w:szCs w:val="24"/>
+                <w:lang w:eastAsia="en-IN" w:bidi="ta-IN"/>
+              </w:rPr>
+            </w:pPr>
+            <w:r>
+              <w:rPr>
+                <w:rFonts w:ascii="Times New Roman" w:eastAsia="Times New Roman" w:hAnsi="Times New Roman" w:cs="Times New Roman"/>
+                <w:b/>
+                <w:bCs/>
+                <w:sz w:val="24"/>
+                <w:szCs w:val="24"/>
+                <w:lang w:eastAsia="en-IN" w:bidi="ta-IN"/>
+              </w:rPr>
+              <w:t>Nature of Change</w:t>
+            </w:r>
+          </w:p>
+        </w:tc>
+      </w:tr>
+      <w:tr>
+        <w:trPr>
+          <w:tblCellSpacing w:w="15" w:type="dxa"/>
+        </w:trPr>
+        <w:tc>
+          <w:tcPr>
+            <w:tcW w:w="0" w:type="auto"/>
+            <w:tcBorders>
+              <w:top w:val="single" w:sz="6" w:space="0" w:color="auto"/>
+              <w:left w:val="single" w:sz="6" w:space="0" w:color="auto"/>
+              <w:bottom w:val="single" w:sz="6" w:space="0" w:color="auto"/>
+              <w:right w:val="single" w:sz="6" w:space="0" w:color="auto"/>
+            </w:tcBorders>
+            <w:vAlign w:val="center"/>
+            <w:hideMark/>
+          </w:tcPr>
+          <w:p>
+            <w:pPr>
+              <w:spacing w:after="480" w:line="240" w:lineRule="auto"/>
+              <w:rPr>
+                <w:rFonts w:ascii="Times New Roman" w:eastAsia="Times New Roman" w:hAnsi="Times New Roman" w:cs="Times New Roman"/>
+                <w:sz w:val="24"/>
+                <w:szCs w:val="24"/>
+                <w:lang w:eastAsia="en-IN" w:bidi="ta-IN"/>
+              </w:rPr>
+            </w:pPr>
+            <w:r>
+              <w:rPr>
+                <w:rFonts w:ascii="Times New Roman" w:eastAsia="Times New Roman" w:hAnsi="Times New Roman" w:cs="Times New Roman"/>
+                <w:b/>
+                <w:bCs/>
+                <w:sz w:val="24"/>
+                <w:szCs w:val="24"/>
+                <w:lang w:eastAsia="en-IN" w:bidi="ta-IN"/>
+              </w:rPr>
+              <w:t>Project Charter</w:t>
+            </w:r>
+          </w:p>
+        </w:tc>
+        <w:tc>
+          <w:tcPr>
+            <w:tcW w:w="0" w:type="auto"/>
+            <w:tcBorders>
+              <w:top w:val="single" w:sz="6" w:space="0" w:color="auto"/>
+              <w:left w:val="single" w:sz="6" w:space="0" w:color="auto"/>
+              <w:bottom w:val="single" w:sz="6" w:space="0" w:color="auto"/>
+              <w:right w:val="single" w:sz="6" w:space="0" w:color="auto"/>
+            </w:tcBorders>
+            <w:vAlign w:val="center"/>
+            <w:hideMark/>
+          </w:tcPr>
+          <w:p>
+            <w:pPr>
+              <w:spacing w:after="480" w:line="240" w:lineRule="auto"/>
+              <w:rPr>
+                <w:rFonts w:ascii="Times New Roman" w:eastAsia="Times New Roman" w:hAnsi="Times New Roman" w:cs="Times New Roman"/>
+                <w:sz w:val="24"/>
+                <w:szCs w:val="24"/>
+                <w:lang w:eastAsia="en-IN" w:bidi="ta-IN"/>
+              </w:rPr>
+            </w:pPr>
+            <w:r>
+              <w:rPr>
+                <w:rFonts w:ascii="Times New Roman" w:eastAsia="Times New Roman" w:hAnsi="Times New Roman" w:cs="Times New Roman"/>
+                <w:b/>
+                <w:bCs/>
+                <w:sz w:val="24"/>
+                <w:szCs w:val="24"/>
+                <w:lang w:eastAsia="en-IN" w:bidi="ta-IN"/>
+              </w:rPr>
+              <w:t>Vision &amp; Branding</w:t>
+            </w:r>
+          </w:p>
+        </w:tc>
+        <w:tc>
+          <w:tcPr>
+            <w:tcW w:w="0" w:type="auto"/>
+            <w:tcBorders>
+              <w:top w:val="single" w:sz="6" w:space="0" w:color="auto"/>
+              <w:left w:val="single" w:sz="6" w:space="0" w:color="auto"/>
+              <w:bottom w:val="single" w:sz="6" w:space="0" w:color="auto"/>
+              <w:right w:val="single" w:sz="6" w:space="0" w:color="auto"/>
+            </w:tcBorders>
+            <w:vAlign w:val="center"/>
+            <w:hideMark/>
+          </w:tcPr>
+          <w:p>
+            <w:pPr>
+              <w:spacing w:after="480" w:line="240" w:lineRule="auto"/>
+              <w:rPr>
+                <w:rFonts w:ascii="Times New Roman" w:eastAsia="Times New Roman" w:hAnsi="Times New Roman" w:cs="Times New Roman"/>
+                <w:sz w:val="24"/>
+                <w:szCs w:val="24"/>
+                <w:lang w:eastAsia="en-IN" w:bidi="ta-IN"/>
+              </w:rPr>
+            </w:pPr>
+            <w:r>
+              <w:rPr>
+                <w:rFonts w:ascii="Times New Roman" w:eastAsia="Times New Roman" w:hAnsi="Times New Roman" w:cs="Times New Roman"/>
+                <w:sz w:val="24"/>
+                <w:szCs w:val="24"/>
+                <w:lang w:eastAsia="en-IN" w:bidi="ta-IN"/>
+              </w:rPr>
+              <w:t>Added "Your Partner in Kitchen" as the official tagline and core identity.</w:t>
+            </w:r>
+          </w:p>
+        </w:tc>
+      </w:tr>
+      <w:tr>
+        <w:trPr>
+          <w:tblCellSpacing w:w="15" w:type="dxa"/>
+        </w:trPr>
+        <w:tc>
+          <w:tcPr>
+            <w:tcW w:w="0" w:type="auto"/>
+            <w:tcBorders>
+              <w:top w:val="single" w:sz="6" w:space="0" w:color="auto"/>
+              <w:left w:val="single" w:sz="6" w:space="0" w:color="auto"/>
+              <w:bottom w:val="single" w:sz="6" w:space="0" w:color="auto"/>
+              <w:right w:val="single" w:sz="6" w:space="0" w:color="auto"/>
+            </w:tcBorders>
+            <w:vAlign w:val="center"/>
+            <w:hideMark/>
+          </w:tcPr>
+          <w:p>
+            <w:pPr>
+              <w:spacing w:after="480" w:line="240" w:lineRule="auto"/>
+              <w:rPr>
+                <w:rFonts w:ascii="Times New Roman" w:eastAsia="Times New Roman" w:hAnsi="Times New Roman" w:cs="Times New Roman"/>
+                <w:sz w:val="24"/>
+                <w:szCs w:val="24"/>
+                <w:lang w:eastAsia="en-IN" w:bidi="ta-IN"/>
+              </w:rPr>
+            </w:pPr>
+            <w:r>
+              <w:rPr>
+                <w:rFonts w:ascii="Times New Roman" w:eastAsia="Times New Roman" w:hAnsi="Times New Roman" w:cs="Times New Roman"/>
+                <w:b/>
+                <w:bCs/>
+                <w:sz w:val="24"/>
+                <w:szCs w:val="24"/>
+                <w:lang w:eastAsia="en-IN" w:bidi="ta-IN"/>
+              </w:rPr>
+              <w:t>BRS</w:t>
+            </w:r>
+          </w:p>
+        </w:tc>
+        <w:tc>
+          <w:tcPr>
+            <w:tcW w:w="0" w:type="auto"/>
+            <w:tcBorders>
+              <w:top w:val="single" w:sz="6" w:space="0" w:color="auto"/>
+              <w:left w:val="single" w:sz="6" w:space="0" w:color="auto"/>
+              <w:bottom w:val="single" w:sz="6" w:space="0" w:color="auto"/>
+              <w:right w:val="single" w:sz="6" w:space="0" w:color="auto"/>
+            </w:tcBorders>
+            <w:vAlign w:val="center"/>
+            <w:hideMark/>
+          </w:tcPr>
+          <w:p>
+            <w:pPr>
+              <w:spacing w:after="480" w:line="240" w:lineRule="auto"/>
+              <w:rPr>
+                <w:rFonts w:ascii="Times New Roman" w:eastAsia="Times New Roman" w:hAnsi="Times New Roman" w:cs="Times New Roman"/>
+                <w:sz w:val="24"/>
+                <w:szCs w:val="24"/>
+                <w:lang w:eastAsia="en-IN" w:bidi="ta-IN"/>
+              </w:rPr>
+            </w:pPr>
+            <w:r>
+              <w:rPr>
+                <w:rFonts w:ascii="Times New Roman" w:eastAsia="Times New Roman" w:hAnsi="Times New Roman" w:cs="Times New Roman"/>
+                <w:b/>
+                <w:bCs/>
+                <w:sz w:val="24"/>
+                <w:szCs w:val="24"/>
+                <w:lang w:eastAsia="en-IN" w:bidi="ta-IN"/>
+              </w:rPr>
+              <w:t>Business Objectives</w:t>
+            </w:r>
+          </w:p>
+        </w:tc>
+        <w:tc>
+          <w:tcPr>
+            <w:tcW w:w="0" w:type="auto"/>
+            <w:tcBorders>
+              <w:top w:val="single" w:sz="6" w:space="0" w:color="auto"/>
+              <w:left w:val="single" w:sz="6" w:space="0" w:color="auto"/>
+              <w:bottom w:val="single" w:sz="6" w:space="0" w:color="auto"/>
+              <w:right w:val="single" w:sz="6" w:space="0" w:color="auto"/>
+            </w:tcBorders>
+            <w:vAlign w:val="center"/>
+            <w:hideMark/>
+          </w:tcPr>
+          <w:p>
+            <w:pPr>
+              <w:spacing w:after="480" w:line="240" w:lineRule="auto"/>
+              <w:rPr>
+                <w:rFonts w:ascii="Times New Roman" w:eastAsia="Times New Roman" w:hAnsi="Times New Roman" w:cs="Times New Roman"/>
+                <w:sz w:val="24"/>
+                <w:szCs w:val="24"/>
+                <w:lang w:eastAsia="en-IN" w:bidi="ta-IN"/>
+              </w:rPr>
+            </w:pPr>
+            <w:r>
+              <w:rPr>
+                <w:rFonts w:ascii="Times New Roman" w:eastAsia="Times New Roman" w:hAnsi="Times New Roman" w:cs="Times New Roman"/>
+                <w:sz w:val="24"/>
+                <w:szCs w:val="24"/>
+                <w:lang w:eastAsia="en-IN" w:bidi="ta-IN"/>
+              </w:rPr>
+              <w:t>Shifted from "Planning Tool" to "Autonomous AI Partner" with a focus on Zero-Friction Intelligence.</w:t>
+            </w:r>
+          </w:p>
+        </w:tc>
+      </w:tr>
+      <w:tr>
+        <w:trPr>
+          <w:tblCellSpacing w:w="15" w:type="dxa"/>
+        </w:trPr>
+        <w:tc>
+          <w:tcPr>
+            <w:tcW w:w="0" w:type="auto"/>
+            <w:tcBorders>
+              <w:top w:val="single" w:sz="6" w:space="0" w:color="auto"/>
+              <w:left w:val="single" w:sz="6" w:space="0" w:color="auto"/>
+              <w:bottom w:val="single" w:sz="6" w:space="0" w:color="auto"/>
+              <w:right w:val="single" w:sz="6" w:space="0" w:color="auto"/>
+            </w:tcBorders>
+            <w:vAlign w:val="center"/>
+            <w:hideMark/>
+          </w:tcPr>
+          <w:p>
+            <w:pPr>
+              <w:spacing w:after="480" w:line="240" w:lineRule="auto"/>
+              <w:rPr>
+                <w:rFonts w:ascii="Times New Roman" w:eastAsia="Times New Roman" w:hAnsi="Times New Roman" w:cs="Times New Roman"/>
+                <w:sz w:val="24"/>
+                <w:szCs w:val="24"/>
+                <w:lang w:eastAsia="en-IN" w:bidi="ta-IN"/>
+              </w:rPr>
+            </w:pPr>
+            <w:r>
+              <w:rPr>
+                <w:rFonts w:ascii="Times New Roman" w:eastAsia="Times New Roman" w:hAnsi="Times New Roman" w:cs="Times New Roman"/>
+                <w:b/>
+                <w:bCs/>
+                <w:sz w:val="24"/>
+                <w:szCs w:val="24"/>
+                <w:lang w:eastAsia="en-IN" w:bidi="ta-IN"/>
+              </w:rPr>
+              <w:t>FS</w:t>
+            </w:r>
+          </w:p>
+        </w:tc>
+        <w:tc>
+          <w:tcPr>
+            <w:tcW w:w="0" w:type="auto"/>
+            <w:tcBorders>
+              <w:top w:val="single" w:sz="6" w:space="0" w:color="auto"/>
+              <w:left w:val="single" w:sz="6" w:space="0" w:color="auto"/>
+              <w:bottom w:val="single" w:sz="6" w:space="0" w:color="auto"/>
+              <w:right w:val="single" w:sz="6" w:space="0" w:color="auto"/>
+            </w:tcBorders>
+            <w:vAlign w:val="center"/>
+            <w:hideMark/>
+          </w:tcPr>
+          <w:p>
+            <w:pPr>
+              <w:spacing w:after="480" w:line="240" w:lineRule="auto"/>
+              <w:rPr>
+                <w:rFonts w:ascii="Times New Roman" w:eastAsia="Times New Roman" w:hAnsi="Times New Roman" w:cs="Times New Roman"/>
+                <w:sz w:val="24"/>
+                <w:szCs w:val="24"/>
+                <w:lang w:eastAsia="en-IN" w:bidi="ta-IN"/>
+              </w:rPr>
+            </w:pPr>
+            <w:r>
+              <w:rPr>
+                <w:rFonts w:ascii="Times New Roman" w:eastAsia="Times New Roman" w:hAnsi="Times New Roman" w:cs="Times New Roman"/>
+                <w:b/>
+                <w:bCs/>
+                <w:sz w:val="24"/>
+                <w:szCs w:val="24"/>
+                <w:lang w:eastAsia="en-IN" w:bidi="ta-IN"/>
+              </w:rPr>
+              <w:t>Functional Scope</w:t>
+            </w:r>
+          </w:p>
+        </w:tc>
+        <w:tc>
+          <w:tcPr>
+            <w:tcW w:w="0" w:type="auto"/>
+            <w:tcBorders>
+              <w:top w:val="single" w:sz="6" w:space="0" w:color="auto"/>
+              <w:left w:val="single" w:sz="6" w:space="0" w:color="auto"/>
+              <w:bottom w:val="single" w:sz="6" w:space="0" w:color="auto"/>
+              <w:right w:val="single" w:sz="6" w:space="0" w:color="auto"/>
+            </w:tcBorders>
+            <w:vAlign w:val="center"/>
+            <w:hideMark/>
+          </w:tcPr>
+          <w:p>
+            <w:pPr>
+              <w:spacing w:after="480" w:line="240" w:lineRule="auto"/>
+              <w:rPr>
+                <w:rFonts w:ascii="Times New Roman" w:eastAsia="Times New Roman" w:hAnsi="Times New Roman" w:cs="Times New Roman"/>
+                <w:sz w:val="24"/>
+                <w:szCs w:val="24"/>
+                <w:lang w:eastAsia="en-IN" w:bidi="ta-IN"/>
+              </w:rPr>
+            </w:pPr>
+            <w:r>
+              <w:rPr>
+                <w:rFonts w:ascii="Times New Roman" w:eastAsia="Times New Roman" w:hAnsi="Times New Roman" w:cs="Times New Roman"/>
+                <w:sz w:val="24"/>
+                <w:szCs w:val="24"/>
+                <w:lang w:eastAsia="en-IN" w:bidi="ta-IN"/>
+              </w:rPr>
+              <w:t>Added the 4-week "Shadow Phase" logic, Complexity Budgeting, and Market Signal (₹1,277) overrides.</w:t>
+            </w:r>
+          </w:p>
+        </w:tc>
+      </w:tr>
+    </w:tbl>
+    <w:p>
+      <w:pPr>
+        <w:spacing w:after="0" w:line="240" w:lineRule="auto"/>
+        <w:rPr>
+          <w:rFonts w:ascii="Times New Roman" w:eastAsia="Times New Roman" w:hAnsi="Times New Roman" w:cs="Times New Roman"/>
+          <w:sz w:val="24"/>
+          <w:szCs w:val="24"/>
+          <w:lang w:eastAsia="en-IN" w:bidi="ta-IN"/>
+        </w:rPr>
+      </w:pPr>
+      <w:r>
+        <w:rPr>
+          <w:rFonts w:ascii="Times New Roman" w:eastAsia="Times New Roman" w:hAnsi="Times New Roman" w:cs="Times New Roman"/>
+          <w:sz w:val="24"/>
+          <w:szCs w:val="24"/>
+          <w:lang w:eastAsia="en-IN" w:bidi="ta-IN"/>
+        </w:rPr>
+        <w:pict>
+          <v:rect id="_x0000_i1031" style="width:0;height:1.5pt" o:hralign="center" o:hrstd="t" o:hr="t" fillcolor="#a0a0a0" stroked="f"/>
+        </w:pict>
+      </w:r>
+    </w:p>
+    <w:p>
+      <w:pPr>
+        <w:spacing w:before="100" w:beforeAutospacing="1" w:after="100" w:afterAutospacing="1" w:line="240" w:lineRule="auto"/>
+        <w:outlineLvl w:val="1"/>
+        <w:rPr>
+          <w:rFonts w:ascii="Times New Roman" w:eastAsia="Times New Roman" w:hAnsi="Times New Roman" w:cs="Times New Roman"/>
+          <w:b/>
+          <w:bCs/>
+          <w:sz w:val="36"/>
+          <w:szCs w:val="36"/>
+          <w:lang w:eastAsia="en-IN" w:bidi="ta-IN"/>
+        </w:rPr>
+      </w:pPr>
+      <w:r>
+        <w:rPr>
+          <w:rFonts w:ascii="Times New Roman" w:eastAsia="Times New Roman" w:hAnsi="Times New Roman" w:cs="Times New Roman"/>
+          <w:b/>
+          <w:bCs/>
+          <w:sz w:val="36"/>
+          <w:szCs w:val="36"/>
+          <w:lang w:eastAsia="en-IN" w:bidi="ta-IN"/>
+        </w:rPr>
+        <w:t>1. Updated Project Charter</w:t>
+      </w:r>
+    </w:p>
+    <w:p>
+      <w:pPr>
+        <w:spacing w:before="100" w:beforeAutospacing="1" w:after="100" w:afterAutospacing="1" w:line="240" w:lineRule="auto"/>
+        <w:rPr>
+          <w:rFonts w:ascii="Times New Roman" w:eastAsia="Times New Roman" w:hAnsi="Times New Roman" w:cs="Times New Roman"/>
+          <w:sz w:val="24"/>
+          <w:szCs w:val="24"/>
+          <w:lang w:eastAsia="en-IN" w:bidi="ta-IN"/>
+        </w:rPr>
+      </w:pPr>
+      <w:r>
+        <w:rPr>
+          <w:rFonts w:ascii="Times New Roman" w:eastAsia="Times New Roman" w:hAnsi="Times New Roman" w:cs="Times New Roman"/>
+          <w:b/>
+          <w:bCs/>
+          <w:sz w:val="24"/>
+          <w:szCs w:val="24"/>
+          <w:lang w:eastAsia="en-IN" w:bidi="ta-IN"/>
+        </w:rPr>
+        <w:t>Tagline:</w:t>
+      </w:r>
+      <w:r>
+        <w:rPr>
+          <w:rFonts w:ascii="Times New Roman" w:eastAsia="Times New Roman" w:hAnsi="Times New Roman" w:cs="Times New Roman"/>
+          <w:sz w:val="24"/>
+          <w:szCs w:val="24"/>
+          <w:lang w:eastAsia="en-IN" w:bidi="ta-IN"/>
+        </w:rPr>
+        <w:t xml:space="preserve"> </w:t>
+      </w:r>
+      <w:proofErr w:type="gramStart"/>
+      <w:r>
+        <w:rPr>
+          <w:rFonts w:ascii="Times New Roman" w:eastAsia="Times New Roman" w:hAnsi="Times New Roman" w:cs="Times New Roman"/>
+          <w:i/>
+          <w:iCs/>
+          <w:sz w:val="24"/>
+          <w:szCs w:val="24"/>
+          <w:lang w:eastAsia="en-IN" w:bidi="ta-IN"/>
+        </w:rPr>
+        <w:t>Your</w:t>
+      </w:r>
+      <w:proofErr w:type="gramEnd"/>
+      <w:r>
+        <w:rPr>
+          <w:rFonts w:ascii="Times New Roman" w:eastAsia="Times New Roman" w:hAnsi="Times New Roman" w:cs="Times New Roman"/>
+          <w:i/>
+          <w:iCs/>
+          <w:sz w:val="24"/>
+          <w:szCs w:val="24"/>
+          <w:lang w:eastAsia="en-IN" w:bidi="ta-IN"/>
+        </w:rPr>
+        <w:t xml:space="preserve"> Partner in Kitchen</w:t>
+      </w:r>
+    </w:p>
+    <w:p>
+      <w:pPr>
+        <w:numPr>
+          <w:ilvl w:val="0"/>
+          <w:numId w:val="11"/>
+        </w:numPr>
+        <w:spacing w:before="100" w:beforeAutospacing="1" w:after="100" w:afterAutospacing="1" w:line="240" w:lineRule="auto"/>
+        <w:rPr>
+          <w:rFonts w:ascii="Times New Roman" w:eastAsia="Times New Roman" w:hAnsi="Times New Roman" w:cs="Times New Roman"/>
+          <w:sz w:val="24"/>
+          <w:szCs w:val="24"/>
+          <w:lang w:eastAsia="en-IN" w:bidi="ta-IN"/>
+        </w:rPr>
+      </w:pPr>
+      <w:r>
+        <w:rPr>
+          <w:rFonts w:ascii="Times New Roman" w:eastAsia="Times New Roman" w:hAnsi="Times New Roman" w:cs="Times New Roman"/>
+          <w:b/>
+          <w:bCs/>
+          <w:sz w:val="24"/>
+          <w:szCs w:val="24"/>
+          <w:lang w:eastAsia="en-IN" w:bidi="ta-IN"/>
+        </w:rPr>
+        <w:t>Vision:</w:t>
+      </w:r>
+      <w:r>
+        <w:rPr>
+          <w:rFonts w:ascii="Times New Roman" w:eastAsia="Times New Roman" w:hAnsi="Times New Roman" w:cs="Times New Roman"/>
+          <w:sz w:val="24"/>
+          <w:szCs w:val="24"/>
+          <w:lang w:eastAsia="en-IN" w:bidi="ta-IN"/>
+        </w:rPr>
+        <w:t xml:space="preserve"> To evolve the application from a manual meal-scheduling tool into an intuitive, proactive culinary partner that anticipates user needs based on stress, tradition, and energy levels.</w:t>
+      </w:r>
+    </w:p>
+    <w:p>
+      <w:pPr>
+        <w:numPr>
+          <w:ilvl w:val="0"/>
+          <w:numId w:val="11"/>
+        </w:numPr>
+        <w:spacing w:before="100" w:beforeAutospacing="1" w:after="100" w:afterAutospacing="1" w:line="240" w:lineRule="auto"/>
+        <w:rPr>
+          <w:rFonts w:ascii="Times New Roman" w:eastAsia="Times New Roman" w:hAnsi="Times New Roman" w:cs="Times New Roman"/>
+          <w:sz w:val="24"/>
+          <w:szCs w:val="24"/>
+          <w:lang w:eastAsia="en-IN" w:bidi="ta-IN"/>
+        </w:rPr>
+      </w:pPr>
+      <w:r>
+        <w:rPr>
+          <w:rFonts w:ascii="Times New Roman" w:eastAsia="Times New Roman" w:hAnsi="Times New Roman" w:cs="Times New Roman"/>
+          <w:b/>
+          <w:bCs/>
+          <w:sz w:val="24"/>
+          <w:szCs w:val="24"/>
+          <w:lang w:eastAsia="en-IN" w:bidi="ta-IN"/>
+        </w:rPr>
+        <w:t>Key Success Metric:</w:t>
+      </w:r>
+      <w:r>
+        <w:rPr>
+          <w:rFonts w:ascii="Times New Roman" w:eastAsia="Times New Roman" w:hAnsi="Times New Roman" w:cs="Times New Roman"/>
+          <w:sz w:val="24"/>
+          <w:szCs w:val="24"/>
+          <w:lang w:eastAsia="en-IN" w:bidi="ta-IN"/>
+        </w:rPr>
+        <w:t xml:space="preserve"> 90% accuracy in the Sunday "Smart Draft" by Week 5, requiring minimal user edits.</w:t>
+      </w:r>
+    </w:p>
+    <w:p>
+      <w:pPr>
+        <w:numPr>
+          <w:ilvl w:val="0"/>
+          <w:numId w:val="11"/>
+        </w:numPr>
+        <w:spacing w:before="100" w:beforeAutospacing="1" w:after="100" w:afterAutospacing="1" w:line="240" w:lineRule="auto"/>
+        <w:rPr>
+          <w:rFonts w:ascii="Times New Roman" w:eastAsia="Times New Roman" w:hAnsi="Times New Roman" w:cs="Times New Roman"/>
+          <w:sz w:val="24"/>
+          <w:szCs w:val="24"/>
+          <w:lang w:eastAsia="en-IN" w:bidi="ta-IN"/>
+        </w:rPr>
+      </w:pPr>
+      <w:r>
+        <w:rPr>
+          <w:rFonts w:ascii="Times New Roman" w:eastAsia="Times New Roman" w:hAnsi="Times New Roman" w:cs="Times New Roman"/>
+          <w:b/>
+          <w:bCs/>
+          <w:sz w:val="24"/>
+          <w:szCs w:val="24"/>
+          <w:lang w:eastAsia="en-IN" w:bidi="ta-IN"/>
+        </w:rPr>
+        <w:t>Branding Mandate:</w:t>
+      </w:r>
+      <w:r>
+        <w:rPr>
+          <w:rFonts w:ascii="Times New Roman" w:eastAsia="Times New Roman" w:hAnsi="Times New Roman" w:cs="Times New Roman"/>
+          <w:sz w:val="24"/>
+          <w:szCs w:val="24"/>
+          <w:lang w:eastAsia="en-IN" w:bidi="ta-IN"/>
+        </w:rPr>
+        <w:t xml:space="preserve"> The logo and tagline must be persistent across all UI screens to reinforce the "Partnership" identity.</w:t>
+      </w:r>
+    </w:p>
+    <w:p>
+      <w:pPr>
+        <w:spacing w:after="0" w:line="240" w:lineRule="auto"/>
+        <w:rPr>
+          <w:rFonts w:ascii="Times New Roman" w:eastAsia="Times New Roman" w:hAnsi="Times New Roman" w:cs="Times New Roman"/>
+          <w:sz w:val="24"/>
+          <w:szCs w:val="24"/>
+          <w:lang w:eastAsia="en-IN" w:bidi="ta-IN"/>
+        </w:rPr>
+      </w:pPr>
+      <w:r>
+        <w:rPr>
+          <w:rFonts w:ascii="Times New Roman" w:eastAsia="Times New Roman" w:hAnsi="Times New Roman" w:cs="Times New Roman"/>
+          <w:sz w:val="24"/>
+          <w:szCs w:val="24"/>
+          <w:lang w:eastAsia="en-IN" w:bidi="ta-IN"/>
+        </w:rPr>
+        <w:pict>
+          <v:rect id="_x0000_i1032" style="width:0;height:1.5pt" o:hralign="center" o:hrstd="t" o:hr="t" fillcolor="#a0a0a0" stroked="f"/>
+        </w:pict>
+      </w:r>
+    </w:p>
+    <w:p>
+      <w:pPr>
+        <w:spacing w:before="100" w:beforeAutospacing="1" w:after="100" w:afterAutospacing="1" w:line="240" w:lineRule="auto"/>
+        <w:outlineLvl w:val="1"/>
+        <w:rPr>
+          <w:rFonts w:ascii="Times New Roman" w:eastAsia="Times New Roman" w:hAnsi="Times New Roman" w:cs="Times New Roman"/>
+          <w:b/>
+          <w:bCs/>
+          <w:sz w:val="36"/>
+          <w:szCs w:val="36"/>
+          <w:lang w:eastAsia="en-IN" w:bidi="ta-IN"/>
+        </w:rPr>
+      </w:pPr>
+      <w:r>
+        <w:rPr>
+          <w:rFonts w:ascii="Times New Roman" w:eastAsia="Times New Roman" w:hAnsi="Times New Roman" w:cs="Times New Roman"/>
+          <w:b/>
+          <w:bCs/>
+          <w:sz w:val="36"/>
+          <w:szCs w:val="36"/>
+          <w:lang w:eastAsia="en-IN" w:bidi="ta-IN"/>
+        </w:rPr>
+        <w:t>2. Updated Business Requirements Specification (BRS)</w:t>
+      </w:r>
+    </w:p>
+    <w:p>
+      <w:pPr>
+        <w:numPr>
+          <w:ilvl w:val="0"/>
+          <w:numId w:val="12"/>
+        </w:numPr>
+        <w:spacing w:before="100" w:beforeAutospacing="1" w:after="100" w:afterAutospacing="1" w:line="240" w:lineRule="auto"/>
+        <w:rPr>
+          <w:rFonts w:ascii="Times New Roman" w:eastAsia="Times New Roman" w:hAnsi="Times New Roman" w:cs="Times New Roman"/>
+          <w:sz w:val="24"/>
+          <w:szCs w:val="24"/>
+          <w:lang w:eastAsia="en-IN" w:bidi="ta-IN"/>
+        </w:rPr>
+      </w:pPr>
+      <w:r>
+        <w:rPr>
+          <w:rFonts w:ascii="Times New Roman" w:eastAsia="Times New Roman" w:hAnsi="Times New Roman" w:cs="Times New Roman"/>
+          <w:b/>
+          <w:bCs/>
+          <w:sz w:val="24"/>
+          <w:szCs w:val="24"/>
+          <w:lang w:eastAsia="en-IN" w:bidi="ta-IN"/>
+        </w:rPr>
+        <w:t>The "Partner" Principle:</w:t>
+      </w:r>
+      <w:r>
+        <w:rPr>
+          <w:rFonts w:ascii="Times New Roman" w:eastAsia="Times New Roman" w:hAnsi="Times New Roman" w:cs="Times New Roman"/>
+          <w:sz w:val="24"/>
+          <w:szCs w:val="24"/>
+          <w:lang w:eastAsia="en-IN" w:bidi="ta-IN"/>
+        </w:rPr>
+        <w:t xml:space="preserve"> The system must minimize user cognitive load. It should "observe" rather than "ask."</w:t>
+      </w:r>
+    </w:p>
+    <w:p>
+      <w:pPr>
+        <w:numPr>
+          <w:ilvl w:val="0"/>
+          <w:numId w:val="12"/>
+        </w:numPr>
+        <w:spacing w:before="100" w:beforeAutospacing="1" w:after="100" w:afterAutospacing="1" w:line="240" w:lineRule="auto"/>
+        <w:rPr>
+          <w:rFonts w:ascii="Times New Roman" w:eastAsia="Times New Roman" w:hAnsi="Times New Roman" w:cs="Times New Roman"/>
+          <w:sz w:val="24"/>
+          <w:szCs w:val="24"/>
+          <w:lang w:eastAsia="en-IN" w:bidi="ta-IN"/>
+        </w:rPr>
+      </w:pPr>
+      <w:proofErr w:type="spellStart"/>
+      <w:r>
+        <w:rPr>
+          <w:rFonts w:ascii="Times New Roman" w:eastAsia="Times New Roman" w:hAnsi="Times New Roman" w:cs="Times New Roman"/>
+          <w:b/>
+          <w:bCs/>
+          <w:sz w:val="24"/>
+          <w:szCs w:val="24"/>
+          <w:lang w:eastAsia="en-IN" w:bidi="ta-IN"/>
+        </w:rPr>
+        <w:t>Behavioral</w:t>
+      </w:r>
+      <w:proofErr w:type="spellEnd"/>
+      <w:r>
+        <w:rPr>
+          <w:rFonts w:ascii="Times New Roman" w:eastAsia="Times New Roman" w:hAnsi="Times New Roman" w:cs="Times New Roman"/>
+          <w:b/>
+          <w:bCs/>
+          <w:sz w:val="24"/>
+          <w:szCs w:val="24"/>
+          <w:lang w:eastAsia="en-IN" w:bidi="ta-IN"/>
+        </w:rPr>
+        <w:t xml:space="preserve"> Baseline:</w:t>
+      </w:r>
+      <w:r>
+        <w:rPr>
+          <w:rFonts w:ascii="Times New Roman" w:eastAsia="Times New Roman" w:hAnsi="Times New Roman" w:cs="Times New Roman"/>
+          <w:sz w:val="24"/>
+          <w:szCs w:val="24"/>
+          <w:lang w:eastAsia="en-IN" w:bidi="ta-IN"/>
+        </w:rPr>
+        <w:t xml:space="preserve"> The system shall </w:t>
+      </w:r>
+      <w:proofErr w:type="spellStart"/>
+      <w:r>
+        <w:rPr>
+          <w:rFonts w:ascii="Times New Roman" w:eastAsia="Times New Roman" w:hAnsi="Times New Roman" w:cs="Times New Roman"/>
+          <w:sz w:val="24"/>
+          <w:szCs w:val="24"/>
+          <w:lang w:eastAsia="en-IN" w:bidi="ta-IN"/>
+        </w:rPr>
+        <w:t>analyze</w:t>
+      </w:r>
+      <w:proofErr w:type="spellEnd"/>
+      <w:r>
+        <w:rPr>
+          <w:rFonts w:ascii="Times New Roman" w:eastAsia="Times New Roman" w:hAnsi="Times New Roman" w:cs="Times New Roman"/>
+          <w:sz w:val="24"/>
+          <w:szCs w:val="24"/>
+          <w:lang w:eastAsia="en-IN" w:bidi="ta-IN"/>
+        </w:rPr>
+        <w:t xml:space="preserve"> 4 weeks of Sunday generation and WhatsApp export data to identify user "Taste DNA" and "Energy Rhythms."</w:t>
+      </w:r>
+    </w:p>
+    <w:p>
+      <w:pPr>
+        <w:numPr>
+          <w:ilvl w:val="0"/>
+          <w:numId w:val="12"/>
+        </w:numPr>
+        <w:spacing w:before="100" w:beforeAutospacing="1" w:after="100" w:afterAutospacing="1" w:line="240" w:lineRule="auto"/>
+        <w:rPr>
+          <w:rFonts w:ascii="Times New Roman" w:eastAsia="Times New Roman" w:hAnsi="Times New Roman" w:cs="Times New Roman"/>
+          <w:sz w:val="24"/>
+          <w:szCs w:val="24"/>
+          <w:lang w:eastAsia="en-IN" w:bidi="ta-IN"/>
+        </w:rPr>
+      </w:pPr>
+      <w:r>
+        <w:rPr>
+          <w:rFonts w:ascii="Times New Roman" w:eastAsia="Times New Roman" w:hAnsi="Times New Roman" w:cs="Times New Roman"/>
+          <w:b/>
+          <w:bCs/>
+          <w:sz w:val="24"/>
+          <w:szCs w:val="24"/>
+          <w:lang w:eastAsia="en-IN" w:bidi="ta-IN"/>
+        </w:rPr>
+        <w:t>Zero-Friction Requirement:</w:t>
+      </w:r>
+      <w:r>
+        <w:rPr>
+          <w:rFonts w:ascii="Times New Roman" w:eastAsia="Times New Roman" w:hAnsi="Times New Roman" w:cs="Times New Roman"/>
+          <w:sz w:val="24"/>
+          <w:szCs w:val="24"/>
+          <w:lang w:eastAsia="en-IN" w:bidi="ta-IN"/>
+        </w:rPr>
+        <w:t xml:space="preserve"> Users should only interact with "High/Low" or "Swap" toggles; the ML handles the underlying complexity and selection logic.</w:t>
+      </w:r>
+    </w:p>
+    <w:p>
+      <w:pPr>
+        <w:spacing w:after="0" w:line="240" w:lineRule="auto"/>
+        <w:rPr>
+          <w:rFonts w:ascii="Times New Roman" w:eastAsia="Times New Roman" w:hAnsi="Times New Roman" w:cs="Times New Roman"/>
+          <w:sz w:val="24"/>
+          <w:szCs w:val="24"/>
+          <w:lang w:eastAsia="en-IN" w:bidi="ta-IN"/>
+        </w:rPr>
+      </w:pPr>
+      <w:r>
+        <w:rPr>
+          <w:rFonts w:ascii="Times New Roman" w:eastAsia="Times New Roman" w:hAnsi="Times New Roman" w:cs="Times New Roman"/>
+          <w:sz w:val="24"/>
+          <w:szCs w:val="24"/>
+          <w:lang w:eastAsia="en-IN" w:bidi="ta-IN"/>
+        </w:rPr>
+        <w:pict>
+          <v:rect id="_x0000_i1033" style="width:0;height:1.5pt" o:hralign="center" o:hrstd="t" o:hr="t" fillcolor="#a0a0a0" stroked="f"/>
+        </w:pict>
+      </w:r>
+    </w:p>
+    <w:p>
+      <w:pPr>
+        <w:spacing w:before="100" w:beforeAutospacing="1" w:after="100" w:afterAutospacing="1" w:line="240" w:lineRule="auto"/>
+        <w:outlineLvl w:val="1"/>
+        <w:rPr>
+          <w:rFonts w:ascii="Times New Roman" w:eastAsia="Times New Roman" w:hAnsi="Times New Roman" w:cs="Times New Roman"/>
+          <w:b/>
+          <w:bCs/>
+          <w:sz w:val="36"/>
+          <w:szCs w:val="36"/>
+          <w:lang w:eastAsia="en-IN" w:bidi="ta-IN"/>
+        </w:rPr>
+      </w:pPr>
+      <w:r>
+        <w:rPr>
+          <w:rFonts w:ascii="Times New Roman" w:eastAsia="Times New Roman" w:hAnsi="Times New Roman" w:cs="Times New Roman"/>
+          <w:b/>
+          <w:bCs/>
+          <w:sz w:val="36"/>
+          <w:szCs w:val="36"/>
+          <w:lang w:eastAsia="en-IN" w:bidi="ta-IN"/>
+        </w:rPr>
+        <w:t>3. Updated Functional Specification (FS)</w:t>
+      </w:r>
+    </w:p>
+    <w:p>
+      <w:pPr>
+        <w:numPr>
+          <w:ilvl w:val="0"/>
+          <w:numId w:val="13"/>
+        </w:numPr>
+        <w:spacing w:before="100" w:beforeAutospacing="1" w:after="100" w:afterAutospacing="1" w:line="240" w:lineRule="auto"/>
+        <w:rPr>
+          <w:rFonts w:ascii="Times New Roman" w:eastAsia="Times New Roman" w:hAnsi="Times New Roman" w:cs="Times New Roman"/>
+          <w:sz w:val="24"/>
+          <w:szCs w:val="24"/>
+          <w:lang w:eastAsia="en-IN" w:bidi="ta-IN"/>
+        </w:rPr>
+      </w:pPr>
+      <w:r>
+        <w:rPr>
+          <w:rFonts w:ascii="Times New Roman" w:eastAsia="Times New Roman" w:hAnsi="Times New Roman" w:cs="Times New Roman"/>
+          <w:b/>
+          <w:bCs/>
+          <w:sz w:val="24"/>
+          <w:szCs w:val="24"/>
+          <w:lang w:eastAsia="en-IN" w:bidi="ta-IN"/>
+        </w:rPr>
+        <w:t>Module 1: The Shadow Phase (Observational ML)</w:t>
+      </w:r>
+    </w:p>
+    <w:p>
+      <w:pPr>
+        <w:numPr>
+          <w:ilvl w:val="1"/>
+          <w:numId w:val="13"/>
+        </w:numPr>
+        <w:spacing w:before="100" w:beforeAutospacing="1" w:after="100" w:afterAutospacing="1" w:line="240" w:lineRule="auto"/>
+        <w:rPr>
+          <w:rFonts w:ascii="Times New Roman" w:eastAsia="Times New Roman" w:hAnsi="Times New Roman" w:cs="Times New Roman"/>
+          <w:sz w:val="24"/>
+          <w:szCs w:val="24"/>
+          <w:lang w:eastAsia="en-IN" w:bidi="ta-IN"/>
+        </w:rPr>
+      </w:pPr>
+      <w:r>
+        <w:rPr>
+          <w:rFonts w:ascii="Times New Roman" w:eastAsia="Times New Roman" w:hAnsi="Times New Roman" w:cs="Times New Roman"/>
+          <w:sz w:val="24"/>
+          <w:szCs w:val="24"/>
+          <w:lang w:eastAsia="en-IN" w:bidi="ta-IN"/>
+        </w:rPr>
+        <w:lastRenderedPageBreak/>
+        <w:t>Tracks "Complexity Delta": When a user swaps a 5-variety meal for a one-pot meal.</w:t>
+      </w:r>
+    </w:p>
+    <w:p>
+      <w:pPr>
+        <w:numPr>
+          <w:ilvl w:val="1"/>
+          <w:numId w:val="13"/>
+        </w:numPr>
+        <w:spacing w:before="100" w:beforeAutospacing="1" w:after="100" w:afterAutospacing="1" w:line="240" w:lineRule="auto"/>
+        <w:rPr>
+          <w:rFonts w:ascii="Times New Roman" w:eastAsia="Times New Roman" w:hAnsi="Times New Roman" w:cs="Times New Roman"/>
+          <w:sz w:val="24"/>
+          <w:szCs w:val="24"/>
+          <w:lang w:eastAsia="en-IN" w:bidi="ta-IN"/>
+        </w:rPr>
+      </w:pPr>
+      <w:r>
+        <w:rPr>
+          <w:rFonts w:ascii="Times New Roman" w:eastAsia="Times New Roman" w:hAnsi="Times New Roman" w:cs="Times New Roman"/>
+          <w:sz w:val="24"/>
+          <w:szCs w:val="24"/>
+          <w:lang w:eastAsia="en-IN" w:bidi="ta-IN"/>
+        </w:rPr>
+        <w:t xml:space="preserve">Identifies "Low-Energy Zones": Automatically tags recurring busy days (e.g., Wed/Thu) based on past </w:t>
+      </w:r>
+      <w:proofErr w:type="spellStart"/>
+      <w:r>
+        <w:rPr>
+          <w:rFonts w:ascii="Times New Roman" w:eastAsia="Times New Roman" w:hAnsi="Times New Roman" w:cs="Times New Roman"/>
+          <w:sz w:val="24"/>
+          <w:szCs w:val="24"/>
+          <w:lang w:eastAsia="en-IN" w:bidi="ta-IN"/>
+        </w:rPr>
+        <w:t>behavior</w:t>
+      </w:r>
+      <w:proofErr w:type="spellEnd"/>
+      <w:r>
+        <w:rPr>
+          <w:rFonts w:ascii="Times New Roman" w:eastAsia="Times New Roman" w:hAnsi="Times New Roman" w:cs="Times New Roman"/>
+          <w:sz w:val="24"/>
+          <w:szCs w:val="24"/>
+          <w:lang w:eastAsia="en-IN" w:bidi="ta-IN"/>
+        </w:rPr>
+        <w:t>.</w:t>
+      </w:r>
+    </w:p>
+    <w:p>
+      <w:pPr>
+        <w:numPr>
+          <w:ilvl w:val="0"/>
+          <w:numId w:val="13"/>
+        </w:numPr>
+        <w:spacing w:before="100" w:beforeAutospacing="1" w:after="100" w:afterAutospacing="1" w:line="240" w:lineRule="auto"/>
+        <w:rPr>
+          <w:rFonts w:ascii="Times New Roman" w:eastAsia="Times New Roman" w:hAnsi="Times New Roman" w:cs="Times New Roman"/>
+          <w:sz w:val="24"/>
+          <w:szCs w:val="24"/>
+          <w:lang w:eastAsia="en-IN" w:bidi="ta-IN"/>
+        </w:rPr>
+      </w:pPr>
+      <w:r>
+        <w:rPr>
+          <w:rFonts w:ascii="Times New Roman" w:eastAsia="Times New Roman" w:hAnsi="Times New Roman" w:cs="Times New Roman"/>
+          <w:b/>
+          <w:bCs/>
+          <w:sz w:val="24"/>
+          <w:szCs w:val="24"/>
+          <w:lang w:eastAsia="en-IN" w:bidi="ta-IN"/>
+        </w:rPr>
+        <w:t>Module 2: Complexity ($C$) Budgeting</w:t>
+      </w:r>
+    </w:p>
+    <w:p>
+      <w:pPr>
+        <w:numPr>
+          <w:ilvl w:val="1"/>
+          <w:numId w:val="13"/>
+        </w:numPr>
+        <w:spacing w:before="100" w:beforeAutospacing="1" w:after="100" w:afterAutospacing="1" w:line="240" w:lineRule="auto"/>
+        <w:rPr>
+          <w:rFonts w:ascii="Times New Roman" w:eastAsia="Times New Roman" w:hAnsi="Times New Roman" w:cs="Times New Roman"/>
+          <w:sz w:val="24"/>
+          <w:szCs w:val="24"/>
+          <w:lang w:eastAsia="en-IN" w:bidi="ta-IN"/>
+        </w:rPr>
+      </w:pPr>
+      <w:r>
+        <w:rPr>
+          <w:rFonts w:ascii="Times New Roman" w:eastAsia="Times New Roman" w:hAnsi="Times New Roman" w:cs="Times New Roman"/>
+          <w:sz w:val="24"/>
+          <w:szCs w:val="24"/>
+          <w:lang w:eastAsia="en-IN" w:bidi="ta-IN"/>
+        </w:rPr>
+        <w:t xml:space="preserve">Assigns $C$-scores to all recipes in </w:t>
+      </w:r>
+      <w:proofErr w:type="spellStart"/>
+      <w:r>
+        <w:rPr>
+          <w:rFonts w:ascii="Courier New" w:eastAsia="Times New Roman" w:hAnsi="Courier New" w:cs="Courier New"/>
+          <w:sz w:val="20"/>
+          <w:szCs w:val="20"/>
+          <w:lang w:eastAsia="en-IN" w:bidi="ta-IN"/>
+        </w:rPr>
+        <w:t>Recipe_Content_Vault</w:t>
+      </w:r>
+      <w:proofErr w:type="spellEnd"/>
+      <w:r>
+        <w:rPr>
+          <w:rFonts w:ascii="Times New Roman" w:eastAsia="Times New Roman" w:hAnsi="Times New Roman" w:cs="Times New Roman"/>
+          <w:sz w:val="24"/>
+          <w:szCs w:val="24"/>
+          <w:lang w:eastAsia="en-IN" w:bidi="ta-IN"/>
+        </w:rPr>
+        <w:t>.</w:t>
+      </w:r>
+    </w:p>
+    <w:p>
+      <w:pPr>
+        <w:numPr>
+          <w:ilvl w:val="1"/>
+          <w:numId w:val="13"/>
+        </w:numPr>
+        <w:spacing w:before="100" w:beforeAutospacing="1" w:after="100" w:afterAutospacing="1" w:line="240" w:lineRule="auto"/>
+        <w:rPr>
+          <w:rFonts w:ascii="Times New Roman" w:eastAsia="Times New Roman" w:hAnsi="Times New Roman" w:cs="Times New Roman"/>
+          <w:sz w:val="24"/>
+          <w:szCs w:val="24"/>
+          <w:lang w:eastAsia="en-IN" w:bidi="ta-IN"/>
+        </w:rPr>
+      </w:pPr>
+      <w:r>
+        <w:rPr>
+          <w:rFonts w:ascii="Times New Roman" w:eastAsia="Times New Roman" w:hAnsi="Times New Roman" w:cs="Times New Roman"/>
+          <w:sz w:val="24"/>
+          <w:szCs w:val="24"/>
+          <w:lang w:eastAsia="en-IN" w:bidi="ta-IN"/>
+        </w:rPr>
+        <w:t>Implements a "Weekly Battery" logic that caps high-complexity meals per week.</w:t>
+      </w:r>
+    </w:p>
+    <w:p>
+      <w:pPr>
+        <w:numPr>
+          <w:ilvl w:val="0"/>
+          <w:numId w:val="13"/>
+        </w:numPr>
+        <w:spacing w:before="100" w:beforeAutospacing="1" w:after="100" w:afterAutospacing="1" w:line="240" w:lineRule="auto"/>
+        <w:rPr>
+          <w:rFonts w:ascii="Times New Roman" w:eastAsia="Times New Roman" w:hAnsi="Times New Roman" w:cs="Times New Roman"/>
+          <w:sz w:val="24"/>
+          <w:szCs w:val="24"/>
+          <w:lang w:eastAsia="en-IN" w:bidi="ta-IN"/>
+        </w:rPr>
+      </w:pPr>
+      <w:r>
+        <w:rPr>
+          <w:rFonts w:ascii="Times New Roman" w:eastAsia="Times New Roman" w:hAnsi="Times New Roman" w:cs="Times New Roman"/>
+          <w:b/>
+          <w:bCs/>
+          <w:sz w:val="24"/>
+          <w:szCs w:val="24"/>
+          <w:lang w:eastAsia="en-IN" w:bidi="ta-IN"/>
+        </w:rPr>
+        <w:t>Module 3: Regional Auto-Bias</w:t>
+      </w:r>
+    </w:p>
+    <w:p>
+      <w:pPr>
+        <w:numPr>
+          <w:ilvl w:val="1"/>
+          <w:numId w:val="13"/>
+        </w:numPr>
+        <w:spacing w:before="100" w:beforeAutospacing="1" w:after="100" w:afterAutospacing="1" w:line="240" w:lineRule="auto"/>
+        <w:rPr>
+          <w:rFonts w:ascii="Times New Roman" w:eastAsia="Times New Roman" w:hAnsi="Times New Roman" w:cs="Times New Roman"/>
+          <w:sz w:val="24"/>
+          <w:szCs w:val="24"/>
+          <w:lang w:eastAsia="en-IN" w:bidi="ta-IN"/>
+        </w:rPr>
+      </w:pPr>
+      <w:r>
+        <w:rPr>
+          <w:rFonts w:ascii="Times New Roman" w:eastAsia="Times New Roman" w:hAnsi="Times New Roman" w:cs="Times New Roman"/>
+          <w:sz w:val="24"/>
+          <w:szCs w:val="24"/>
+          <w:lang w:eastAsia="en-IN" w:bidi="ta-IN"/>
+        </w:rPr>
+        <w:t>Clusters selection history into "Regional Comfort Zones" (e.g., North vs. South bias) to pre-populate the Sunday draft.</w:t>
+      </w:r>
+    </w:p>
+    <w:p>
+      <w:pPr>
+        <w:numPr>
+          <w:ilvl w:val="0"/>
+          <w:numId w:val="13"/>
+        </w:numPr>
+        <w:spacing w:before="100" w:beforeAutospacing="1" w:after="100" w:afterAutospacing="1" w:line="240" w:lineRule="auto"/>
+        <w:rPr>
+          <w:rFonts w:ascii="Times New Roman" w:eastAsia="Times New Roman" w:hAnsi="Times New Roman" w:cs="Times New Roman"/>
+          <w:sz w:val="24"/>
+          <w:szCs w:val="24"/>
+          <w:lang w:eastAsia="en-IN" w:bidi="ta-IN"/>
+        </w:rPr>
+      </w:pPr>
+      <w:r>
+        <w:rPr>
+          <w:rFonts w:ascii="Times New Roman" w:eastAsia="Times New Roman" w:hAnsi="Times New Roman" w:cs="Times New Roman"/>
+          <w:b/>
+          <w:bCs/>
+          <w:sz w:val="24"/>
+          <w:szCs w:val="24"/>
+          <w:lang w:eastAsia="en-IN" w:bidi="ta-IN"/>
+        </w:rPr>
+        <w:t>Module 4: Dynamic Market Override</w:t>
+      </w:r>
+    </w:p>
+    <w:p>
+      <w:pPr>
+        <w:numPr>
+          <w:ilvl w:val="1"/>
+          <w:numId w:val="13"/>
+        </w:numPr>
+        <w:spacing w:before="100" w:beforeAutospacing="1" w:after="100" w:afterAutospacing="1" w:line="240" w:lineRule="auto"/>
+        <w:rPr>
+          <w:rFonts w:ascii="Times New Roman" w:eastAsia="Times New Roman" w:hAnsi="Times New Roman" w:cs="Times New Roman"/>
+          <w:sz w:val="24"/>
+          <w:szCs w:val="24"/>
+          <w:lang w:eastAsia="en-IN" w:bidi="ta-IN"/>
+        </w:rPr>
+      </w:pPr>
+      <w:r>
+        <w:rPr>
+          <w:rFonts w:ascii="Times New Roman" w:eastAsia="Times New Roman" w:hAnsi="Times New Roman" w:cs="Times New Roman"/>
+          <w:b/>
+          <w:bCs/>
+          <w:sz w:val="24"/>
+          <w:szCs w:val="24"/>
+          <w:lang w:eastAsia="en-IN" w:bidi="ta-IN"/>
+        </w:rPr>
+        <w:t>Trigger:</w:t>
+      </w:r>
+      <w:r>
+        <w:rPr>
+          <w:rFonts w:ascii="Times New Roman" w:eastAsia="Times New Roman" w:hAnsi="Times New Roman" w:cs="Times New Roman"/>
+          <w:sz w:val="24"/>
+          <w:szCs w:val="24"/>
+          <w:lang w:eastAsia="en-IN" w:bidi="ta-IN"/>
+        </w:rPr>
+        <w:t xml:space="preserve"> Market Price = </w:t>
+      </w:r>
+      <w:r>
+        <w:rPr>
+          <w:rFonts w:ascii="Times New Roman" w:eastAsia="Times New Roman" w:hAnsi="Times New Roman" w:cs="Times New Roman"/>
+          <w:b/>
+          <w:bCs/>
+          <w:sz w:val="24"/>
+          <w:szCs w:val="24"/>
+          <w:lang w:eastAsia="en-IN" w:bidi="ta-IN"/>
+        </w:rPr>
+        <w:t>₹1,277</w:t>
+      </w:r>
+      <w:r>
+        <w:rPr>
+          <w:rFonts w:ascii="Times New Roman" w:eastAsia="Times New Roman" w:hAnsi="Times New Roman" w:cs="Times New Roman"/>
+          <w:sz w:val="24"/>
+          <w:szCs w:val="24"/>
+          <w:lang w:eastAsia="en-IN" w:bidi="ta-IN"/>
+        </w:rPr>
+        <w:t xml:space="preserve"> (Wave 5 Peak) + RSI Drop.</w:t>
+      </w:r>
+    </w:p>
+    <w:p>
+      <w:pPr>
+        <w:numPr>
+          <w:ilvl w:val="1"/>
+          <w:numId w:val="13"/>
+        </w:numPr>
+        <w:spacing w:before="100" w:beforeAutospacing="1" w:after="100" w:afterAutospacing="1" w:line="240" w:lineRule="auto"/>
+        <w:rPr>
+          <w:rFonts w:ascii="Times New Roman" w:eastAsia="Times New Roman" w:hAnsi="Times New Roman" w:cs="Times New Roman"/>
+          <w:sz w:val="24"/>
+          <w:szCs w:val="24"/>
+          <w:lang w:eastAsia="en-IN" w:bidi="ta-IN"/>
+        </w:rPr>
+      </w:pPr>
+      <w:r>
+        <w:rPr>
+          <w:rFonts w:ascii="Times New Roman" w:eastAsia="Times New Roman" w:hAnsi="Times New Roman" w:cs="Times New Roman"/>
+          <w:b/>
+          <w:bCs/>
+          <w:sz w:val="24"/>
+          <w:szCs w:val="24"/>
+          <w:lang w:eastAsia="en-IN" w:bidi="ta-IN"/>
+        </w:rPr>
+        <w:t>Action:</w:t>
+      </w:r>
+      <w:r>
+        <w:rPr>
+          <w:rFonts w:ascii="Times New Roman" w:eastAsia="Times New Roman" w:hAnsi="Times New Roman" w:cs="Times New Roman"/>
+          <w:sz w:val="24"/>
+          <w:szCs w:val="24"/>
+          <w:lang w:eastAsia="en-IN" w:bidi="ta-IN"/>
+        </w:rPr>
+        <w:t xml:space="preserve"> Push a WhatsApp "Smart Swap" link to replace the evening's complex meal with a pre-identified regional comfort staple.</w:t>
+      </w:r>
+    </w:p>
+    <w:p>
+      <w:pPr>
+        <w:spacing w:before="100" w:beforeAutospacing="1" w:after="100" w:afterAutospacing="1" w:line="240" w:lineRule="auto"/>
+        <w:outlineLvl w:val="2"/>
+        <w:rPr>
+          <w:rFonts w:ascii="Times New Roman" w:eastAsia="Times New Roman" w:hAnsi="Times New Roman" w:cs="Times New Roman"/>
+          <w:b/>
+          <w:bCs/>
+          <w:sz w:val="27"/>
+          <w:szCs w:val="27"/>
+          <w:lang w:eastAsia="en-IN" w:bidi="ta-IN"/>
+        </w:rPr>
+      </w:pPr>
+      <w:r>
+        <w:rPr>
+          <w:rFonts w:ascii="Times New Roman" w:eastAsia="Times New Roman" w:hAnsi="Times New Roman" w:cs="Times New Roman"/>
+          <w:b/>
+          <w:bCs/>
+          <w:sz w:val="27"/>
+          <w:szCs w:val="27"/>
+          <w:lang w:eastAsia="en-IN" w:bidi="ta-IN"/>
+        </w:rPr>
+        <w:t>The Main Crux: The Parametric Partner</w:t>
+      </w:r>
+    </w:p>
+    <w:p>
+      <w:pPr>
+        <w:spacing w:before="100" w:beforeAutospacing="1" w:after="100" w:afterAutospacing="1" w:line="240" w:lineRule="auto"/>
+        <w:rPr>
+          <w:rFonts w:ascii="Times New Roman" w:eastAsia="Times New Roman" w:hAnsi="Times New Roman" w:cs="Times New Roman"/>
+          <w:sz w:val="24"/>
+          <w:szCs w:val="24"/>
+          <w:lang w:eastAsia="en-IN" w:bidi="ta-IN"/>
+        </w:rPr>
+      </w:pPr>
+      <w:r>
+        <w:rPr>
+          <w:rFonts w:ascii="Times New Roman" w:eastAsia="Times New Roman" w:hAnsi="Times New Roman" w:cs="Times New Roman"/>
+          <w:sz w:val="24"/>
+          <w:szCs w:val="24"/>
+          <w:lang w:eastAsia="en-IN" w:bidi="ta-IN"/>
+        </w:rPr>
+        <w:t xml:space="preserve">Instead of a hardcoded 28-day window, we introduce the </w:t>
+      </w:r>
+      <w:r>
+        <w:rPr>
+          <w:rFonts w:ascii="Times New Roman" w:eastAsia="Times New Roman" w:hAnsi="Times New Roman" w:cs="Times New Roman"/>
+          <w:b/>
+          <w:bCs/>
+          <w:sz w:val="24"/>
+          <w:szCs w:val="24"/>
+          <w:lang w:eastAsia="en-IN" w:bidi="ta-IN"/>
+        </w:rPr>
+        <w:t>Observation Window ($W</w:t>
+      </w:r>
+      <w:proofErr w:type="gramStart"/>
+      <w:r>
+        <w:rPr>
+          <w:rFonts w:ascii="Times New Roman" w:eastAsia="Times New Roman" w:hAnsi="Times New Roman" w:cs="Times New Roman"/>
+          <w:b/>
+          <w:bCs/>
+          <w:sz w:val="24"/>
+          <w:szCs w:val="24"/>
+          <w:lang w:eastAsia="en-IN" w:bidi="ta-IN"/>
+        </w:rPr>
+        <w:t>_{</w:t>
+      </w:r>
+      <w:proofErr w:type="spellStart"/>
+      <w:proofErr w:type="gramEnd"/>
+      <w:r>
+        <w:rPr>
+          <w:rFonts w:ascii="Times New Roman" w:eastAsia="Times New Roman" w:hAnsi="Times New Roman" w:cs="Times New Roman"/>
+          <w:b/>
+          <w:bCs/>
+          <w:sz w:val="24"/>
+          <w:szCs w:val="24"/>
+          <w:lang w:eastAsia="en-IN" w:bidi="ta-IN"/>
+        </w:rPr>
+        <w:t>obs</w:t>
+      </w:r>
+      <w:proofErr w:type="spellEnd"/>
+      <w:r>
+        <w:rPr>
+          <w:rFonts w:ascii="Times New Roman" w:eastAsia="Times New Roman" w:hAnsi="Times New Roman" w:cs="Times New Roman"/>
+          <w:b/>
+          <w:bCs/>
+          <w:sz w:val="24"/>
+          <w:szCs w:val="24"/>
+          <w:lang w:eastAsia="en-IN" w:bidi="ta-IN"/>
+        </w:rPr>
+        <w:t>}$)</w:t>
+      </w:r>
+      <w:r>
+        <w:rPr>
+          <w:rFonts w:ascii="Times New Roman" w:eastAsia="Times New Roman" w:hAnsi="Times New Roman" w:cs="Times New Roman"/>
+          <w:sz w:val="24"/>
+          <w:szCs w:val="24"/>
+          <w:lang w:eastAsia="en-IN" w:bidi="ta-IN"/>
+        </w:rPr>
+        <w:t xml:space="preserve"> as a system-level variable.</w:t>
+      </w:r>
+    </w:p>
+    <w:p>
+      <w:pPr>
+        <w:numPr>
+          <w:ilvl w:val="0"/>
+          <w:numId w:val="14"/>
+        </w:numPr>
+        <w:spacing w:before="100" w:beforeAutospacing="1" w:after="100" w:afterAutospacing="1" w:line="240" w:lineRule="auto"/>
+        <w:rPr>
+          <w:rFonts w:ascii="Times New Roman" w:eastAsia="Times New Roman" w:hAnsi="Times New Roman" w:cs="Times New Roman"/>
+          <w:sz w:val="24"/>
+          <w:szCs w:val="24"/>
+          <w:lang w:eastAsia="en-IN" w:bidi="ta-IN"/>
+        </w:rPr>
+      </w:pPr>
+      <w:r>
+        <w:rPr>
+          <w:rFonts w:ascii="Times New Roman" w:eastAsia="Times New Roman" w:hAnsi="Times New Roman" w:cs="Times New Roman"/>
+          <w:b/>
+          <w:bCs/>
+          <w:sz w:val="24"/>
+          <w:szCs w:val="24"/>
+          <w:lang w:eastAsia="en-IN" w:bidi="ta-IN"/>
+        </w:rPr>
+        <w:t>Variable Sensitivity:</w:t>
+      </w:r>
+      <w:r>
+        <w:rPr>
+          <w:rFonts w:ascii="Times New Roman" w:eastAsia="Times New Roman" w:hAnsi="Times New Roman" w:cs="Times New Roman"/>
+          <w:sz w:val="24"/>
+          <w:szCs w:val="24"/>
+          <w:lang w:eastAsia="en-IN" w:bidi="ta-IN"/>
+        </w:rPr>
+        <w:t xml:space="preserve"> We can set $W</w:t>
+      </w:r>
+      <w:proofErr w:type="gramStart"/>
+      <w:r>
+        <w:rPr>
+          <w:rFonts w:ascii="Times New Roman" w:eastAsia="Times New Roman" w:hAnsi="Times New Roman" w:cs="Times New Roman"/>
+          <w:sz w:val="24"/>
+          <w:szCs w:val="24"/>
+          <w:lang w:eastAsia="en-IN" w:bidi="ta-IN"/>
+        </w:rPr>
+        <w:t>_{</w:t>
+      </w:r>
+      <w:proofErr w:type="spellStart"/>
+      <w:proofErr w:type="gramEnd"/>
+      <w:r>
+        <w:rPr>
+          <w:rFonts w:ascii="Times New Roman" w:eastAsia="Times New Roman" w:hAnsi="Times New Roman" w:cs="Times New Roman"/>
+          <w:sz w:val="24"/>
+          <w:szCs w:val="24"/>
+          <w:lang w:eastAsia="en-IN" w:bidi="ta-IN"/>
+        </w:rPr>
+        <w:t>obs</w:t>
+      </w:r>
+      <w:proofErr w:type="spellEnd"/>
+      <w:r>
+        <w:rPr>
+          <w:rFonts w:ascii="Times New Roman" w:eastAsia="Times New Roman" w:hAnsi="Times New Roman" w:cs="Times New Roman"/>
+          <w:sz w:val="24"/>
+          <w:szCs w:val="24"/>
+          <w:lang w:eastAsia="en-IN" w:bidi="ta-IN"/>
+        </w:rPr>
+        <w:t>} = 4$ weeks as a default, but if the user's patterns are highly volatile (or very consistent), the ML can suggest shortening or lengthening this window to improve accuracy.</w:t>
+      </w:r>
+    </w:p>
+    <w:p>
+      <w:pPr>
+        <w:numPr>
+          <w:ilvl w:val="0"/>
+          <w:numId w:val="14"/>
+        </w:numPr>
+        <w:spacing w:before="100" w:beforeAutospacing="1" w:after="100" w:afterAutospacing="1" w:line="240" w:lineRule="auto"/>
+        <w:rPr>
+          <w:rFonts w:ascii="Times New Roman" w:eastAsia="Times New Roman" w:hAnsi="Times New Roman" w:cs="Times New Roman"/>
+          <w:sz w:val="24"/>
+          <w:szCs w:val="24"/>
+          <w:lang w:eastAsia="en-IN" w:bidi="ta-IN"/>
+        </w:rPr>
+      </w:pPr>
+      <w:r>
+        <w:rPr>
+          <w:rFonts w:ascii="Times New Roman" w:eastAsia="Times New Roman" w:hAnsi="Times New Roman" w:cs="Times New Roman"/>
+          <w:b/>
+          <w:bCs/>
+          <w:sz w:val="24"/>
+          <w:szCs w:val="24"/>
+          <w:lang w:eastAsia="en-IN" w:bidi="ta-IN"/>
+        </w:rPr>
+        <w:t>The "Cold Start" Logic:</w:t>
+      </w:r>
+      <w:r>
+        <w:rPr>
+          <w:rFonts w:ascii="Times New Roman" w:eastAsia="Times New Roman" w:hAnsi="Times New Roman" w:cs="Times New Roman"/>
+          <w:sz w:val="24"/>
+          <w:szCs w:val="24"/>
+          <w:lang w:eastAsia="en-IN" w:bidi="ta-IN"/>
+        </w:rPr>
+        <w:t xml:space="preserve"> For a brand new user, $W</w:t>
+      </w:r>
+      <w:proofErr w:type="gramStart"/>
+      <w:r>
+        <w:rPr>
+          <w:rFonts w:ascii="Times New Roman" w:eastAsia="Times New Roman" w:hAnsi="Times New Roman" w:cs="Times New Roman"/>
+          <w:sz w:val="24"/>
+          <w:szCs w:val="24"/>
+          <w:lang w:eastAsia="en-IN" w:bidi="ta-IN"/>
+        </w:rPr>
+        <w:t>_{</w:t>
+      </w:r>
+      <w:proofErr w:type="spellStart"/>
+      <w:proofErr w:type="gramEnd"/>
+      <w:r>
+        <w:rPr>
+          <w:rFonts w:ascii="Times New Roman" w:eastAsia="Times New Roman" w:hAnsi="Times New Roman" w:cs="Times New Roman"/>
+          <w:sz w:val="24"/>
+          <w:szCs w:val="24"/>
+          <w:lang w:eastAsia="en-IN" w:bidi="ta-IN"/>
+        </w:rPr>
+        <w:t>obs</w:t>
+      </w:r>
+      <w:proofErr w:type="spellEnd"/>
+      <w:r>
+        <w:rPr>
+          <w:rFonts w:ascii="Times New Roman" w:eastAsia="Times New Roman" w:hAnsi="Times New Roman" w:cs="Times New Roman"/>
+          <w:sz w:val="24"/>
+          <w:szCs w:val="24"/>
+          <w:lang w:eastAsia="en-IN" w:bidi="ta-IN"/>
+        </w:rPr>
+        <w:t xml:space="preserve">}$ starts at 1 and expands to 4 as data builds, ensuring the </w:t>
+      </w:r>
+      <w:r>
+        <w:rPr>
+          <w:rFonts w:ascii="Times New Roman" w:eastAsia="Times New Roman" w:hAnsi="Times New Roman" w:cs="Times New Roman"/>
+          <w:b/>
+          <w:bCs/>
+          <w:sz w:val="24"/>
+          <w:szCs w:val="24"/>
+          <w:lang w:eastAsia="en-IN" w:bidi="ta-IN"/>
+        </w:rPr>
+        <w:t>"Your Partner in Kitchen"</w:t>
+      </w:r>
+      <w:r>
+        <w:rPr>
+          <w:rFonts w:ascii="Times New Roman" w:eastAsia="Times New Roman" w:hAnsi="Times New Roman" w:cs="Times New Roman"/>
+          <w:sz w:val="24"/>
+          <w:szCs w:val="24"/>
+          <w:lang w:eastAsia="en-IN" w:bidi="ta-IN"/>
+        </w:rPr>
+        <w:t xml:space="preserve"> experience begins as early as the first week.</w:t>
+      </w:r>
+    </w:p>
+    <w:p>
+      <w:pPr>
+        <w:numPr>
+          <w:ilvl w:val="0"/>
+          <w:numId w:val="14"/>
+        </w:numPr>
+        <w:spacing w:before="100" w:beforeAutospacing="1" w:after="100" w:afterAutospacing="1" w:line="240" w:lineRule="auto"/>
+        <w:rPr>
+          <w:rFonts w:ascii="Times New Roman" w:eastAsia="Times New Roman" w:hAnsi="Times New Roman" w:cs="Times New Roman"/>
+          <w:sz w:val="24"/>
+          <w:szCs w:val="24"/>
+          <w:lang w:eastAsia="en-IN" w:bidi="ta-IN"/>
+        </w:rPr>
+      </w:pPr>
+      <w:r>
+        <w:rPr>
+          <w:rFonts w:ascii="Times New Roman" w:eastAsia="Times New Roman" w:hAnsi="Times New Roman" w:cs="Times New Roman"/>
+          <w:b/>
+          <w:bCs/>
+          <w:sz w:val="24"/>
+          <w:szCs w:val="24"/>
+          <w:lang w:eastAsia="en-IN" w:bidi="ta-IN"/>
+        </w:rPr>
+        <w:t>Drift Detection:</w:t>
+      </w:r>
+      <w:r>
+        <w:rPr>
+          <w:rFonts w:ascii="Times New Roman" w:eastAsia="Times New Roman" w:hAnsi="Times New Roman" w:cs="Times New Roman"/>
+          <w:sz w:val="24"/>
+          <w:szCs w:val="24"/>
+          <w:lang w:eastAsia="en-IN" w:bidi="ta-IN"/>
+        </w:rPr>
+        <w:t xml:space="preserve"> If the user’s choices suddenly diverge from the last 4 weeks (e.g., a sudden shift to "High-Variety" every day), the system can temporarily reduce $W</w:t>
+      </w:r>
+      <w:proofErr w:type="gramStart"/>
+      <w:r>
+        <w:rPr>
+          <w:rFonts w:ascii="Times New Roman" w:eastAsia="Times New Roman" w:hAnsi="Times New Roman" w:cs="Times New Roman"/>
+          <w:sz w:val="24"/>
+          <w:szCs w:val="24"/>
+          <w:lang w:eastAsia="en-IN" w:bidi="ta-IN"/>
+        </w:rPr>
+        <w:t>_{</w:t>
+      </w:r>
+      <w:proofErr w:type="spellStart"/>
+      <w:proofErr w:type="gramEnd"/>
+      <w:r>
+        <w:rPr>
+          <w:rFonts w:ascii="Times New Roman" w:eastAsia="Times New Roman" w:hAnsi="Times New Roman" w:cs="Times New Roman"/>
+          <w:sz w:val="24"/>
+          <w:szCs w:val="24"/>
+          <w:lang w:eastAsia="en-IN" w:bidi="ta-IN"/>
+        </w:rPr>
+        <w:t>obs</w:t>
+      </w:r>
+      <w:proofErr w:type="spellEnd"/>
+      <w:r>
+        <w:rPr>
+          <w:rFonts w:ascii="Times New Roman" w:eastAsia="Times New Roman" w:hAnsi="Times New Roman" w:cs="Times New Roman"/>
+          <w:sz w:val="24"/>
+          <w:szCs w:val="24"/>
+          <w:lang w:eastAsia="en-IN" w:bidi="ta-IN"/>
+        </w:rPr>
+        <w:t xml:space="preserve">}$ to "fast-track" the new habit into the </w:t>
+      </w:r>
+      <w:r>
+        <w:rPr>
+          <w:rFonts w:ascii="Times New Roman" w:eastAsia="Times New Roman" w:hAnsi="Times New Roman" w:cs="Times New Roman"/>
+          <w:b/>
+          <w:bCs/>
+          <w:sz w:val="24"/>
+          <w:szCs w:val="24"/>
+          <w:lang w:eastAsia="en-IN" w:bidi="ta-IN"/>
+        </w:rPr>
+        <w:t>Taste DNA</w:t>
+      </w:r>
+      <w:r>
+        <w:rPr>
+          <w:rFonts w:ascii="Times New Roman" w:eastAsia="Times New Roman" w:hAnsi="Times New Roman" w:cs="Times New Roman"/>
+          <w:sz w:val="24"/>
+          <w:szCs w:val="24"/>
+          <w:lang w:eastAsia="en-IN" w:bidi="ta-IN"/>
+        </w:rPr>
+        <w:t>.</w:t>
+      </w:r>
+    </w:p>
+    <w:p>
+      <w:pPr>
+        <w:spacing w:before="100" w:beforeAutospacing="1" w:after="100" w:afterAutospacing="1" w:line="240" w:lineRule="auto"/>
+        <w:outlineLvl w:val="2"/>
+        <w:rPr>
+          <w:rFonts w:ascii="Times New Roman" w:eastAsia="Times New Roman" w:hAnsi="Times New Roman" w:cs="Times New Roman"/>
+          <w:b/>
+          <w:bCs/>
+          <w:sz w:val="27"/>
+          <w:szCs w:val="27"/>
+          <w:lang w:eastAsia="en-IN" w:bidi="ta-IN"/>
+        </w:rPr>
+      </w:pPr>
+      <w:r>
+        <w:rPr>
+          <w:rFonts w:ascii="Times New Roman" w:eastAsia="Times New Roman" w:hAnsi="Times New Roman" w:cs="Times New Roman"/>
+          <w:b/>
+          <w:bCs/>
+          <w:sz w:val="27"/>
+          <w:szCs w:val="27"/>
+          <w:lang w:eastAsia="en-IN" w:bidi="ta-IN"/>
+        </w:rPr>
+        <w:t>Updated Functional Specification (FS) Change</w:t>
+      </w:r>
+    </w:p>
+    <w:tbl>
+      <w:tblPr>
+        <w:tblW w:w="0" w:type="auto"/>
+        <w:tblCellSpacing w:w="15" w:type="dxa"/>
+        <w:tblCellMar>
+          <w:top w:w="15" w:type="dxa"/>
+          <w:left w:w="15" w:type="dxa"/>
+          <w:bottom w:w="15" w:type="dxa"/>
+          <w:right w:w="15" w:type="dxa"/>
+        </w:tblCellMar>
+        <w:tblLook w:val="04A0" w:firstRow="1" w:lastRow="0" w:firstColumn="1" w:lastColumn="0" w:noHBand="0" w:noVBand="1"/>
+      </w:tblPr>
+      <w:tblGrid>
+        <w:gridCol w:w="1100"/>
+        <w:gridCol w:w="8046"/>
+      </w:tblGrid>
+      <w:tr>
+        <w:trPr>
+          <w:tblHeader/>
+          <w:tblCellSpacing w:w="15" w:type="dxa"/>
+        </w:trPr>
+        <w:tc>
+          <w:tcPr>
+            <w:tcW w:w="0" w:type="auto"/>
+            <w:tcBorders>
+              <w:top w:val="single" w:sz="6" w:space="0" w:color="auto"/>
+              <w:left w:val="single" w:sz="6" w:space="0" w:color="auto"/>
+              <w:bottom w:val="single" w:sz="6" w:space="0" w:color="auto"/>
+              <w:right w:val="single" w:sz="6" w:space="0" w:color="auto"/>
+            </w:tcBorders>
+            <w:vAlign w:val="center"/>
+            <w:hideMark/>
+          </w:tcPr>
+          <w:p>
+            <w:pPr>
+              <w:spacing w:after="480" w:line="240" w:lineRule="auto"/>
+              <w:rPr>
+                <w:rFonts w:ascii="Times New Roman" w:eastAsia="Times New Roman" w:hAnsi="Times New Roman" w:cs="Times New Roman"/>
+                <w:sz w:val="24"/>
+                <w:szCs w:val="24"/>
+                <w:lang w:eastAsia="en-IN" w:bidi="ta-IN"/>
+              </w:rPr>
+            </w:pPr>
+            <w:r>
+              <w:rPr>
+                <w:rFonts w:ascii="Times New Roman" w:eastAsia="Times New Roman" w:hAnsi="Times New Roman" w:cs="Times New Roman"/>
+                <w:b/>
+                <w:bCs/>
+                <w:sz w:val="24"/>
+                <w:szCs w:val="24"/>
+                <w:lang w:eastAsia="en-IN" w:bidi="ta-IN"/>
+              </w:rPr>
+              <w:t>Feature</w:t>
+            </w:r>
+          </w:p>
+        </w:tc>
+        <w:tc>
+          <w:tcPr>
+            <w:tcW w:w="0" w:type="auto"/>
+            <w:tcBorders>
+              <w:top w:val="single" w:sz="6" w:space="0" w:color="auto"/>
+              <w:left w:val="single" w:sz="6" w:space="0" w:color="auto"/>
+              <w:bottom w:val="single" w:sz="6" w:space="0" w:color="auto"/>
+              <w:right w:val="single" w:sz="6" w:space="0" w:color="auto"/>
+            </w:tcBorders>
+            <w:vAlign w:val="center"/>
+            <w:hideMark/>
+          </w:tcPr>
+          <w:p>
+            <w:pPr>
+              <w:spacing w:after="480" w:line="240" w:lineRule="auto"/>
+              <w:rPr>
+                <w:rFonts w:ascii="Times New Roman" w:eastAsia="Times New Roman" w:hAnsi="Times New Roman" w:cs="Times New Roman"/>
+                <w:sz w:val="24"/>
+                <w:szCs w:val="24"/>
+                <w:lang w:eastAsia="en-IN" w:bidi="ta-IN"/>
+              </w:rPr>
+            </w:pPr>
+            <w:r>
+              <w:rPr>
+                <w:rFonts w:ascii="Times New Roman" w:eastAsia="Times New Roman" w:hAnsi="Times New Roman" w:cs="Times New Roman"/>
+                <w:b/>
+                <w:bCs/>
+                <w:sz w:val="24"/>
+                <w:szCs w:val="24"/>
+                <w:lang w:eastAsia="en-IN" w:bidi="ta-IN"/>
+              </w:rPr>
+              <w:t>Change Description</w:t>
+            </w:r>
+          </w:p>
+        </w:tc>
+      </w:tr>
+      <w:tr>
+        <w:trPr>
+          <w:tblCellSpacing w:w="15" w:type="dxa"/>
+        </w:trPr>
+        <w:tc>
+          <w:tcPr>
+            <w:tcW w:w="0" w:type="auto"/>
+            <w:tcBorders>
+              <w:top w:val="single" w:sz="6" w:space="0" w:color="auto"/>
+              <w:left w:val="single" w:sz="6" w:space="0" w:color="auto"/>
+              <w:bottom w:val="single" w:sz="6" w:space="0" w:color="auto"/>
+              <w:right w:val="single" w:sz="6" w:space="0" w:color="auto"/>
+            </w:tcBorders>
+            <w:vAlign w:val="center"/>
+            <w:hideMark/>
+          </w:tcPr>
+          <w:p>
+            <w:pPr>
+              <w:spacing w:after="480" w:line="240" w:lineRule="auto"/>
+              <w:rPr>
+                <w:rFonts w:ascii="Times New Roman" w:eastAsia="Times New Roman" w:hAnsi="Times New Roman" w:cs="Times New Roman"/>
+                <w:sz w:val="24"/>
+                <w:szCs w:val="24"/>
+                <w:lang w:eastAsia="en-IN" w:bidi="ta-IN"/>
+              </w:rPr>
+            </w:pPr>
+            <w:r>
+              <w:rPr>
+                <w:rFonts w:ascii="Times New Roman" w:eastAsia="Times New Roman" w:hAnsi="Times New Roman" w:cs="Times New Roman"/>
+                <w:b/>
+                <w:bCs/>
+                <w:sz w:val="24"/>
+                <w:szCs w:val="24"/>
+                <w:lang w:eastAsia="en-IN" w:bidi="ta-IN"/>
+              </w:rPr>
+              <w:t>ML Module</w:t>
+            </w:r>
+          </w:p>
+        </w:tc>
+        <w:tc>
+          <w:tcPr>
+            <w:tcW w:w="0" w:type="auto"/>
+            <w:tcBorders>
+              <w:top w:val="single" w:sz="6" w:space="0" w:color="auto"/>
+              <w:left w:val="single" w:sz="6" w:space="0" w:color="auto"/>
+              <w:bottom w:val="single" w:sz="6" w:space="0" w:color="auto"/>
+              <w:right w:val="single" w:sz="6" w:space="0" w:color="auto"/>
+            </w:tcBorders>
+            <w:vAlign w:val="center"/>
+            <w:hideMark/>
+          </w:tcPr>
+          <w:p>
+            <w:pPr>
+              <w:spacing w:after="480" w:line="240" w:lineRule="auto"/>
+              <w:rPr>
+                <w:rFonts w:ascii="Times New Roman" w:eastAsia="Times New Roman" w:hAnsi="Times New Roman" w:cs="Times New Roman"/>
+                <w:sz w:val="24"/>
+                <w:szCs w:val="24"/>
+                <w:lang w:eastAsia="en-IN" w:bidi="ta-IN"/>
+              </w:rPr>
+            </w:pPr>
+            <w:r>
+              <w:rPr>
+                <w:rFonts w:ascii="Times New Roman" w:eastAsia="Times New Roman" w:hAnsi="Times New Roman" w:cs="Times New Roman"/>
+                <w:b/>
+                <w:bCs/>
+                <w:sz w:val="24"/>
+                <w:szCs w:val="24"/>
+                <w:lang w:eastAsia="en-IN" w:bidi="ta-IN"/>
+              </w:rPr>
+              <w:t>Parameterization:</w:t>
+            </w:r>
+            <w:r>
+              <w:rPr>
+                <w:rFonts w:ascii="Times New Roman" w:eastAsia="Times New Roman" w:hAnsi="Times New Roman" w:cs="Times New Roman"/>
+                <w:sz w:val="24"/>
+                <w:szCs w:val="24"/>
+                <w:lang w:eastAsia="en-IN" w:bidi="ta-IN"/>
+              </w:rPr>
+              <w:t xml:space="preserve"> Replaced "Fixed 4-week Baseline" with a dynamic variable </w:t>
+            </w:r>
+            <w:r>
+              <w:rPr>
+                <w:rFonts w:ascii="Courier New" w:eastAsia="Times New Roman" w:hAnsi="Courier New" w:cs="Courier New"/>
+                <w:sz w:val="20"/>
+                <w:szCs w:val="20"/>
+                <w:lang w:eastAsia="en-IN" w:bidi="ta-IN"/>
+              </w:rPr>
+              <w:t>$W</w:t>
+            </w:r>
+            <w:proofErr w:type="gramStart"/>
+            <w:r>
+              <w:rPr>
+                <w:rFonts w:ascii="Courier New" w:eastAsia="Times New Roman" w:hAnsi="Courier New" w:cs="Courier New"/>
+                <w:sz w:val="20"/>
+                <w:szCs w:val="20"/>
+                <w:lang w:eastAsia="en-IN" w:bidi="ta-IN"/>
+              </w:rPr>
+              <w:t>_{</w:t>
+            </w:r>
+            <w:proofErr w:type="spellStart"/>
+            <w:proofErr w:type="gramEnd"/>
+            <w:r>
+              <w:rPr>
+                <w:rFonts w:ascii="Courier New" w:eastAsia="Times New Roman" w:hAnsi="Courier New" w:cs="Courier New"/>
+                <w:sz w:val="20"/>
+                <w:szCs w:val="20"/>
+                <w:lang w:eastAsia="en-IN" w:bidi="ta-IN"/>
+              </w:rPr>
+              <w:t>obs</w:t>
+            </w:r>
+            <w:proofErr w:type="spellEnd"/>
+            <w:r>
+              <w:rPr>
+                <w:rFonts w:ascii="Courier New" w:eastAsia="Times New Roman" w:hAnsi="Courier New" w:cs="Courier New"/>
+                <w:sz w:val="20"/>
+                <w:szCs w:val="20"/>
+                <w:lang w:eastAsia="en-IN" w:bidi="ta-IN"/>
+              </w:rPr>
+              <w:t>}$</w:t>
+            </w:r>
+            <w:r>
+              <w:rPr>
+                <w:rFonts w:ascii="Times New Roman" w:eastAsia="Times New Roman" w:hAnsi="Times New Roman" w:cs="Times New Roman"/>
+                <w:sz w:val="24"/>
+                <w:szCs w:val="24"/>
+                <w:lang w:eastAsia="en-IN" w:bidi="ta-IN"/>
+              </w:rPr>
+              <w:t>.</w:t>
+            </w:r>
+          </w:p>
+        </w:tc>
+      </w:tr>
+      <w:tr>
+        <w:trPr>
+          <w:tblCellSpacing w:w="15" w:type="dxa"/>
+        </w:trPr>
+        <w:tc>
+          <w:tcPr>
+            <w:tcW w:w="0" w:type="auto"/>
+            <w:tcBorders>
+              <w:top w:val="single" w:sz="6" w:space="0" w:color="auto"/>
+              <w:left w:val="single" w:sz="6" w:space="0" w:color="auto"/>
+              <w:bottom w:val="single" w:sz="6" w:space="0" w:color="auto"/>
+              <w:right w:val="single" w:sz="6" w:space="0" w:color="auto"/>
+            </w:tcBorders>
+            <w:vAlign w:val="center"/>
+            <w:hideMark/>
+          </w:tcPr>
+          <w:p>
+            <w:pPr>
+              <w:spacing w:after="480" w:line="240" w:lineRule="auto"/>
+              <w:rPr>
+                <w:rFonts w:ascii="Times New Roman" w:eastAsia="Times New Roman" w:hAnsi="Times New Roman" w:cs="Times New Roman"/>
+                <w:sz w:val="24"/>
+                <w:szCs w:val="24"/>
+                <w:lang w:eastAsia="en-IN" w:bidi="ta-IN"/>
+              </w:rPr>
+            </w:pPr>
+            <w:r>
+              <w:rPr>
+                <w:rFonts w:ascii="Times New Roman" w:eastAsia="Times New Roman" w:hAnsi="Times New Roman" w:cs="Times New Roman"/>
+                <w:b/>
+                <w:bCs/>
+                <w:sz w:val="24"/>
+                <w:szCs w:val="24"/>
+                <w:lang w:eastAsia="en-IN" w:bidi="ta-IN"/>
+              </w:rPr>
+              <w:t>Logic Layer</w:t>
+            </w:r>
+          </w:p>
+        </w:tc>
+        <w:tc>
+          <w:tcPr>
+            <w:tcW w:w="0" w:type="auto"/>
+            <w:tcBorders>
+              <w:top w:val="single" w:sz="6" w:space="0" w:color="auto"/>
+              <w:left w:val="single" w:sz="6" w:space="0" w:color="auto"/>
+              <w:bottom w:val="single" w:sz="6" w:space="0" w:color="auto"/>
+              <w:right w:val="single" w:sz="6" w:space="0" w:color="auto"/>
+            </w:tcBorders>
+            <w:vAlign w:val="center"/>
+            <w:hideMark/>
+          </w:tcPr>
+          <w:p>
+            <w:pPr>
+              <w:spacing w:after="480" w:line="240" w:lineRule="auto"/>
+              <w:rPr>
+                <w:rFonts w:ascii="Times New Roman" w:eastAsia="Times New Roman" w:hAnsi="Times New Roman" w:cs="Times New Roman"/>
+                <w:sz w:val="24"/>
+                <w:szCs w:val="24"/>
+                <w:lang w:eastAsia="en-IN" w:bidi="ta-IN"/>
+              </w:rPr>
+            </w:pPr>
+            <w:r>
+              <w:rPr>
+                <w:rFonts w:ascii="Times New Roman" w:eastAsia="Times New Roman" w:hAnsi="Times New Roman" w:cs="Times New Roman"/>
+                <w:b/>
+                <w:bCs/>
+                <w:sz w:val="24"/>
+                <w:szCs w:val="24"/>
+                <w:lang w:eastAsia="en-IN" w:bidi="ta-IN"/>
+              </w:rPr>
+              <w:t>Window Tuning:</w:t>
+            </w:r>
+            <w:r>
+              <w:rPr>
+                <w:rFonts w:ascii="Times New Roman" w:eastAsia="Times New Roman" w:hAnsi="Times New Roman" w:cs="Times New Roman"/>
+                <w:sz w:val="24"/>
+                <w:szCs w:val="24"/>
+                <w:lang w:eastAsia="en-IN" w:bidi="ta-IN"/>
+              </w:rPr>
+              <w:t xml:space="preserve"> The system now calculates a "Confidence Score." If confidence is low, the engine automatically adjusts $W</w:t>
+            </w:r>
+            <w:proofErr w:type="gramStart"/>
+            <w:r>
+              <w:rPr>
+                <w:rFonts w:ascii="Times New Roman" w:eastAsia="Times New Roman" w:hAnsi="Times New Roman" w:cs="Times New Roman"/>
+                <w:sz w:val="24"/>
+                <w:szCs w:val="24"/>
+                <w:lang w:eastAsia="en-IN" w:bidi="ta-IN"/>
+              </w:rPr>
+              <w:t>_{</w:t>
+            </w:r>
+            <w:proofErr w:type="spellStart"/>
+            <w:proofErr w:type="gramEnd"/>
+            <w:r>
+              <w:rPr>
+                <w:rFonts w:ascii="Times New Roman" w:eastAsia="Times New Roman" w:hAnsi="Times New Roman" w:cs="Times New Roman"/>
+                <w:sz w:val="24"/>
+                <w:szCs w:val="24"/>
+                <w:lang w:eastAsia="en-IN" w:bidi="ta-IN"/>
+              </w:rPr>
+              <w:t>obs</w:t>
+            </w:r>
+            <w:proofErr w:type="spellEnd"/>
+            <w:r>
+              <w:rPr>
+                <w:rFonts w:ascii="Times New Roman" w:eastAsia="Times New Roman" w:hAnsi="Times New Roman" w:cs="Times New Roman"/>
+                <w:sz w:val="24"/>
+                <w:szCs w:val="24"/>
+                <w:lang w:eastAsia="en-IN" w:bidi="ta-IN"/>
+              </w:rPr>
+              <w:t>}$ to find a more stable pattern.</w:t>
+            </w:r>
+          </w:p>
+        </w:tc>
+      </w:tr>
+    </w:tbl>
+    <w:p/>
+    <w:p/>
+    <w:p>
+      <w:pPr>
+        <w:pStyle w:val="NormalWeb"/>
+      </w:pPr>
+      <w:r>
+        <w:lastRenderedPageBreak/>
+        <w:t xml:space="preserve">When the </w:t>
+      </w:r>
+      <w:r>
+        <w:rPr>
+          <w:b/>
+          <w:bCs/>
+        </w:rPr>
+        <w:t>Confidence Score is 0</w:t>
+      </w:r>
+      <w:r>
+        <w:t xml:space="preserve"> (Brand New User or total reset), the </w:t>
+      </w:r>
+      <w:r>
+        <w:rPr>
+          <w:b/>
+          <w:bCs/>
+        </w:rPr>
+        <w:t>"Your Partner in Kitchen"</w:t>
+      </w:r>
+      <w:r>
+        <w:t xml:space="preserve"> identity shifts from "Predicting" to </w:t>
+      </w:r>
+      <w:r>
+        <w:rPr>
+          <w:b/>
+          <w:bCs/>
+        </w:rPr>
+        <w:t>"Exploring."</w:t>
+      </w:r>
+    </w:p>
+    <w:p>
+      <w:pPr>
+        <w:pStyle w:val="Heading3"/>
+      </w:pPr>
+      <w:r>
+        <w:t>The Main Crux: The "Cold Start" Flow</w:t>
+      </w:r>
+    </w:p>
+    <w:p>
+      <w:pPr>
+        <w:pStyle w:val="NormalWeb"/>
+        <w:numPr>
+          <w:ilvl w:val="0"/>
+          <w:numId w:val="15"/>
+        </w:numPr>
+      </w:pPr>
+      <w:r>
+        <w:rPr>
+          <w:b/>
+          <w:bCs/>
+        </w:rPr>
+        <w:t>Week 1: The "Discovery Draft"</w:t>
+      </w:r>
+    </w:p>
+    <w:p>
+      <w:pPr>
+        <w:pStyle w:val="NormalWeb"/>
+        <w:numPr>
+          <w:ilvl w:val="1"/>
+          <w:numId w:val="15"/>
+        </w:numPr>
+      </w:pPr>
+      <w:r>
+        <w:rPr>
+          <w:b/>
+          <w:bCs/>
+        </w:rPr>
+        <w:t>Display:</w:t>
+      </w:r>
+      <w:r>
+        <w:t xml:space="preserve"> A standard, balanced 7-day plan based on popular/highly-rated recipes in the </w:t>
+      </w:r>
+      <w:proofErr w:type="spellStart"/>
+      <w:r>
+        <w:rPr>
+          <w:rStyle w:val="HTMLCode"/>
+        </w:rPr>
+        <w:t>Recipe_Content_Vault</w:t>
+      </w:r>
+      <w:proofErr w:type="spellEnd"/>
+      <w:r>
+        <w:t>.</w:t>
+      </w:r>
+    </w:p>
+    <w:p>
+      <w:pPr>
+        <w:pStyle w:val="NormalWeb"/>
+        <w:numPr>
+          <w:ilvl w:val="1"/>
+          <w:numId w:val="15"/>
+        </w:numPr>
+      </w:pPr>
+      <w:r>
+        <w:rPr>
+          <w:b/>
+          <w:bCs/>
+        </w:rPr>
+        <w:t>The Interaction:</w:t>
+      </w:r>
+      <w:r>
+        <w:t xml:space="preserve"> The Partner asks a single, low-friction question: </w:t>
+      </w:r>
+      <w:r>
+        <w:rPr>
+          <w:i/>
+          <w:iCs/>
+        </w:rPr>
+        <w:t>"I’m still learning your taste—is this week’s mix of 3-Variety and One-Pot meals okay?"</w:t>
+      </w:r>
+    </w:p>
+    <w:p>
+      <w:pPr>
+        <w:pStyle w:val="NormalWeb"/>
+        <w:numPr>
+          <w:ilvl w:val="1"/>
+          <w:numId w:val="15"/>
+        </w:numPr>
+      </w:pPr>
+      <w:r>
+        <w:rPr>
+          <w:b/>
+          <w:bCs/>
+        </w:rPr>
+        <w:t>Goal:</w:t>
+      </w:r>
+      <w:r>
+        <w:t xml:space="preserve"> Simply to see what you </w:t>
+      </w:r>
+      <w:r>
+        <w:rPr>
+          <w:b/>
+          <w:bCs/>
+        </w:rPr>
+        <w:t>keep</w:t>
+      </w:r>
+      <w:r>
+        <w:t xml:space="preserve"> and what you </w:t>
+      </w:r>
+      <w:r>
+        <w:rPr>
+          <w:b/>
+          <w:bCs/>
+        </w:rPr>
+        <w:t>swap</w:t>
+      </w:r>
+      <w:r>
+        <w:t xml:space="preserve"> to generate the first data points.</w:t>
+      </w:r>
+    </w:p>
+    <w:p>
+      <w:pPr>
+        <w:pStyle w:val="NormalWeb"/>
+        <w:numPr>
+          <w:ilvl w:val="0"/>
+          <w:numId w:val="15"/>
+        </w:numPr>
+      </w:pPr>
+      <w:r>
+        <w:rPr>
+          <w:b/>
+          <w:bCs/>
+        </w:rPr>
+        <w:t>Week 2: The "Cluster Draft"</w:t>
+      </w:r>
+    </w:p>
+    <w:p>
+      <w:pPr>
+        <w:pStyle w:val="NormalWeb"/>
+        <w:numPr>
+          <w:ilvl w:val="1"/>
+          <w:numId w:val="15"/>
+        </w:numPr>
+      </w:pPr>
+      <w:r>
+        <w:rPr>
+          <w:b/>
+          <w:bCs/>
+        </w:rPr>
+        <w:t>Display:</w:t>
+      </w:r>
+      <w:r>
+        <w:t xml:space="preserve"> A plan grouped by broad themes (e.g., 3 days of North Indian, 4 days of South Indian).</w:t>
+      </w:r>
+    </w:p>
+    <w:p>
+      <w:pPr>
+        <w:pStyle w:val="NormalWeb"/>
+        <w:numPr>
+          <w:ilvl w:val="1"/>
+          <w:numId w:val="15"/>
+        </w:numPr>
+      </w:pPr>
+      <w:r>
+        <w:rPr>
+          <w:b/>
+          <w:bCs/>
+        </w:rPr>
+        <w:t>The Interaction:</w:t>
+      </w:r>
+      <w:r>
+        <w:t xml:space="preserve"> The Partner observes if you lean into one cluster over the other during your WhatsApp export.</w:t>
+      </w:r>
+    </w:p>
+    <w:p>
+      <w:pPr>
+        <w:pStyle w:val="NormalWeb"/>
+        <w:numPr>
+          <w:ilvl w:val="1"/>
+          <w:numId w:val="15"/>
+        </w:numPr>
+      </w:pPr>
+      <w:r>
+        <w:rPr>
+          <w:b/>
+          <w:bCs/>
+        </w:rPr>
+        <w:t>Confidence Gain:</w:t>
+      </w:r>
+      <w:r>
+        <w:t xml:space="preserve"> The score moves from </w:t>
+      </w:r>
+      <w:r>
+        <w:rPr>
+          <w:b/>
+          <w:bCs/>
+        </w:rPr>
+        <w:t>0 to 0.4</w:t>
+      </w:r>
+      <w:r>
+        <w:t xml:space="preserve">. The engine starts to "sense" your </w:t>
+      </w:r>
+      <w:r>
+        <w:rPr>
+          <w:b/>
+          <w:bCs/>
+        </w:rPr>
+        <w:t>Regional Bias</w:t>
+      </w:r>
+      <w:r>
+        <w:t>.</w:t>
+      </w:r>
+    </w:p>
+    <w:p>
+      <w:pPr>
+        <w:pStyle w:val="NormalWeb"/>
+        <w:numPr>
+          <w:ilvl w:val="0"/>
+          <w:numId w:val="15"/>
+        </w:numPr>
+      </w:pPr>
+      <w:r>
+        <w:rPr>
+          <w:b/>
+          <w:bCs/>
+        </w:rPr>
+        <w:t>The "Market Signal" (₹1,277) Safety Net:</w:t>
+      </w:r>
+    </w:p>
+    <w:p>
+      <w:pPr>
+        <w:pStyle w:val="NormalWeb"/>
+        <w:numPr>
+          <w:ilvl w:val="1"/>
+          <w:numId w:val="15"/>
+        </w:numPr>
+      </w:pPr>
+      <w:r>
+        <w:t xml:space="preserve">Even with 0 </w:t>
+      </w:r>
+      <w:proofErr w:type="gramStart"/>
+      <w:r>
+        <w:t>confidence</w:t>
+      </w:r>
+      <w:proofErr w:type="gramEnd"/>
+      <w:r>
+        <w:t xml:space="preserve">, the </w:t>
+      </w:r>
+      <w:r>
+        <w:rPr>
+          <w:b/>
+          <w:bCs/>
+        </w:rPr>
+        <w:t>₹1,277 Market Sync</w:t>
+      </w:r>
+      <w:r>
+        <w:t xml:space="preserve"> is active. If the market peaks, the Partner offers a "Standard One-Pot" swap as a universal stress-reliever, regardless of your personal history.</w:t>
+      </w:r>
+    </w:p>
+    <w:p>
+      <w:pPr>
+        <w:pStyle w:val="Heading3"/>
+      </w:pPr>
+      <w:r>
+        <w:t>The Parametric Logic (</w:t>
+      </w:r>
+      <w:r>
+        <w:rPr>
+          <w:rStyle w:val="math-inline"/>
+        </w:rPr>
+        <w:t>$W</w:t>
+      </w:r>
+      <w:proofErr w:type="gramStart"/>
+      <w:r>
+        <w:rPr>
+          <w:rStyle w:val="math-inline"/>
+        </w:rPr>
+        <w:t>_{</w:t>
+      </w:r>
+      <w:proofErr w:type="spellStart"/>
+      <w:proofErr w:type="gramEnd"/>
+      <w:r>
+        <w:rPr>
+          <w:rStyle w:val="math-inline"/>
+        </w:rPr>
+        <w:t>obs</w:t>
+      </w:r>
+      <w:proofErr w:type="spellEnd"/>
+      <w:r>
+        <w:rPr>
+          <w:rStyle w:val="math-inline"/>
+        </w:rPr>
+        <w:t>}$</w:t>
+      </w:r>
+      <w:r>
+        <w:t>)</w:t>
+      </w:r>
+    </w:p>
+    <w:p>
+      <w:pPr>
+        <w:pStyle w:val="NormalWeb"/>
+        <w:numPr>
+          <w:ilvl w:val="0"/>
+          <w:numId w:val="16"/>
+        </w:numPr>
+      </w:pPr>
+      <w:r>
+        <w:rPr>
+          <w:b/>
+          <w:bCs/>
+        </w:rPr>
+        <w:t>Default Window:</w:t>
+      </w:r>
+      <w:r>
+        <w:t xml:space="preserve"> The parameter is set to </w:t>
+      </w:r>
+      <w:r>
+        <w:rPr>
+          <w:rStyle w:val="math-inline"/>
+        </w:rPr>
+        <w:t>$W</w:t>
+      </w:r>
+      <w:proofErr w:type="gramStart"/>
+      <w:r>
+        <w:rPr>
+          <w:rStyle w:val="math-inline"/>
+        </w:rPr>
+        <w:t>_{</w:t>
+      </w:r>
+      <w:proofErr w:type="spellStart"/>
+      <w:proofErr w:type="gramEnd"/>
+      <w:r>
+        <w:rPr>
+          <w:rStyle w:val="math-inline"/>
+        </w:rPr>
+        <w:t>obs</w:t>
+      </w:r>
+      <w:proofErr w:type="spellEnd"/>
+      <w:r>
+        <w:rPr>
+          <w:rStyle w:val="math-inline"/>
+        </w:rPr>
+        <w:t>} = 4$</w:t>
+      </w:r>
+      <w:r>
+        <w:t>.</w:t>
+      </w:r>
+    </w:p>
+    <w:p>
+      <w:pPr>
+        <w:pStyle w:val="NormalWeb"/>
+        <w:numPr>
+          <w:ilvl w:val="0"/>
+          <w:numId w:val="16"/>
+        </w:numPr>
+      </w:pPr>
+      <w:r>
+        <w:rPr>
+          <w:b/>
+          <w:bCs/>
+        </w:rPr>
+        <w:t>The Transition:</w:t>
+      </w:r>
+      <w:r>
+        <w:t xml:space="preserve"> As soon as the Confidence Score hits </w:t>
+      </w:r>
+      <w:r>
+        <w:rPr>
+          <w:b/>
+          <w:bCs/>
+        </w:rPr>
+        <w:t>0.7</w:t>
+      </w:r>
+      <w:r>
+        <w:t xml:space="preserve"> (usually by Week 3 or 4), the "Discovery Draft" disappears and the </w:t>
+      </w:r>
+      <w:r>
+        <w:rPr>
+          <w:b/>
+          <w:bCs/>
+        </w:rPr>
+        <w:t>"Smart Draft"</w:t>
+      </w:r>
+      <w:r>
+        <w:t xml:space="preserve"> (your personalized baseline) takes over.</w:t>
       </w:r>
     </w:p>
     <w:p>
@@ -2951,6 +5443,123 @@
     </w:lvl>
   </w:abstractNum>
   <w:abstractNum w:abstractNumId="1">
+    <w:nsid w:val="0E5325CF"/>
+    <w:multiLevelType w:val="multilevel"/>
+    <w:tmpl w:val="5418B672"/>
+    <w:lvl w:ilvl="0">
+      <w:start w:val="1"/>
+      <w:numFmt w:val="decimal"/>
+      <w:lvlText w:val="%1."/>
+      <w:lvlJc w:val="left"/>
+      <w:pPr>
+        <w:tabs>
+          <w:tab w:val="num" w:pos="720"/>
+        </w:tabs>
+        <w:ind w:left="720" w:hanging="360"/>
+      </w:pPr>
+    </w:lvl>
+    <w:lvl w:ilvl="1">
+      <w:start w:val="1"/>
+      <w:numFmt w:val="bullet"/>
+      <w:lvlText w:val="o"/>
+      <w:lvlJc w:val="left"/>
+      <w:pPr>
+        <w:tabs>
+          <w:tab w:val="num" w:pos="1440"/>
+        </w:tabs>
+        <w:ind w:left="1440" w:hanging="360"/>
+      </w:pPr>
+      <w:rPr>
+        <w:rFonts w:ascii="Courier New" w:hAnsi="Courier New" w:hint="default"/>
+        <w:sz w:val="20"/>
+      </w:rPr>
+    </w:lvl>
+    <w:lvl w:ilvl="2" w:tentative="1">
+      <w:start w:val="1"/>
+      <w:numFmt w:val="decimal"/>
+      <w:lvlText w:val="%3."/>
+      <w:lvlJc w:val="left"/>
+      <w:pPr>
+        <w:tabs>
+          <w:tab w:val="num" w:pos="2160"/>
+        </w:tabs>
+        <w:ind w:left="2160" w:hanging="360"/>
+      </w:pPr>
+    </w:lvl>
+    <w:lvl w:ilvl="3" w:tentative="1">
+      <w:start w:val="1"/>
+      <w:numFmt w:val="decimal"/>
+      <w:lvlText w:val="%4."/>
+      <w:lvlJc w:val="left"/>
+      <w:pPr>
+        <w:tabs>
+          <w:tab w:val="num" w:pos="2880"/>
+        </w:tabs>
+        <w:ind w:left="2880" w:hanging="360"/>
+      </w:pPr>
+    </w:lvl>
+    <w:lvl w:ilvl="4" w:tentative="1">
+      <w:start w:val="1"/>
+      <w:numFmt w:val="decimal"/>
+      <w:lvlText w:val="%5."/>
+      <w:lvlJc w:val="left"/>
+      <w:pPr>
+        <w:tabs>
+          <w:tab w:val="num" w:pos="3600"/>
+        </w:tabs>
+        <w:ind w:left="3600" w:hanging="360"/>
+      </w:pPr>
+    </w:lvl>
+    <w:lvl w:ilvl="5" w:tentative="1">
+      <w:start w:val="1"/>
+      <w:numFmt w:val="decimal"/>
+      <w:lvlText w:val="%6."/>
+      <w:lvlJc w:val="left"/>
+      <w:pPr>
+        <w:tabs>
+          <w:tab w:val="num" w:pos="4320"/>
+        </w:tabs>
+        <w:ind w:left="4320" w:hanging="360"/>
+      </w:pPr>
+    </w:lvl>
+    <w:lvl w:ilvl="6" w:tentative="1">
+      <w:start w:val="1"/>
+      <w:numFmt w:val="decimal"/>
+      <w:lvlText w:val="%7."/>
+      <w:lvlJc w:val="left"/>
+      <w:pPr>
+        <w:tabs>
+          <w:tab w:val="num" w:pos="5040"/>
+        </w:tabs>
+        <w:ind w:left="5040" w:hanging="360"/>
+      </w:pPr>
+    </w:lvl>
+    <w:lvl w:ilvl="7" w:tentative="1">
+      <w:start w:val="1"/>
+      <w:numFmt w:val="decimal"/>
+      <w:lvlText w:val="%8."/>
+      <w:lvlJc w:val="left"/>
+      <w:pPr>
+        <w:tabs>
+          <w:tab w:val="num" w:pos="5760"/>
+        </w:tabs>
+        <w:ind w:left="5760" w:hanging="360"/>
+      </w:pPr>
+    </w:lvl>
+    <w:lvl w:ilvl="8" w:tentative="1">
+      <w:start w:val="1"/>
+      <w:numFmt w:val="decimal"/>
+      <w:lvlText w:val="%9."/>
+      <w:lvlJc w:val="left"/>
+      <w:pPr>
+        <w:tabs>
+          <w:tab w:val="num" w:pos="6480"/>
+        </w:tabs>
+        <w:ind w:left="6480" w:hanging="360"/>
+      </w:pPr>
+    </w:lvl>
+  </w:abstractNum>
+  <w:abstractNum w:abstractNumId="2">
     <w:nsid w:val="1ECA6943"/>
     <w:multiLevelType w:val="multilevel"/>
     <w:tmpl w:val="06D0BBA6"/>
@@ -3099,7 +5708,7 @@
       </w:rPr>
     </w:lvl>
   </w:abstractNum>
-  <w:abstractNum w:abstractNumId="2">
+  <w:abstractNum w:abstractNumId="3">
     <w:nsid w:val="292E0E63"/>
     <w:multiLevelType w:val="multilevel"/>
     <w:tmpl w:val="3BD85060"/>
@@ -3248,7 +5857,7 @@
       </w:rPr>
     </w:lvl>
   </w:abstractNum>
-  <w:abstractNum w:abstractNumId="3">
+  <w:abstractNum w:abstractNumId="4">
     <w:nsid w:val="2DB11069"/>
     <w:multiLevelType w:val="multilevel"/>
     <w:tmpl w:val="94BA4016"/>
@@ -3397,7 +6006,7 @@
       </w:rPr>
     </w:lvl>
   </w:abstractNum>
-  <w:abstractNum w:abstractNumId="4">
+  <w:abstractNum w:abstractNumId="5">
     <w:nsid w:val="36BE65E0"/>
     <w:multiLevelType w:val="multilevel"/>
     <w:tmpl w:val="0B867012"/>
@@ -3510,7 +6119,7 @@
       </w:pPr>
     </w:lvl>
   </w:abstractNum>
-  <w:abstractNum w:abstractNumId="5">
+  <w:abstractNum w:abstractNumId="6">
     <w:nsid w:val="3AFB7C87"/>
     <w:multiLevelType w:val="multilevel"/>
     <w:tmpl w:val="3528AAE8"/>
@@ -3659,7 +6268,7 @@
       </w:rPr>
     </w:lvl>
   </w:abstractNum>
-  <w:abstractNum w:abstractNumId="6">
+  <w:abstractNum w:abstractNumId="7">
     <w:nsid w:val="5FF20168"/>
     <w:multiLevelType w:val="multilevel"/>
     <w:tmpl w:val="32AA17EE"/>
@@ -3808,7 +6417,156 @@
       </w:rPr>
     </w:lvl>
   </w:abstractNum>
-  <w:abstractNum w:abstractNumId="7">
+  <w:abstractNum w:abstractNumId="8">
+    <w:nsid w:val="600A2B86"/>
+    <w:multiLevelType w:val="multilevel"/>
+    <w:tmpl w:val="C4C40B38"/>
+    <w:lvl w:ilvl="0">
+      <w:start w:val="1"/>
+      <w:numFmt w:val="bullet"/>
+      <w:lvlText w:val=""/>
+      <w:lvlJc w:val="left"/>
+      <w:pPr>
+        <w:tabs>
+          <w:tab w:val="num" w:pos="720"/>
+        </w:tabs>
+        <w:ind w:left="720" w:hanging="360"/>
+      </w:pPr>
+      <w:rPr>
+        <w:rFonts w:ascii="Symbol" w:hAnsi="Symbol" w:hint="default"/>
+        <w:sz w:val="20"/>
+      </w:rPr>
+    </w:lvl>
+    <w:lvl w:ilvl="1" w:tentative="1">
+      <w:start w:val="1"/>
+      <w:numFmt w:val="bullet"/>
+      <w:lvlText w:val="o"/>
+      <w:lvlJc w:val="left"/>
+      <w:pPr>
+        <w:tabs>
+          <w:tab w:val="num" w:pos="1440"/>
+        </w:tabs>
+        <w:ind w:left="1440" w:hanging="360"/>
+      </w:pPr>
+      <w:rPr>
+        <w:rFonts w:ascii="Courier New" w:hAnsi="Courier New" w:hint="default"/>
+        <w:sz w:val="20"/>
+      </w:rPr>
+    </w:lvl>
+    <w:lvl w:ilvl="2" w:tentative="1">
+      <w:start w:val="1"/>
+      <w:numFmt w:val="bullet"/>
+      <w:lvlText w:val=""/>
+      <w:lvlJc w:val="left"/>
+      <w:pPr>
+        <w:tabs>
+          <w:tab w:val="num" w:pos="2160"/>
+        </w:tabs>
+        <w:ind w:left="2160" w:hanging="360"/>
+      </w:pPr>
+      <w:rPr>
+        <w:rFonts w:ascii="Wingdings" w:hAnsi="Wingdings" w:hint="default"/>
+        <w:sz w:val="20"/>
+      </w:rPr>
+    </w:lvl>
+    <w:lvl w:ilvl="3" w:tentative="1">
+      <w:start w:val="1"/>
+      <w:numFmt w:val="bullet"/>
+      <w:lvlText w:val=""/>
+      <w:lvlJc w:val="left"/>
+      <w:pPr>
+        <w:tabs>
+          <w:tab w:val="num" w:pos="2880"/>
+        </w:tabs>
+        <w:ind w:left="2880" w:hanging="360"/>
+      </w:pPr>
+      <w:rPr>
+        <w:rFonts w:ascii="Wingdings" w:hAnsi="Wingdings" w:hint="default"/>
+        <w:sz w:val="20"/>
+      </w:rPr>
+    </w:lvl>
+    <w:lvl w:ilvl="4" w:tentative="1">
+      <w:start w:val="1"/>
+      <w:numFmt w:val="bullet"/>
+      <w:lvlText w:val=""/>
+      <w:lvlJc w:val="left"/>
+      <w:pPr>
+        <w:tabs>
+          <w:tab w:val="num" w:pos="3600"/>
+        </w:tabs>
+        <w:ind w:left="3600" w:hanging="360"/>
+      </w:pPr>
+      <w:rPr>
+        <w:rFonts w:ascii="Wingdings" w:hAnsi="Wingdings" w:hint="default"/>
+        <w:sz w:val="20"/>
+      </w:rPr>
+    </w:lvl>
+    <w:lvl w:ilvl="5" w:tentative="1">
+      <w:start w:val="1"/>
+      <w:numFmt w:val="bullet"/>
+      <w:lvlText w:val=""/>
+      <w:lvlJc w:val="left"/>
+      <w:pPr>
+        <w:tabs>
+          <w:tab w:val="num" w:pos="4320"/>
+        </w:tabs>
+        <w:ind w:left="4320" w:hanging="360"/>
+      </w:pPr>
+      <w:rPr>
+        <w:rFonts w:ascii="Wingdings" w:hAnsi="Wingdings" w:hint="default"/>
+        <w:sz w:val="20"/>
+      </w:rPr>
+    </w:lvl>
+    <w:lvl w:ilvl="6" w:tentative="1">
+      <w:start w:val="1"/>
+      <w:numFmt w:val="bullet"/>
+      <w:lvlText w:val=""/>
+      <w:lvlJc w:val="left"/>
+      <w:pPr>
+        <w:tabs>
+          <w:tab w:val="num" w:pos="5040"/>
+        </w:tabs>
+        <w:ind w:left="5040" w:hanging="360"/>
+      </w:pPr>
+      <w:rPr>
+        <w:rFonts w:ascii="Wingdings" w:hAnsi="Wingdings" w:hint="default"/>
+        <w:sz w:val="20"/>
+      </w:rPr>
+    </w:lvl>
+    <w:lvl w:ilvl="7" w:tentative="1">
+      <w:start w:val="1"/>
+      <w:numFmt w:val="bullet"/>
+      <w:lvlText w:val=""/>
+      <w:lvlJc w:val="left"/>
+      <w:pPr>
+        <w:tabs>
+          <w:tab w:val="num" w:pos="5760"/>
+        </w:tabs>
+        <w:ind w:left="5760" w:hanging="360"/>
+      </w:pPr>
+      <w:rPr>
+        <w:rFonts w:ascii="Wingdings" w:hAnsi="Wingdings" w:hint="default"/>
+        <w:sz w:val="20"/>
+      </w:rPr>
+    </w:lvl>
+    <w:lvl w:ilvl="8" w:tentative="1">
+      <w:start w:val="1"/>
+      <w:numFmt w:val="bullet"/>
+      <w:lvlText w:val=""/>
+      <w:lvlJc w:val="left"/>
+      <w:pPr>
+        <w:tabs>
+          <w:tab w:val="num" w:pos="6480"/>
+        </w:tabs>
+        <w:ind w:left="6480" w:hanging="360"/>
+      </w:pPr>
+      <w:rPr>
+        <w:rFonts w:ascii="Wingdings" w:hAnsi="Wingdings" w:hint="default"/>
+        <w:sz w:val="20"/>
+      </w:rPr>
+    </w:lvl>
+  </w:abstractNum>
+  <w:abstractNum w:abstractNumId="9">
     <w:nsid w:val="63C665E0"/>
     <w:multiLevelType w:val="multilevel"/>
     <w:tmpl w:val="2DCAFF9A"/>
@@ -3957,7 +6715,7 @@
       </w:rPr>
     </w:lvl>
   </w:abstractNum>
-  <w:abstractNum w:abstractNumId="8">
+  <w:abstractNum w:abstractNumId="10">
     <w:nsid w:val="66CA21A4"/>
     <w:multiLevelType w:val="multilevel"/>
     <w:tmpl w:val="754073FA"/>
@@ -4106,7 +6864,7 @@
       </w:rPr>
     </w:lvl>
   </w:abstractNum>
-  <w:abstractNum w:abstractNumId="9">
+  <w:abstractNum w:abstractNumId="11">
     <w:nsid w:val="707165F3"/>
     <w:multiLevelType w:val="multilevel"/>
     <w:tmpl w:val="EDCA0A52"/>
@@ -4255,35 +7013,649 @@
       </w:rPr>
     </w:lvl>
   </w:abstractNum>
+  <w:abstractNum w:abstractNumId="12">
+    <w:nsid w:val="711D2FD2"/>
+    <w:multiLevelType w:val="multilevel"/>
+    <w:tmpl w:val="9CDE9F7C"/>
+    <w:lvl w:ilvl="0">
+      <w:start w:val="1"/>
+      <w:numFmt w:val="bullet"/>
+      <w:lvlText w:val=""/>
+      <w:lvlJc w:val="left"/>
+      <w:pPr>
+        <w:tabs>
+          <w:tab w:val="num" w:pos="720"/>
+        </w:tabs>
+        <w:ind w:left="720" w:hanging="360"/>
+      </w:pPr>
+      <w:rPr>
+        <w:rFonts w:ascii="Symbol" w:hAnsi="Symbol" w:hint="default"/>
+        <w:sz w:val="20"/>
+      </w:rPr>
+    </w:lvl>
+    <w:lvl w:ilvl="1">
+      <w:start w:val="1"/>
+      <w:numFmt w:val="bullet"/>
+      <w:lvlText w:val="o"/>
+      <w:lvlJc w:val="left"/>
+      <w:pPr>
+        <w:tabs>
+          <w:tab w:val="num" w:pos="1440"/>
+        </w:tabs>
+        <w:ind w:left="1440" w:hanging="360"/>
+      </w:pPr>
+      <w:rPr>
+        <w:rFonts w:ascii="Courier New" w:hAnsi="Courier New" w:hint="default"/>
+        <w:sz w:val="20"/>
+      </w:rPr>
+    </w:lvl>
+    <w:lvl w:ilvl="2" w:tentative="1">
+      <w:start w:val="1"/>
+      <w:numFmt w:val="bullet"/>
+      <w:lvlText w:val=""/>
+      <w:lvlJc w:val="left"/>
+      <w:pPr>
+        <w:tabs>
+          <w:tab w:val="num" w:pos="2160"/>
+        </w:tabs>
+        <w:ind w:left="2160" w:hanging="360"/>
+      </w:pPr>
+      <w:rPr>
+        <w:rFonts w:ascii="Wingdings" w:hAnsi="Wingdings" w:hint="default"/>
+        <w:sz w:val="20"/>
+      </w:rPr>
+    </w:lvl>
+    <w:lvl w:ilvl="3" w:tentative="1">
+      <w:start w:val="1"/>
+      <w:numFmt w:val="bullet"/>
+      <w:lvlText w:val=""/>
+      <w:lvlJc w:val="left"/>
+      <w:pPr>
+        <w:tabs>
+          <w:tab w:val="num" w:pos="2880"/>
+        </w:tabs>
+        <w:ind w:left="2880" w:hanging="360"/>
+      </w:pPr>
+      <w:rPr>
+        <w:rFonts w:ascii="Wingdings" w:hAnsi="Wingdings" w:hint="default"/>
+        <w:sz w:val="20"/>
+      </w:rPr>
+    </w:lvl>
+    <w:lvl w:ilvl="4" w:tentative="1">
+      <w:start w:val="1"/>
+      <w:numFmt w:val="bullet"/>
+      <w:lvlText w:val=""/>
+      <w:lvlJc w:val="left"/>
+      <w:pPr>
+        <w:tabs>
+          <w:tab w:val="num" w:pos="3600"/>
+        </w:tabs>
+        <w:ind w:left="3600" w:hanging="360"/>
+      </w:pPr>
+      <w:rPr>
+        <w:rFonts w:ascii="Wingdings" w:hAnsi="Wingdings" w:hint="default"/>
+        <w:sz w:val="20"/>
+      </w:rPr>
+    </w:lvl>
+    <w:lvl w:ilvl="5" w:tentative="1">
+      <w:start w:val="1"/>
+      <w:numFmt w:val="bullet"/>
+      <w:lvlText w:val=""/>
+      <w:lvlJc w:val="left"/>
+      <w:pPr>
+        <w:tabs>
+          <w:tab w:val="num" w:pos="4320"/>
+        </w:tabs>
+        <w:ind w:left="4320" w:hanging="360"/>
+      </w:pPr>
+      <w:rPr>
+        <w:rFonts w:ascii="Wingdings" w:hAnsi="Wingdings" w:hint="default"/>
+        <w:sz w:val="20"/>
+      </w:rPr>
+    </w:lvl>
+    <w:lvl w:ilvl="6" w:tentative="1">
+      <w:start w:val="1"/>
+      <w:numFmt w:val="bullet"/>
+      <w:lvlText w:val=""/>
+      <w:lvlJc w:val="left"/>
+      <w:pPr>
+        <w:tabs>
+          <w:tab w:val="num" w:pos="5040"/>
+        </w:tabs>
+        <w:ind w:left="5040" w:hanging="360"/>
+      </w:pPr>
+      <w:rPr>
+        <w:rFonts w:ascii="Wingdings" w:hAnsi="Wingdings" w:hint="default"/>
+        <w:sz w:val="20"/>
+      </w:rPr>
+    </w:lvl>
+    <w:lvl w:ilvl="7" w:tentative="1">
+      <w:start w:val="1"/>
+      <w:numFmt w:val="bullet"/>
+      <w:lvlText w:val=""/>
+      <w:lvlJc w:val="left"/>
+      <w:pPr>
+        <w:tabs>
+          <w:tab w:val="num" w:pos="5760"/>
+        </w:tabs>
+        <w:ind w:left="5760" w:hanging="360"/>
+      </w:pPr>
+      <w:rPr>
+        <w:rFonts w:ascii="Wingdings" w:hAnsi="Wingdings" w:hint="default"/>
+        <w:sz w:val="20"/>
+      </w:rPr>
+    </w:lvl>
+    <w:lvl w:ilvl="8" w:tentative="1">
+      <w:start w:val="1"/>
+      <w:numFmt w:val="bullet"/>
+      <w:lvlText w:val=""/>
+      <w:lvlJc w:val="left"/>
+      <w:pPr>
+        <w:tabs>
+          <w:tab w:val="num" w:pos="6480"/>
+        </w:tabs>
+        <w:ind w:left="6480" w:hanging="360"/>
+      </w:pPr>
+      <w:rPr>
+        <w:rFonts w:ascii="Wingdings" w:hAnsi="Wingdings" w:hint="default"/>
+        <w:sz w:val="20"/>
+      </w:rPr>
+    </w:lvl>
+  </w:abstractNum>
+  <w:abstractNum w:abstractNumId="13">
+    <w:nsid w:val="7B693F27"/>
+    <w:multiLevelType w:val="multilevel"/>
+    <w:tmpl w:val="0A3C109E"/>
+    <w:lvl w:ilvl="0">
+      <w:start w:val="1"/>
+      <w:numFmt w:val="bullet"/>
+      <w:lvlText w:val=""/>
+      <w:lvlJc w:val="left"/>
+      <w:pPr>
+        <w:tabs>
+          <w:tab w:val="num" w:pos="720"/>
+        </w:tabs>
+        <w:ind w:left="720" w:hanging="360"/>
+      </w:pPr>
+      <w:rPr>
+        <w:rFonts w:ascii="Symbol" w:hAnsi="Symbol" w:hint="default"/>
+        <w:sz w:val="20"/>
+      </w:rPr>
+    </w:lvl>
+    <w:lvl w:ilvl="1" w:tentative="1">
+      <w:start w:val="1"/>
+      <w:numFmt w:val="bullet"/>
+      <w:lvlText w:val="o"/>
+      <w:lvlJc w:val="left"/>
+      <w:pPr>
+        <w:tabs>
+          <w:tab w:val="num" w:pos="1440"/>
+        </w:tabs>
+        <w:ind w:left="1440" w:hanging="360"/>
+      </w:pPr>
+      <w:rPr>
+        <w:rFonts w:ascii="Courier New" w:hAnsi="Courier New" w:hint="default"/>
+        <w:sz w:val="20"/>
+      </w:rPr>
+    </w:lvl>
+    <w:lvl w:ilvl="2" w:tentative="1">
+      <w:start w:val="1"/>
+      <w:numFmt w:val="bullet"/>
+      <w:lvlText w:val=""/>
+      <w:lvlJc w:val="left"/>
+      <w:pPr>
+        <w:tabs>
+          <w:tab w:val="num" w:pos="2160"/>
+        </w:tabs>
+        <w:ind w:left="2160" w:hanging="360"/>
+      </w:pPr>
+      <w:rPr>
+        <w:rFonts w:ascii="Wingdings" w:hAnsi="Wingdings" w:hint="default"/>
+        <w:sz w:val="20"/>
+      </w:rPr>
+    </w:lvl>
+    <w:lvl w:ilvl="3" w:tentative="1">
+      <w:start w:val="1"/>
+      <w:numFmt w:val="bullet"/>
+      <w:lvlText w:val=""/>
+      <w:lvlJc w:val="left"/>
+      <w:pPr>
+        <w:tabs>
+          <w:tab w:val="num" w:pos="2880"/>
+        </w:tabs>
+        <w:ind w:left="2880" w:hanging="360"/>
+      </w:pPr>
+      <w:rPr>
+        <w:rFonts w:ascii="Wingdings" w:hAnsi="Wingdings" w:hint="default"/>
+        <w:sz w:val="20"/>
+      </w:rPr>
+    </w:lvl>
+    <w:lvl w:ilvl="4" w:tentative="1">
+      <w:start w:val="1"/>
+      <w:numFmt w:val="bullet"/>
+      <w:lvlText w:val=""/>
+      <w:lvlJc w:val="left"/>
+      <w:pPr>
+        <w:tabs>
+          <w:tab w:val="num" w:pos="3600"/>
+        </w:tabs>
+        <w:ind w:left="3600" w:hanging="360"/>
+      </w:pPr>
+      <w:rPr>
+        <w:rFonts w:ascii="Wingdings" w:hAnsi="Wingdings" w:hint="default"/>
+        <w:sz w:val="20"/>
+      </w:rPr>
+    </w:lvl>
+    <w:lvl w:ilvl="5" w:tentative="1">
+      <w:start w:val="1"/>
+      <w:numFmt w:val="bullet"/>
+      <w:lvlText w:val=""/>
+      <w:lvlJc w:val="left"/>
+      <w:pPr>
+        <w:tabs>
+          <w:tab w:val="num" w:pos="4320"/>
+        </w:tabs>
+        <w:ind w:left="4320" w:hanging="360"/>
+      </w:pPr>
+      <w:rPr>
+        <w:rFonts w:ascii="Wingdings" w:hAnsi="Wingdings" w:hint="default"/>
+        <w:sz w:val="20"/>
+      </w:rPr>
+    </w:lvl>
+    <w:lvl w:ilvl="6" w:tentative="1">
+      <w:start w:val="1"/>
+      <w:numFmt w:val="bullet"/>
+      <w:lvlText w:val=""/>
+      <w:lvlJc w:val="left"/>
+      <w:pPr>
+        <w:tabs>
+          <w:tab w:val="num" w:pos="5040"/>
+        </w:tabs>
+        <w:ind w:left="5040" w:hanging="360"/>
+      </w:pPr>
+      <w:rPr>
+        <w:rFonts w:ascii="Wingdings" w:hAnsi="Wingdings" w:hint="default"/>
+        <w:sz w:val="20"/>
+      </w:rPr>
+    </w:lvl>
+    <w:lvl w:ilvl="7" w:tentative="1">
+      <w:start w:val="1"/>
+      <w:numFmt w:val="bullet"/>
+      <w:lvlText w:val=""/>
+      <w:lvlJc w:val="left"/>
+      <w:pPr>
+        <w:tabs>
+          <w:tab w:val="num" w:pos="5760"/>
+        </w:tabs>
+        <w:ind w:left="5760" w:hanging="360"/>
+      </w:pPr>
+      <w:rPr>
+        <w:rFonts w:ascii="Wingdings" w:hAnsi="Wingdings" w:hint="default"/>
+        <w:sz w:val="20"/>
+      </w:rPr>
+    </w:lvl>
+    <w:lvl w:ilvl="8" w:tentative="1">
+      <w:start w:val="1"/>
+      <w:numFmt w:val="bullet"/>
+      <w:lvlText w:val=""/>
+      <w:lvlJc w:val="left"/>
+      <w:pPr>
+        <w:tabs>
+          <w:tab w:val="num" w:pos="6480"/>
+        </w:tabs>
+        <w:ind w:left="6480" w:hanging="360"/>
+      </w:pPr>
+      <w:rPr>
+        <w:rFonts w:ascii="Wingdings" w:hAnsi="Wingdings" w:hint="default"/>
+        <w:sz w:val="20"/>
+      </w:rPr>
+    </w:lvl>
+  </w:abstractNum>
+  <w:abstractNum w:abstractNumId="14">
+    <w:nsid w:val="7E026D8E"/>
+    <w:multiLevelType w:val="multilevel"/>
+    <w:tmpl w:val="7B7CE878"/>
+    <w:lvl w:ilvl="0">
+      <w:start w:val="1"/>
+      <w:numFmt w:val="bullet"/>
+      <w:lvlText w:val=""/>
+      <w:lvlJc w:val="left"/>
+      <w:pPr>
+        <w:tabs>
+          <w:tab w:val="num" w:pos="720"/>
+        </w:tabs>
+        <w:ind w:left="720" w:hanging="360"/>
+      </w:pPr>
+      <w:rPr>
+        <w:rFonts w:ascii="Symbol" w:hAnsi="Symbol" w:hint="default"/>
+        <w:sz w:val="20"/>
+      </w:rPr>
+    </w:lvl>
+    <w:lvl w:ilvl="1" w:tentative="1">
+      <w:start w:val="1"/>
+      <w:numFmt w:val="bullet"/>
+      <w:lvlText w:val="o"/>
+      <w:lvlJc w:val="left"/>
+      <w:pPr>
+        <w:tabs>
+          <w:tab w:val="num" w:pos="1440"/>
+        </w:tabs>
+        <w:ind w:left="1440" w:hanging="360"/>
+      </w:pPr>
+      <w:rPr>
+        <w:rFonts w:ascii="Courier New" w:hAnsi="Courier New" w:hint="default"/>
+        <w:sz w:val="20"/>
+      </w:rPr>
+    </w:lvl>
+    <w:lvl w:ilvl="2" w:tentative="1">
+      <w:start w:val="1"/>
+      <w:numFmt w:val="bullet"/>
+      <w:lvlText w:val=""/>
+      <w:lvlJc w:val="left"/>
+      <w:pPr>
+        <w:tabs>
+          <w:tab w:val="num" w:pos="2160"/>
+        </w:tabs>
+        <w:ind w:left="2160" w:hanging="360"/>
+      </w:pPr>
+      <w:rPr>
+        <w:rFonts w:ascii="Wingdings" w:hAnsi="Wingdings" w:hint="default"/>
+        <w:sz w:val="20"/>
+      </w:rPr>
+    </w:lvl>
+    <w:lvl w:ilvl="3" w:tentative="1">
+      <w:start w:val="1"/>
+      <w:numFmt w:val="bullet"/>
+      <w:lvlText w:val=""/>
+      <w:lvlJc w:val="left"/>
+      <w:pPr>
+        <w:tabs>
+          <w:tab w:val="num" w:pos="2880"/>
+        </w:tabs>
+        <w:ind w:left="2880" w:hanging="360"/>
+      </w:pPr>
+      <w:rPr>
+        <w:rFonts w:ascii="Wingdings" w:hAnsi="Wingdings" w:hint="default"/>
+        <w:sz w:val="20"/>
+      </w:rPr>
+    </w:lvl>
+    <w:lvl w:ilvl="4" w:tentative="1">
+      <w:start w:val="1"/>
+      <w:numFmt w:val="bullet"/>
+      <w:lvlText w:val=""/>
+      <w:lvlJc w:val="left"/>
+      <w:pPr>
+        <w:tabs>
+          <w:tab w:val="num" w:pos="3600"/>
+        </w:tabs>
+        <w:ind w:left="3600" w:hanging="360"/>
+      </w:pPr>
+      <w:rPr>
+        <w:rFonts w:ascii="Wingdings" w:hAnsi="Wingdings" w:hint="default"/>
+        <w:sz w:val="20"/>
+      </w:rPr>
+    </w:lvl>
+    <w:lvl w:ilvl="5" w:tentative="1">
+      <w:start w:val="1"/>
+      <w:numFmt w:val="bullet"/>
+      <w:lvlText w:val=""/>
+      <w:lvlJc w:val="left"/>
+      <w:pPr>
+        <w:tabs>
+          <w:tab w:val="num" w:pos="4320"/>
+        </w:tabs>
+        <w:ind w:left="4320" w:hanging="360"/>
+      </w:pPr>
+      <w:rPr>
+        <w:rFonts w:ascii="Wingdings" w:hAnsi="Wingdings" w:hint="default"/>
+        <w:sz w:val="20"/>
+      </w:rPr>
+    </w:lvl>
+    <w:lvl w:ilvl="6" w:tentative="1">
+      <w:start w:val="1"/>
+      <w:numFmt w:val="bullet"/>
+      <w:lvlText w:val=""/>
+      <w:lvlJc w:val="left"/>
+      <w:pPr>
+        <w:tabs>
+          <w:tab w:val="num" w:pos="5040"/>
+        </w:tabs>
+        <w:ind w:left="5040" w:hanging="360"/>
+      </w:pPr>
+      <w:rPr>
+        <w:rFonts w:ascii="Wingdings" w:hAnsi="Wingdings" w:hint="default"/>
+        <w:sz w:val="20"/>
+      </w:rPr>
+    </w:lvl>
+    <w:lvl w:ilvl="7" w:tentative="1">
+      <w:start w:val="1"/>
+      <w:numFmt w:val="bullet"/>
+      <w:lvlText w:val=""/>
+      <w:lvlJc w:val="left"/>
+      <w:pPr>
+        <w:tabs>
+          <w:tab w:val="num" w:pos="5760"/>
+        </w:tabs>
+        <w:ind w:left="5760" w:hanging="360"/>
+      </w:pPr>
+      <w:rPr>
+        <w:rFonts w:ascii="Wingdings" w:hAnsi="Wingdings" w:hint="default"/>
+        <w:sz w:val="20"/>
+      </w:rPr>
+    </w:lvl>
+    <w:lvl w:ilvl="8" w:tentative="1">
+      <w:start w:val="1"/>
+      <w:numFmt w:val="bullet"/>
+      <w:lvlText w:val=""/>
+      <w:lvlJc w:val="left"/>
+      <w:pPr>
+        <w:tabs>
+          <w:tab w:val="num" w:pos="6480"/>
+        </w:tabs>
+        <w:ind w:left="6480" w:hanging="360"/>
+      </w:pPr>
+      <w:rPr>
+        <w:rFonts w:ascii="Wingdings" w:hAnsi="Wingdings" w:hint="default"/>
+        <w:sz w:val="20"/>
+      </w:rPr>
+    </w:lvl>
+  </w:abstractNum>
+  <w:abstractNum w:abstractNumId="15">
+    <w:nsid w:val="7FDB4FE6"/>
+    <w:multiLevelType w:val="multilevel"/>
+    <w:tmpl w:val="BBD220D6"/>
+    <w:lvl w:ilvl="0">
+      <w:start w:val="1"/>
+      <w:numFmt w:val="bullet"/>
+      <w:lvlText w:val=""/>
+      <w:lvlJc w:val="left"/>
+      <w:pPr>
+        <w:tabs>
+          <w:tab w:val="num" w:pos="720"/>
+        </w:tabs>
+        <w:ind w:left="720" w:hanging="360"/>
+      </w:pPr>
+      <w:rPr>
+        <w:rFonts w:ascii="Symbol" w:hAnsi="Symbol" w:hint="default"/>
+        <w:sz w:val="20"/>
+      </w:rPr>
+    </w:lvl>
+    <w:lvl w:ilvl="1" w:tentative="1">
+      <w:start w:val="1"/>
+      <w:numFmt w:val="bullet"/>
+      <w:lvlText w:val="o"/>
+      <w:lvlJc w:val="left"/>
+      <w:pPr>
+        <w:tabs>
+          <w:tab w:val="num" w:pos="1440"/>
+        </w:tabs>
+        <w:ind w:left="1440" w:hanging="360"/>
+      </w:pPr>
+      <w:rPr>
+        <w:rFonts w:ascii="Courier New" w:hAnsi="Courier New" w:hint="default"/>
+        <w:sz w:val="20"/>
+      </w:rPr>
+    </w:lvl>
+    <w:lvl w:ilvl="2" w:tentative="1">
+      <w:start w:val="1"/>
+      <w:numFmt w:val="bullet"/>
+      <w:lvlText w:val=""/>
+      <w:lvlJc w:val="left"/>
+      <w:pPr>
+        <w:tabs>
+          <w:tab w:val="num" w:pos="2160"/>
+        </w:tabs>
+        <w:ind w:left="2160" w:hanging="360"/>
+      </w:pPr>
+      <w:rPr>
+        <w:rFonts w:ascii="Wingdings" w:hAnsi="Wingdings" w:hint="default"/>
+        <w:sz w:val="20"/>
+      </w:rPr>
+    </w:lvl>
+    <w:lvl w:ilvl="3" w:tentative="1">
+      <w:start w:val="1"/>
+      <w:numFmt w:val="bullet"/>
+      <w:lvlText w:val=""/>
+      <w:lvlJc w:val="left"/>
+      <w:pPr>
+        <w:tabs>
+          <w:tab w:val="num" w:pos="2880"/>
+        </w:tabs>
+        <w:ind w:left="2880" w:hanging="360"/>
+      </w:pPr>
+      <w:rPr>
+        <w:rFonts w:ascii="Wingdings" w:hAnsi="Wingdings" w:hint="default"/>
+        <w:sz w:val="20"/>
+      </w:rPr>
+    </w:lvl>
+    <w:lvl w:ilvl="4" w:tentative="1">
+      <w:start w:val="1"/>
+      <w:numFmt w:val="bullet"/>
+      <w:lvlText w:val=""/>
+      <w:lvlJc w:val="left"/>
+      <w:pPr>
+        <w:tabs>
+          <w:tab w:val="num" w:pos="3600"/>
+        </w:tabs>
+        <w:ind w:left="3600" w:hanging="360"/>
+      </w:pPr>
+      <w:rPr>
+        <w:rFonts w:ascii="Wingdings" w:hAnsi="Wingdings" w:hint="default"/>
+        <w:sz w:val="20"/>
+      </w:rPr>
+    </w:lvl>
+    <w:lvl w:ilvl="5" w:tentative="1">
+      <w:start w:val="1"/>
+      <w:numFmt w:val="bullet"/>
+      <w:lvlText w:val=""/>
+      <w:lvlJc w:val="left"/>
+      <w:pPr>
+        <w:tabs>
+          <w:tab w:val="num" w:pos="4320"/>
+        </w:tabs>
+        <w:ind w:left="4320" w:hanging="360"/>
+      </w:pPr>
+      <w:rPr>
+        <w:rFonts w:ascii="Wingdings" w:hAnsi="Wingdings" w:hint="default"/>
+        <w:sz w:val="20"/>
+      </w:rPr>
+    </w:lvl>
+    <w:lvl w:ilvl="6" w:tentative="1">
+      <w:start w:val="1"/>
+      <w:numFmt w:val="bullet"/>
+      <w:lvlText w:val=""/>
+      <w:lvlJc w:val="left"/>
+      <w:pPr>
+        <w:tabs>
+          <w:tab w:val="num" w:pos="5040"/>
+        </w:tabs>
+        <w:ind w:left="5040" w:hanging="360"/>
+      </w:pPr>
+      <w:rPr>
+        <w:rFonts w:ascii="Wingdings" w:hAnsi="Wingdings" w:hint="default"/>
+        <w:sz w:val="20"/>
+      </w:rPr>
+    </w:lvl>
+    <w:lvl w:ilvl="7" w:tentative="1">
+      <w:start w:val="1"/>
+      <w:numFmt w:val="bullet"/>
+      <w:lvlText w:val=""/>
+      <w:lvlJc w:val="left"/>
+      <w:pPr>
+        <w:tabs>
+          <w:tab w:val="num" w:pos="5760"/>
+        </w:tabs>
+        <w:ind w:left="5760" w:hanging="360"/>
+      </w:pPr>
+      <w:rPr>
+        <w:rFonts w:ascii="Wingdings" w:hAnsi="Wingdings" w:hint="default"/>
+        <w:sz w:val="20"/>
+      </w:rPr>
+    </w:lvl>
+    <w:lvl w:ilvl="8" w:tentative="1">
+      <w:start w:val="1"/>
+      <w:numFmt w:val="bullet"/>
+      <w:lvlText w:val=""/>
+      <w:lvlJc w:val="left"/>
+      <w:pPr>
+        <w:tabs>
+          <w:tab w:val="num" w:pos="6480"/>
+        </w:tabs>
+        <w:ind w:left="6480" w:hanging="360"/>
+      </w:pPr>
+      <w:rPr>
+        <w:rFonts w:ascii="Wingdings" w:hAnsi="Wingdings" w:hint="default"/>
+        <w:sz w:val="20"/>
+      </w:rPr>
+    </w:lvl>
+  </w:abstractNum>
   <w:num w:numId="1">
-    <w:abstractNumId w:val="6"/>
+    <w:abstractNumId w:val="7"/>
   </w:num>
   <w:num w:numId="2">
-    <w:abstractNumId w:val="5"/>
+    <w:abstractNumId w:val="6"/>
   </w:num>
   <w:num w:numId="3">
     <w:abstractNumId w:val="0"/>
   </w:num>
   <w:num w:numId="4">
-    <w:abstractNumId w:val="8"/>
+    <w:abstractNumId w:val="10"/>
   </w:num>
   <w:num w:numId="5">
+    <w:abstractNumId w:val="11"/>
+  </w:num>
+  <w:num w:numId="6">
+    <w:abstractNumId w:val="5"/>
+  </w:num>
+  <w:num w:numId="7">
+    <w:abstractNumId w:val="3"/>
+  </w:num>
+  <w:num w:numId="8">
     <w:abstractNumId w:val="9"/>
   </w:num>
-  <w:num w:numId="6">
+  <w:num w:numId="9">
+    <w:abstractNumId w:val="2"/>
+  </w:num>
+  <w:num w:numId="10">
     <w:abstractNumId w:val="4"/>
   </w:num>
-  <w:num w:numId="7">
-    <w:abstractNumId w:val="2"/>
+  <w:num w:numId="11">
+    <w:abstractNumId w:val="15"/>
   </w:num>
-  <w:num w:numId="8">
-    <w:abstractNumId w:val="7"/>
+  <w:num w:numId="12">
+    <w:abstractNumId w:val="14"/>
   </w:num>
-  <w:num w:numId="9">
+  <w:num w:numId="13">
+    <w:abstractNumId w:val="12"/>
+  </w:num>
+  <w:num w:numId="14">
+    <w:abstractNumId w:val="13"/>
+  </w:num>
+  <w:num w:numId="15">
     <w:abstractNumId w:val="1"/>
   </w:num>
-  <w:num w:numId="10">
-    <w:abstractNumId w:val="3"/>
+  <w:num w:numId="16">
+    <w:abstractNumId w:val="8"/>
   </w:num>
 </w:numbering>
 </file>
@@ -4610,6 +7982,24 @@
       <w:bCs/>
     </w:rPr>
   </w:style>
+  <w:style w:type="character" w:customStyle="1" w:styleId="math-inline">
+    <w:name w:val="math-inline"/>
+    <w:basedOn w:val="DefaultParagraphFont"/>
+    <w:rsid w:val="00780332"/>
+  </w:style>
+  <w:style w:type="character" w:styleId="HTMLCode">
+    <w:name w:val="HTML Code"/>
+    <w:basedOn w:val="DefaultParagraphFont"/>
+    <w:uiPriority w:val="99"/>
+    <w:semiHidden/>
+    <w:unhideWhenUsed/>
+    <w:rsid w:val="00780332"/>
+    <w:rPr>
+      <w:rFonts w:ascii="Courier New" w:eastAsia="Times New Roman" w:hAnsi="Courier New" w:cs="Courier New"/>
+      <w:sz w:val="20"/>
+      <w:szCs w:val="20"/>
+    </w:rPr>
+  </w:style>
 </w:styles>
 </file>
 
@@ -4935,6 +8325,24 @@
       <w:bCs/>
     </w:rPr>
   </w:style>
+  <w:style w:type="character" w:customStyle="1" w:styleId="math-inline">
+    <w:name w:val="math-inline"/>
+    <w:basedOn w:val="DefaultParagraphFont"/>
+    <w:rsid w:val="00780332"/>
+  </w:style>
+  <w:style w:type="character" w:styleId="HTMLCode">
+    <w:name w:val="HTML Code"/>
+    <w:basedOn w:val="DefaultParagraphFont"/>
+    <w:uiPriority w:val="99"/>
+    <w:semiHidden/>
+    <w:unhideWhenUsed/>
+    <w:rsid w:val="00780332"/>
+    <w:rPr>
+      <w:rFonts w:ascii="Courier New" w:eastAsia="Times New Roman" w:hAnsi="Courier New" w:cs="Courier New"/>
+      <w:sz w:val="20"/>
+      <w:szCs w:val="20"/>
+    </w:rPr>
+  </w:style>
 </w:styles>
 </file>
 

</xml_diff>

<commit_message>
5 core functions update
</commit_message>
<xml_diff>
--- a/docs/Master Business Requirement Document-MFS.docx
+++ b/docs/Master Business Requirement Document-MFS.docx
@@ -5278,9 +5278,1636 @@
       </w:r>
     </w:p>
     <w:p>
+      <w:r>
+        <w:t>Under discovery draft</w:t>
+      </w:r>
+    </w:p>
+    <w:p/>
+    <w:p>
+      <w:pPr>
+        <w:pStyle w:val="Heading3"/>
+      </w:pPr>
+      <w:r>
+        <w:t>The 5 Core Functions of the Engine</w:t>
+      </w:r>
+    </w:p>
+    <w:p>
+      <w:pPr>
+        <w:pStyle w:val="Heading3"/>
+      </w:pPr>
+    </w:p>
+    <w:p>
+      <w:pPr>
+        <w:pStyle w:val="NormalWeb"/>
+      </w:pPr>
+      <w:r>
+        <w:t xml:space="preserve">To ensure the </w:t>
+      </w:r>
+      <w:r>
+        <w:rPr>
+          <w:b/>
+          <w:bCs/>
+        </w:rPr>
+        <w:t>"Your Partner in Kitchen"</w:t>
+      </w:r>
+      <w:r>
+        <w:t xml:space="preserve"> engine is modular and reusable, we will build </w:t>
+      </w:r>
+      <w:r>
+        <w:rPr>
+          <w:b/>
+          <w:bCs/>
+        </w:rPr>
+        <w:t>[CP-01]</w:t>
+      </w:r>
+      <w:r>
+        <w:t xml:space="preserve"> using five core functions. This allows us to adjust the "memory" of the AI without breaking the scheduling logic.</w:t>
+      </w:r>
+    </w:p>
+    <w:p>
+      <w:pPr>
+        <w:pStyle w:val="Heading3"/>
+      </w:pPr>
+      <w:r>
+        <w:t>The Modular Crux: [CP-01] Functions</w:t>
+      </w:r>
+    </w:p>
+    <w:p>
+      <w:r>
+        <w:pict>
+          <v:rect id="_x0000_i1034" style="width:0;height:1.5pt" o:hralign="center" o:hrstd="t" o:hr="t" fillcolor="#a0a0a0" stroked="f"/>
+        </w:pict>
+      </w:r>
+    </w:p>
+    <w:p>
+      <w:pPr>
+        <w:pStyle w:val="Heading4"/>
+      </w:pPr>
+      <w:r>
+        <w:lastRenderedPageBreak/>
+        <w:t xml:space="preserve">1. </w:t>
+      </w:r>
+      <w:proofErr w:type="spellStart"/>
+      <w:r>
+        <w:rPr>
+          <w:rStyle w:val="HTMLCode"/>
+          <w:rFonts w:eastAsiaTheme="majorEastAsia"/>
+        </w:rPr>
+        <w:t>Get_Observation_</w:t>
+      </w:r>
+      <w:proofErr w:type="gramStart"/>
+      <w:r>
+        <w:rPr>
+          <w:rStyle w:val="HTMLCode"/>
+          <w:rFonts w:eastAsiaTheme="majorEastAsia"/>
+        </w:rPr>
+        <w:t>Window</w:t>
+      </w:r>
+      <w:proofErr w:type="spellEnd"/>
+      <w:r>
+        <w:rPr>
+          <w:rStyle w:val="HTMLCode"/>
+          <w:rFonts w:eastAsiaTheme="majorEastAsia"/>
+        </w:rPr>
+        <w:t>()</w:t>
+      </w:r>
+      <w:proofErr w:type="gramEnd"/>
+    </w:p>
+    <w:p>
+      <w:pPr>
+        <w:pStyle w:val="NormalWeb"/>
+      </w:pPr>
+      <w:r>
+        <w:rPr>
+          <w:b/>
+          <w:bCs/>
+        </w:rPr>
+        <w:t>Purpose:</w:t>
+      </w:r>
+      <w:r>
+        <w:t xml:space="preserve"> Fetches the current </w:t>
+      </w:r>
+      <w:r>
+        <w:rPr>
+          <w:rStyle w:val="HTMLCode"/>
+        </w:rPr>
+        <w:t>$W</w:t>
+      </w:r>
+      <w:proofErr w:type="gramStart"/>
+      <w:r>
+        <w:rPr>
+          <w:rStyle w:val="HTMLCode"/>
+        </w:rPr>
+        <w:t>_{</w:t>
+      </w:r>
+      <w:proofErr w:type="spellStart"/>
+      <w:proofErr w:type="gramEnd"/>
+      <w:r>
+        <w:rPr>
+          <w:rStyle w:val="HTMLCode"/>
+        </w:rPr>
+        <w:t>obs</w:t>
+      </w:r>
+      <w:proofErr w:type="spellEnd"/>
+      <w:r>
+        <w:rPr>
+          <w:rStyle w:val="HTMLCode"/>
+        </w:rPr>
+        <w:t>}$</w:t>
+      </w:r>
+      <w:r>
+        <w:t xml:space="preserve"> parameter for a specific user.</w:t>
+      </w:r>
+    </w:p>
+    <w:p>
+      <w:pPr>
+        <w:pStyle w:val="NormalWeb"/>
+        <w:numPr>
+          <w:ilvl w:val="0"/>
+          <w:numId w:val="17"/>
+        </w:numPr>
+      </w:pPr>
+      <w:r>
+        <w:rPr>
+          <w:b/>
+          <w:bCs/>
+        </w:rPr>
+        <w:t>Input:</w:t>
+      </w:r>
+      <w:r>
+        <w:t xml:space="preserve"> </w:t>
+      </w:r>
+      <w:proofErr w:type="spellStart"/>
+      <w:r>
+        <w:rPr>
+          <w:rStyle w:val="HTMLCode"/>
+        </w:rPr>
+        <w:t>user_id</w:t>
+      </w:r>
+      <w:proofErr w:type="spellEnd"/>
+    </w:p>
+    <w:p>
+      <w:pPr>
+        <w:pStyle w:val="NormalWeb"/>
+        <w:numPr>
+          <w:ilvl w:val="0"/>
+          <w:numId w:val="17"/>
+        </w:numPr>
+      </w:pPr>
+      <w:r>
+        <w:rPr>
+          <w:b/>
+          <w:bCs/>
+        </w:rPr>
+        <w:t>Output:</w:t>
+      </w:r>
+      <w:r>
+        <w:t xml:space="preserve"> </w:t>
+      </w:r>
+      <w:proofErr w:type="spellStart"/>
+      <w:r>
+        <w:rPr>
+          <w:rStyle w:val="HTMLCode"/>
+        </w:rPr>
+        <w:t>int</w:t>
+      </w:r>
+      <w:proofErr w:type="spellEnd"/>
+      <w:r>
+        <w:t xml:space="preserve"> (Number of weeks, e.g., </w:t>
+      </w:r>
+      <w:r>
+        <w:rPr>
+          <w:rStyle w:val="HTMLCode"/>
+        </w:rPr>
+        <w:t>4</w:t>
+      </w:r>
+      <w:r>
+        <w:t>)</w:t>
+      </w:r>
+    </w:p>
+    <w:p>
+      <w:pPr>
+        <w:pStyle w:val="NormalWeb"/>
+        <w:numPr>
+          <w:ilvl w:val="0"/>
+          <w:numId w:val="17"/>
+        </w:numPr>
+      </w:pPr>
+      <w:r>
+        <w:rPr>
+          <w:b/>
+          <w:bCs/>
+        </w:rPr>
+        <w:t>Reuse:</w:t>
+      </w:r>
+      <w:r>
+        <w:t xml:space="preserve"> Can be called by the UI to show the user how much history the "Partner" is currently </w:t>
+      </w:r>
+      <w:proofErr w:type="spellStart"/>
+      <w:r>
+        <w:t>analyzing</w:t>
+      </w:r>
+      <w:proofErr w:type="spellEnd"/>
+      <w:r>
+        <w:t>.</w:t>
+      </w:r>
+    </w:p>
+    <w:p>
+      <w:pPr>
+        <w:pStyle w:val="Heading4"/>
+      </w:pPr>
+      <w:r>
+        <w:t xml:space="preserve">2. </w:t>
+      </w:r>
+      <w:proofErr w:type="spellStart"/>
+      <w:r>
+        <w:rPr>
+          <w:rStyle w:val="HTMLCode"/>
+          <w:rFonts w:eastAsiaTheme="majorEastAsia"/>
+        </w:rPr>
+        <w:t>Calculate_Date_</w:t>
+      </w:r>
+      <w:proofErr w:type="gramStart"/>
+      <w:r>
+        <w:rPr>
+          <w:rStyle w:val="HTMLCode"/>
+          <w:rFonts w:eastAsiaTheme="majorEastAsia"/>
+        </w:rPr>
+        <w:t>Boundary</w:t>
+      </w:r>
+      <w:proofErr w:type="spellEnd"/>
+      <w:r>
+        <w:rPr>
+          <w:rStyle w:val="HTMLCode"/>
+          <w:rFonts w:eastAsiaTheme="majorEastAsia"/>
+        </w:rPr>
+        <w:t>()</w:t>
+      </w:r>
+      <w:proofErr w:type="gramEnd"/>
+    </w:p>
+    <w:p>
+      <w:pPr>
+        <w:pStyle w:val="NormalWeb"/>
+      </w:pPr>
+      <w:r>
+        <w:rPr>
+          <w:b/>
+          <w:bCs/>
+        </w:rPr>
+        <w:t>Purpose:</w:t>
+      </w:r>
+      <w:r>
+        <w:t xml:space="preserve"> Converts the week-based window into a hard timestamp for database filtering.</w:t>
+      </w:r>
+    </w:p>
+    <w:p>
+      <w:pPr>
+        <w:pStyle w:val="NormalWeb"/>
+        <w:numPr>
+          <w:ilvl w:val="0"/>
+          <w:numId w:val="18"/>
+        </w:numPr>
+      </w:pPr>
+      <w:r>
+        <w:rPr>
+          <w:b/>
+          <w:bCs/>
+        </w:rPr>
+        <w:t>Input:</w:t>
+      </w:r>
+      <w:r>
+        <w:t xml:space="preserve"> </w:t>
+      </w:r>
+      <w:proofErr w:type="spellStart"/>
+      <w:r>
+        <w:rPr>
+          <w:rStyle w:val="HTMLCode"/>
+        </w:rPr>
+        <w:t>window_size</w:t>
+      </w:r>
+      <w:proofErr w:type="spellEnd"/>
+      <w:r>
+        <w:t xml:space="preserve"> (from Function 1)</w:t>
+      </w:r>
+    </w:p>
+    <w:p>
+      <w:pPr>
+        <w:pStyle w:val="NormalWeb"/>
+        <w:numPr>
+          <w:ilvl w:val="0"/>
+          <w:numId w:val="18"/>
+        </w:numPr>
+      </w:pPr>
+      <w:r>
+        <w:rPr>
+          <w:b/>
+          <w:bCs/>
+        </w:rPr>
+        <w:t>Output:</w:t>
+      </w:r>
+      <w:r>
+        <w:t xml:space="preserve"> </w:t>
+      </w:r>
+      <w:r>
+        <w:rPr>
+          <w:rStyle w:val="HTMLCode"/>
+        </w:rPr>
+        <w:t>timestamp</w:t>
+      </w:r>
+      <w:r>
+        <w:t xml:space="preserve"> (e.g., </w:t>
+      </w:r>
+      <w:r>
+        <w:rPr>
+          <w:rStyle w:val="HTMLCode"/>
+        </w:rPr>
+        <w:t>2026-01-31</w:t>
+      </w:r>
+      <w:r>
+        <w:t>)</w:t>
+      </w:r>
+    </w:p>
+    <w:p>
+      <w:pPr>
+        <w:pStyle w:val="NormalWeb"/>
+        <w:numPr>
+          <w:ilvl w:val="0"/>
+          <w:numId w:val="18"/>
+        </w:numPr>
+      </w:pPr>
+      <w:r>
+        <w:rPr>
+          <w:b/>
+          <w:bCs/>
+        </w:rPr>
+        <w:t>Logic:</w:t>
+      </w:r>
+      <w:r>
+        <w:t xml:space="preserve"> </w:t>
+      </w:r>
+      <w:proofErr w:type="spellStart"/>
+      <w:r>
+        <w:rPr>
+          <w:rStyle w:val="HTMLCode"/>
+        </w:rPr>
+        <w:t>Current_Date</w:t>
+      </w:r>
+      <w:proofErr w:type="spellEnd"/>
+      <w:r>
+        <w:rPr>
+          <w:rStyle w:val="HTMLCode"/>
+        </w:rPr>
+        <w:t xml:space="preserve"> - (</w:t>
+      </w:r>
+      <w:proofErr w:type="spellStart"/>
+      <w:r>
+        <w:rPr>
+          <w:rStyle w:val="HTMLCode"/>
+        </w:rPr>
+        <w:t>window_size</w:t>
+      </w:r>
+      <w:proofErr w:type="spellEnd"/>
+      <w:r>
+        <w:rPr>
+          <w:rStyle w:val="HTMLCode"/>
+        </w:rPr>
+        <w:t xml:space="preserve"> * 7 days)</w:t>
+      </w:r>
+    </w:p>
+    <w:p>
+      <w:pPr>
+        <w:pStyle w:val="Heading4"/>
+      </w:pPr>
+      <w:r>
+        <w:t xml:space="preserve">3. </w:t>
+      </w:r>
+      <w:proofErr w:type="spellStart"/>
+      <w:r>
+        <w:rPr>
+          <w:rStyle w:val="HTMLCode"/>
+          <w:rFonts w:eastAsiaTheme="majorEastAsia"/>
+        </w:rPr>
+        <w:t>Fetch_Rolling_</w:t>
+      </w:r>
+      <w:proofErr w:type="gramStart"/>
+      <w:r>
+        <w:rPr>
+          <w:rStyle w:val="HTMLCode"/>
+          <w:rFonts w:eastAsiaTheme="majorEastAsia"/>
+        </w:rPr>
+        <w:t>History</w:t>
+      </w:r>
+      <w:proofErr w:type="spellEnd"/>
+      <w:r>
+        <w:rPr>
+          <w:rStyle w:val="HTMLCode"/>
+          <w:rFonts w:eastAsiaTheme="majorEastAsia"/>
+        </w:rPr>
+        <w:t>()</w:t>
+      </w:r>
+      <w:proofErr w:type="gramEnd"/>
+    </w:p>
+    <w:p>
+      <w:pPr>
+        <w:pStyle w:val="NormalWeb"/>
+      </w:pPr>
+      <w:r>
+        <w:rPr>
+          <w:b/>
+          <w:bCs/>
+        </w:rPr>
+        <w:t>Purpose:</w:t>
+      </w:r>
+      <w:r>
+        <w:t xml:space="preserve"> Retrieves all meal plans and exports within the active window.</w:t>
+      </w:r>
+    </w:p>
+    <w:p>
+      <w:pPr>
+        <w:pStyle w:val="NormalWeb"/>
+        <w:numPr>
+          <w:ilvl w:val="0"/>
+          <w:numId w:val="19"/>
+        </w:numPr>
+      </w:pPr>
+      <w:r>
+        <w:rPr>
+          <w:b/>
+          <w:bCs/>
+        </w:rPr>
+        <w:t>Input:</w:t>
+      </w:r>
+      <w:r>
+        <w:t xml:space="preserve"> </w:t>
+      </w:r>
+      <w:proofErr w:type="spellStart"/>
+      <w:r>
+        <w:rPr>
+          <w:rStyle w:val="HTMLCode"/>
+        </w:rPr>
+        <w:t>user_id</w:t>
+      </w:r>
+      <w:proofErr w:type="spellEnd"/>
+      <w:r>
+        <w:t xml:space="preserve">, </w:t>
+      </w:r>
+      <w:proofErr w:type="spellStart"/>
+      <w:r>
+        <w:rPr>
+          <w:rStyle w:val="HTMLCode"/>
+        </w:rPr>
+        <w:t>start_date</w:t>
+      </w:r>
+      <w:proofErr w:type="spellEnd"/>
+      <w:r>
+        <w:t xml:space="preserve"> (from Function 2)</w:t>
+      </w:r>
+    </w:p>
+    <w:p>
+      <w:pPr>
+        <w:pStyle w:val="NormalWeb"/>
+        <w:numPr>
+          <w:ilvl w:val="0"/>
+          <w:numId w:val="19"/>
+        </w:numPr>
+      </w:pPr>
+      <w:r>
+        <w:rPr>
+          <w:b/>
+          <w:bCs/>
+        </w:rPr>
+        <w:t>Output:</w:t>
+      </w:r>
+      <w:r>
+        <w:t xml:space="preserve"> </w:t>
+      </w:r>
+      <w:r>
+        <w:rPr>
+          <w:rStyle w:val="HTMLCode"/>
+        </w:rPr>
+        <w:t>JSON List</w:t>
+      </w:r>
+      <w:r>
+        <w:t xml:space="preserve"> (Meal IDs, Complexity Scores, and Regional Tags)</w:t>
+      </w:r>
+    </w:p>
+    <w:p>
+      <w:pPr>
+        <w:pStyle w:val="NormalWeb"/>
+        <w:numPr>
+          <w:ilvl w:val="0"/>
+          <w:numId w:val="19"/>
+        </w:numPr>
+      </w:pPr>
+      <w:r>
+        <w:rPr>
+          <w:b/>
+          <w:bCs/>
+        </w:rPr>
+        <w:t>Reuse:</w:t>
+      </w:r>
+      <w:r>
+        <w:t xml:space="preserve"> This is the primary data feed for the </w:t>
+      </w:r>
+      <w:r>
+        <w:rPr>
+          <w:b/>
+          <w:bCs/>
+        </w:rPr>
+        <w:t>Confidence Engine [CP-02]</w:t>
+      </w:r>
+      <w:r>
+        <w:t xml:space="preserve"> and the </w:t>
+      </w:r>
+      <w:r>
+        <w:rPr>
+          <w:b/>
+          <w:bCs/>
+        </w:rPr>
+        <w:t>Taste DNA</w:t>
+      </w:r>
+      <w:r>
+        <w:t xml:space="preserve"> mapper.</w:t>
+      </w:r>
+    </w:p>
+    <w:p>
+      <w:pPr>
+        <w:pStyle w:val="Heading4"/>
+      </w:pPr>
+      <w:r>
+        <w:t xml:space="preserve">4. </w:t>
+      </w:r>
+      <w:proofErr w:type="spellStart"/>
+      <w:r>
+        <w:rPr>
+          <w:rStyle w:val="HTMLCode"/>
+          <w:rFonts w:eastAsiaTheme="majorEastAsia"/>
+        </w:rPr>
+        <w:t>Identify_Behavior_</w:t>
+      </w:r>
+      <w:proofErr w:type="gramStart"/>
+      <w:r>
+        <w:rPr>
+          <w:rStyle w:val="HTMLCode"/>
+          <w:rFonts w:eastAsiaTheme="majorEastAsia"/>
+        </w:rPr>
+        <w:t>Drift</w:t>
+      </w:r>
+      <w:proofErr w:type="spellEnd"/>
+      <w:r>
+        <w:rPr>
+          <w:rStyle w:val="HTMLCode"/>
+          <w:rFonts w:eastAsiaTheme="majorEastAsia"/>
+        </w:rPr>
+        <w:t>()</w:t>
+      </w:r>
+      <w:proofErr w:type="gramEnd"/>
+    </w:p>
+    <w:p>
+      <w:pPr>
+        <w:pStyle w:val="NormalWeb"/>
+      </w:pPr>
+      <w:r>
+        <w:rPr>
+          <w:b/>
+          <w:bCs/>
+        </w:rPr>
+        <w:t>Purpose:</w:t>
+      </w:r>
+      <w:r>
+        <w:t xml:space="preserve"> Compares the </w:t>
+      </w:r>
+      <w:r>
+        <w:rPr>
+          <w:i/>
+          <w:iCs/>
+        </w:rPr>
+        <w:t>latest</w:t>
+      </w:r>
+      <w:r>
+        <w:t xml:space="preserve"> week of data against the </w:t>
+      </w:r>
+      <w:r>
+        <w:rPr>
+          <w:i/>
+          <w:iCs/>
+        </w:rPr>
+        <w:t>previous</w:t>
+      </w:r>
+      <w:r>
+        <w:t xml:space="preserve"> 3 weeks in the window.</w:t>
+      </w:r>
+    </w:p>
+    <w:p>
+      <w:pPr>
+        <w:pStyle w:val="NormalWeb"/>
+        <w:numPr>
+          <w:ilvl w:val="0"/>
+          <w:numId w:val="20"/>
+        </w:numPr>
+      </w:pPr>
+      <w:r>
+        <w:rPr>
+          <w:b/>
+          <w:bCs/>
+        </w:rPr>
+        <w:t>Input:</w:t>
+      </w:r>
+      <w:r>
+        <w:t xml:space="preserve"> </w:t>
+      </w:r>
+      <w:proofErr w:type="spellStart"/>
+      <w:r>
+        <w:rPr>
+          <w:rStyle w:val="HTMLCode"/>
+        </w:rPr>
+        <w:t>current_week_data</w:t>
+      </w:r>
+      <w:proofErr w:type="spellEnd"/>
+      <w:r>
+        <w:t xml:space="preserve">, </w:t>
+      </w:r>
+      <w:proofErr w:type="spellStart"/>
+      <w:r>
+        <w:rPr>
+          <w:rStyle w:val="HTMLCode"/>
+        </w:rPr>
+        <w:t>rolling_history_data</w:t>
+      </w:r>
+      <w:proofErr w:type="spellEnd"/>
+    </w:p>
+    <w:p>
+      <w:pPr>
+        <w:pStyle w:val="NormalWeb"/>
+        <w:numPr>
+          <w:ilvl w:val="0"/>
+          <w:numId w:val="20"/>
+        </w:numPr>
+      </w:pPr>
+      <w:r>
+        <w:rPr>
+          <w:b/>
+          <w:bCs/>
+        </w:rPr>
+        <w:t>Output:</w:t>
+      </w:r>
+      <w:r>
+        <w:t xml:space="preserve"> </w:t>
+      </w:r>
+      <w:proofErr w:type="spellStart"/>
+      <w:r>
+        <w:rPr>
+          <w:rStyle w:val="HTMLCode"/>
+        </w:rPr>
+        <w:t>boolean</w:t>
+      </w:r>
+      <w:proofErr w:type="spellEnd"/>
+      <w:r>
+        <w:t xml:space="preserve"> (True if habits have shifted significantly)</w:t>
+      </w:r>
+    </w:p>
+    <w:p>
+      <w:pPr>
+        <w:pStyle w:val="NormalWeb"/>
+        <w:numPr>
+          <w:ilvl w:val="0"/>
+          <w:numId w:val="20"/>
+        </w:numPr>
+      </w:pPr>
+      <w:r>
+        <w:rPr>
+          <w:b/>
+          <w:bCs/>
+        </w:rPr>
+        <w:t>Action:</w:t>
+      </w:r>
+      <w:r>
+        <w:t xml:space="preserve"> If </w:t>
+      </w:r>
+      <w:r>
+        <w:rPr>
+          <w:rStyle w:val="HTMLCode"/>
+        </w:rPr>
+        <w:t>True</w:t>
+      </w:r>
+      <w:r>
+        <w:t xml:space="preserve">, the system can proactively suggest shortening the </w:t>
+      </w:r>
+      <w:r>
+        <w:rPr>
+          <w:rStyle w:val="HTMLCode"/>
+        </w:rPr>
+        <w:t>$W</w:t>
+      </w:r>
+      <w:proofErr w:type="gramStart"/>
+      <w:r>
+        <w:rPr>
+          <w:rStyle w:val="HTMLCode"/>
+        </w:rPr>
+        <w:t>_{</w:t>
+      </w:r>
+      <w:proofErr w:type="spellStart"/>
+      <w:proofErr w:type="gramEnd"/>
+      <w:r>
+        <w:rPr>
+          <w:rStyle w:val="HTMLCode"/>
+        </w:rPr>
+        <w:t>obs</w:t>
+      </w:r>
+      <w:proofErr w:type="spellEnd"/>
+      <w:r>
+        <w:rPr>
+          <w:rStyle w:val="HTMLCode"/>
+        </w:rPr>
+        <w:t>}$</w:t>
+      </w:r>
+      <w:r>
+        <w:t xml:space="preserve"> to "forget" the old habits faster.</w:t>
+      </w:r>
+    </w:p>
+    <w:p>
+      <w:pPr>
+        <w:pStyle w:val="Heading4"/>
+      </w:pPr>
+      <w:r>
+        <w:t xml:space="preserve">5. </w:t>
+      </w:r>
+      <w:proofErr w:type="spellStart"/>
+      <w:r>
+        <w:rPr>
+          <w:rStyle w:val="HTMLCode"/>
+          <w:rFonts w:eastAsiaTheme="majorEastAsia"/>
+        </w:rPr>
+        <w:t>Update_Intelligence_</w:t>
+      </w:r>
+      <w:proofErr w:type="gramStart"/>
+      <w:r>
+        <w:rPr>
+          <w:rStyle w:val="HTMLCode"/>
+          <w:rFonts w:eastAsiaTheme="majorEastAsia"/>
+        </w:rPr>
+        <w:t>Profile</w:t>
+      </w:r>
+      <w:proofErr w:type="spellEnd"/>
+      <w:r>
+        <w:rPr>
+          <w:rStyle w:val="HTMLCode"/>
+          <w:rFonts w:eastAsiaTheme="majorEastAsia"/>
+        </w:rPr>
+        <w:t>()</w:t>
+      </w:r>
+      <w:proofErr w:type="gramEnd"/>
+    </w:p>
+    <w:p>
+      <w:pPr>
+        <w:pStyle w:val="NormalWeb"/>
+      </w:pPr>
+      <w:r>
+        <w:rPr>
+          <w:b/>
+          <w:bCs/>
+        </w:rPr>
+        <w:t>Purpose:</w:t>
+      </w:r>
+      <w:r>
+        <w:t xml:space="preserve"> The "Writer" function that saves new parameters or recalculation timestamps.</w:t>
+      </w:r>
+    </w:p>
+    <w:p>
+      <w:pPr>
+        <w:pStyle w:val="NormalWeb"/>
+        <w:numPr>
+          <w:ilvl w:val="0"/>
+          <w:numId w:val="21"/>
+        </w:numPr>
+      </w:pPr>
+      <w:r>
+        <w:rPr>
+          <w:b/>
+          <w:bCs/>
+        </w:rPr>
+        <w:t>Input:</w:t>
+      </w:r>
+      <w:r>
+        <w:t xml:space="preserve"> </w:t>
+      </w:r>
+      <w:proofErr w:type="spellStart"/>
+      <w:r>
+        <w:rPr>
+          <w:rStyle w:val="HTMLCode"/>
+        </w:rPr>
+        <w:t>user_id</w:t>
+      </w:r>
+      <w:proofErr w:type="spellEnd"/>
+      <w:r>
+        <w:t xml:space="preserve">, </w:t>
+      </w:r>
+      <w:proofErr w:type="spellStart"/>
+      <w:r>
+        <w:rPr>
+          <w:rStyle w:val="HTMLCode"/>
+        </w:rPr>
+        <w:t>new_window_size</w:t>
+      </w:r>
+      <w:proofErr w:type="spellEnd"/>
+      <w:r>
+        <w:t xml:space="preserve">, </w:t>
+      </w:r>
+      <w:proofErr w:type="spellStart"/>
+      <w:r>
+        <w:rPr>
+          <w:rStyle w:val="HTMLCode"/>
+        </w:rPr>
+        <w:t>recalc_trigger</w:t>
+      </w:r>
+      <w:proofErr w:type="spellEnd"/>
+    </w:p>
+    <w:p>
+      <w:pPr>
+        <w:pStyle w:val="NormalWeb"/>
+        <w:numPr>
+          <w:ilvl w:val="0"/>
+          <w:numId w:val="21"/>
+        </w:numPr>
+      </w:pPr>
+      <w:r>
+        <w:rPr>
+          <w:b/>
+          <w:bCs/>
+        </w:rPr>
+        <w:t>Output:</w:t>
+      </w:r>
+      <w:r>
+        <w:t xml:space="preserve"> </w:t>
+      </w:r>
+      <w:r>
+        <w:rPr>
+          <w:rStyle w:val="HTMLCode"/>
+        </w:rPr>
+        <w:t>void</w:t>
+      </w:r>
+      <w:r>
+        <w:t xml:space="preserve"> (Database Update)</w:t>
+      </w:r>
+    </w:p>
+    <w:p>
+      <w:pPr>
+        <w:pStyle w:val="Heading3"/>
+      </w:pPr>
       <w:bookmarkStart w:id="0" w:name="_GoBack"/>
       <w:bookmarkEnd w:id="0"/>
     </w:p>
+    <w:tbl>
+      <w:tblPr>
+        <w:tblW w:w="0" w:type="auto"/>
+        <w:tblCellSpacing w:w="15" w:type="dxa"/>
+        <w:tblCellMar>
+          <w:top w:w="15" w:type="dxa"/>
+          <w:left w:w="15" w:type="dxa"/>
+          <w:bottom w:w="15" w:type="dxa"/>
+          <w:right w:w="15" w:type="dxa"/>
+        </w:tblCellMar>
+        <w:tblLook w:val="04A0" w:firstRow="1" w:lastRow="0" w:firstColumn="1" w:lastColumn="0" w:noHBand="0" w:noVBand="1"/>
+      </w:tblPr>
+      <w:tblGrid>
+        <w:gridCol w:w="901"/>
+        <w:gridCol w:w="2611"/>
+        <w:gridCol w:w="5634"/>
+      </w:tblGrid>
+      <w:tr>
+        <w:trPr>
+          <w:tblHeader/>
+          <w:tblCellSpacing w:w="15" w:type="dxa"/>
+        </w:trPr>
+        <w:tc>
+          <w:tcPr>
+            <w:tcW w:w="0" w:type="auto"/>
+            <w:tcBorders>
+              <w:top w:val="single" w:sz="6" w:space="0" w:color="auto"/>
+              <w:left w:val="single" w:sz="6" w:space="0" w:color="auto"/>
+              <w:bottom w:val="single" w:sz="6" w:space="0" w:color="auto"/>
+              <w:right w:val="single" w:sz="6" w:space="0" w:color="auto"/>
+            </w:tcBorders>
+            <w:vAlign w:val="center"/>
+            <w:hideMark/>
+          </w:tcPr>
+          <w:p>
+            <w:pPr>
+              <w:spacing w:after="480"/>
+              <w:rPr>
+                <w:sz w:val="24"/>
+                <w:szCs w:val="24"/>
+              </w:rPr>
+            </w:pPr>
+            <w:r>
+              <w:rPr>
+                <w:rStyle w:val="Strong"/>
+              </w:rPr>
+              <w:t>Function</w:t>
+            </w:r>
+          </w:p>
+        </w:tc>
+        <w:tc>
+          <w:tcPr>
+            <w:tcW w:w="0" w:type="auto"/>
+            <w:tcBorders>
+              <w:top w:val="single" w:sz="6" w:space="0" w:color="auto"/>
+              <w:left w:val="single" w:sz="6" w:space="0" w:color="auto"/>
+              <w:bottom w:val="single" w:sz="6" w:space="0" w:color="auto"/>
+              <w:right w:val="single" w:sz="6" w:space="0" w:color="auto"/>
+            </w:tcBorders>
+            <w:vAlign w:val="center"/>
+            <w:hideMark/>
+          </w:tcPr>
+          <w:p>
+            <w:pPr>
+              <w:spacing w:after="480"/>
+              <w:rPr>
+                <w:sz w:val="24"/>
+                <w:szCs w:val="24"/>
+              </w:rPr>
+            </w:pPr>
+            <w:r>
+              <w:rPr>
+                <w:rStyle w:val="Strong"/>
+              </w:rPr>
+              <w:t>Name</w:t>
+            </w:r>
+          </w:p>
+        </w:tc>
+        <w:tc>
+          <w:tcPr>
+            <w:tcW w:w="0" w:type="auto"/>
+            <w:tcBorders>
+              <w:top w:val="single" w:sz="6" w:space="0" w:color="auto"/>
+              <w:left w:val="single" w:sz="6" w:space="0" w:color="auto"/>
+              <w:bottom w:val="single" w:sz="6" w:space="0" w:color="auto"/>
+              <w:right w:val="single" w:sz="6" w:space="0" w:color="auto"/>
+            </w:tcBorders>
+            <w:vAlign w:val="center"/>
+            <w:hideMark/>
+          </w:tcPr>
+          <w:p>
+            <w:pPr>
+              <w:spacing w:after="480"/>
+              <w:rPr>
+                <w:sz w:val="24"/>
+                <w:szCs w:val="24"/>
+              </w:rPr>
+            </w:pPr>
+            <w:r>
+              <w:rPr>
+                <w:rStyle w:val="Strong"/>
+              </w:rPr>
+              <w:t>The Main Crux (Responsibility)</w:t>
+            </w:r>
+          </w:p>
+        </w:tc>
+      </w:tr>
+      <w:tr>
+        <w:trPr>
+          <w:tblCellSpacing w:w="15" w:type="dxa"/>
+        </w:trPr>
+        <w:tc>
+          <w:tcPr>
+            <w:tcW w:w="0" w:type="auto"/>
+            <w:tcBorders>
+              <w:top w:val="single" w:sz="6" w:space="0" w:color="auto"/>
+              <w:left w:val="single" w:sz="6" w:space="0" w:color="auto"/>
+              <w:bottom w:val="single" w:sz="6" w:space="0" w:color="auto"/>
+              <w:right w:val="single" w:sz="6" w:space="0" w:color="auto"/>
+            </w:tcBorders>
+            <w:vAlign w:val="center"/>
+            <w:hideMark/>
+          </w:tcPr>
+          <w:p>
+            <w:pPr>
+              <w:spacing w:after="480"/>
+              <w:rPr>
+                <w:sz w:val="24"/>
+                <w:szCs w:val="24"/>
+              </w:rPr>
+            </w:pPr>
+            <w:proofErr w:type="spellStart"/>
+            <w:r>
+              <w:rPr>
+                <w:b/>
+                <w:bCs/>
+              </w:rPr>
+              <w:lastRenderedPageBreak/>
+              <w:t>Fn</w:t>
+            </w:r>
+            <w:proofErr w:type="spellEnd"/>
+            <w:r>
+              <w:rPr>
+                <w:b/>
+                <w:bCs/>
+              </w:rPr>
+              <w:t xml:space="preserve"> 1</w:t>
+            </w:r>
+          </w:p>
+        </w:tc>
+        <w:tc>
+          <w:tcPr>
+            <w:tcW w:w="0" w:type="auto"/>
+            <w:tcBorders>
+              <w:top w:val="single" w:sz="6" w:space="0" w:color="auto"/>
+              <w:left w:val="single" w:sz="6" w:space="0" w:color="auto"/>
+              <w:bottom w:val="single" w:sz="6" w:space="0" w:color="auto"/>
+              <w:right w:val="single" w:sz="6" w:space="0" w:color="auto"/>
+            </w:tcBorders>
+            <w:vAlign w:val="center"/>
+            <w:hideMark/>
+          </w:tcPr>
+          <w:p>
+            <w:pPr>
+              <w:spacing w:after="480"/>
+              <w:rPr>
+                <w:sz w:val="24"/>
+                <w:szCs w:val="24"/>
+              </w:rPr>
+            </w:pPr>
+            <w:proofErr w:type="spellStart"/>
+            <w:r>
+              <w:rPr>
+                <w:rStyle w:val="HTMLCode"/>
+                <w:rFonts w:eastAsiaTheme="minorHAnsi"/>
+              </w:rPr>
+              <w:t>Set_W_Obs</w:t>
+            </w:r>
+            <w:proofErr w:type="spellEnd"/>
+          </w:p>
+        </w:tc>
+        <w:tc>
+          <w:tcPr>
+            <w:tcW w:w="0" w:type="auto"/>
+            <w:tcBorders>
+              <w:top w:val="single" w:sz="6" w:space="0" w:color="auto"/>
+              <w:left w:val="single" w:sz="6" w:space="0" w:color="auto"/>
+              <w:bottom w:val="single" w:sz="6" w:space="0" w:color="auto"/>
+              <w:right w:val="single" w:sz="6" w:space="0" w:color="auto"/>
+            </w:tcBorders>
+            <w:vAlign w:val="center"/>
+            <w:hideMark/>
+          </w:tcPr>
+          <w:p>
+            <w:pPr>
+              <w:spacing w:after="480"/>
+              <w:rPr>
+                <w:sz w:val="24"/>
+                <w:szCs w:val="24"/>
+              </w:rPr>
+            </w:pPr>
+            <w:r>
+              <w:rPr>
+                <w:b/>
+                <w:bCs/>
+              </w:rPr>
+              <w:t>Logic:</w:t>
+            </w:r>
+            <w:r>
+              <w:t xml:space="preserve"> Establishes the rolling window (default = 4 weeks). Replaces hardcoded dates with a dynamic </w:t>
+            </w:r>
+            <w:r>
+              <w:rPr>
+                <w:rStyle w:val="math-inline"/>
+              </w:rPr>
+              <w:t>$W</w:t>
+            </w:r>
+            <w:proofErr w:type="gramStart"/>
+            <w:r>
+              <w:rPr>
+                <w:rStyle w:val="math-inline"/>
+              </w:rPr>
+              <w:t>_{</w:t>
+            </w:r>
+            <w:proofErr w:type="spellStart"/>
+            <w:proofErr w:type="gramEnd"/>
+            <w:r>
+              <w:rPr>
+                <w:rStyle w:val="math-inline"/>
+              </w:rPr>
+              <w:t>obs</w:t>
+            </w:r>
+            <w:proofErr w:type="spellEnd"/>
+            <w:r>
+              <w:rPr>
+                <w:rStyle w:val="math-inline"/>
+              </w:rPr>
+              <w:t>}$</w:t>
+            </w:r>
+            <w:r>
+              <w:t xml:space="preserve"> parameter.</w:t>
+            </w:r>
+          </w:p>
+        </w:tc>
+      </w:tr>
+      <w:tr>
+        <w:trPr>
+          <w:tblCellSpacing w:w="15" w:type="dxa"/>
+        </w:trPr>
+        <w:tc>
+          <w:tcPr>
+            <w:tcW w:w="0" w:type="auto"/>
+            <w:tcBorders>
+              <w:top w:val="single" w:sz="6" w:space="0" w:color="auto"/>
+              <w:left w:val="single" w:sz="6" w:space="0" w:color="auto"/>
+              <w:bottom w:val="single" w:sz="6" w:space="0" w:color="auto"/>
+              <w:right w:val="single" w:sz="6" w:space="0" w:color="auto"/>
+            </w:tcBorders>
+            <w:vAlign w:val="center"/>
+            <w:hideMark/>
+          </w:tcPr>
+          <w:p>
+            <w:pPr>
+              <w:spacing w:after="480"/>
+              <w:rPr>
+                <w:sz w:val="24"/>
+                <w:szCs w:val="24"/>
+              </w:rPr>
+            </w:pPr>
+            <w:proofErr w:type="spellStart"/>
+            <w:r>
+              <w:rPr>
+                <w:b/>
+                <w:bCs/>
+              </w:rPr>
+              <w:t>Fn</w:t>
+            </w:r>
+            <w:proofErr w:type="spellEnd"/>
+            <w:r>
+              <w:rPr>
+                <w:b/>
+                <w:bCs/>
+              </w:rPr>
+              <w:t xml:space="preserve"> 2</w:t>
+            </w:r>
+          </w:p>
+        </w:tc>
+        <w:tc>
+          <w:tcPr>
+            <w:tcW w:w="0" w:type="auto"/>
+            <w:tcBorders>
+              <w:top w:val="single" w:sz="6" w:space="0" w:color="auto"/>
+              <w:left w:val="single" w:sz="6" w:space="0" w:color="auto"/>
+              <w:bottom w:val="single" w:sz="6" w:space="0" w:color="auto"/>
+              <w:right w:val="single" w:sz="6" w:space="0" w:color="auto"/>
+            </w:tcBorders>
+            <w:vAlign w:val="center"/>
+            <w:hideMark/>
+          </w:tcPr>
+          <w:p>
+            <w:pPr>
+              <w:spacing w:after="480"/>
+              <w:rPr>
+                <w:sz w:val="24"/>
+                <w:szCs w:val="24"/>
+              </w:rPr>
+            </w:pPr>
+            <w:proofErr w:type="spellStart"/>
+            <w:r>
+              <w:rPr>
+                <w:rStyle w:val="HTMLCode"/>
+                <w:rFonts w:eastAsiaTheme="minorHAnsi"/>
+              </w:rPr>
+              <w:t>Calculate_Boundary</w:t>
+            </w:r>
+            <w:proofErr w:type="spellEnd"/>
+          </w:p>
+        </w:tc>
+        <w:tc>
+          <w:tcPr>
+            <w:tcW w:w="0" w:type="auto"/>
+            <w:tcBorders>
+              <w:top w:val="single" w:sz="6" w:space="0" w:color="auto"/>
+              <w:left w:val="single" w:sz="6" w:space="0" w:color="auto"/>
+              <w:bottom w:val="single" w:sz="6" w:space="0" w:color="auto"/>
+              <w:right w:val="single" w:sz="6" w:space="0" w:color="auto"/>
+            </w:tcBorders>
+            <w:vAlign w:val="center"/>
+            <w:hideMark/>
+          </w:tcPr>
+          <w:p>
+            <w:pPr>
+              <w:spacing w:after="480"/>
+              <w:rPr>
+                <w:sz w:val="24"/>
+                <w:szCs w:val="24"/>
+              </w:rPr>
+            </w:pPr>
+            <w:r>
+              <w:rPr>
+                <w:b/>
+                <w:bCs/>
+              </w:rPr>
+              <w:t>Logic:</w:t>
+            </w:r>
+            <w:r>
+              <w:t xml:space="preserve"> Subtracts </w:t>
+            </w:r>
+            <w:r>
+              <w:rPr>
+                <w:rStyle w:val="math-inline"/>
+              </w:rPr>
+              <w:t>$W</w:t>
+            </w:r>
+            <w:proofErr w:type="gramStart"/>
+            <w:r>
+              <w:rPr>
+                <w:rStyle w:val="math-inline"/>
+              </w:rPr>
+              <w:t>_{</w:t>
+            </w:r>
+            <w:proofErr w:type="spellStart"/>
+            <w:proofErr w:type="gramEnd"/>
+            <w:r>
+              <w:rPr>
+                <w:rStyle w:val="math-inline"/>
+              </w:rPr>
+              <w:t>obs</w:t>
+            </w:r>
+            <w:proofErr w:type="spellEnd"/>
+            <w:r>
+              <w:rPr>
+                <w:rStyle w:val="math-inline"/>
+              </w:rPr>
+              <w:t>}$</w:t>
+            </w:r>
+            <w:r>
+              <w:t xml:space="preserve"> from the current date to create the "ignore" threshold for Sunday draft generation.</w:t>
+            </w:r>
+          </w:p>
+        </w:tc>
+      </w:tr>
+      <w:tr>
+        <w:trPr>
+          <w:tblCellSpacing w:w="15" w:type="dxa"/>
+        </w:trPr>
+        <w:tc>
+          <w:tcPr>
+            <w:tcW w:w="0" w:type="auto"/>
+            <w:tcBorders>
+              <w:top w:val="single" w:sz="6" w:space="0" w:color="auto"/>
+              <w:left w:val="single" w:sz="6" w:space="0" w:color="auto"/>
+              <w:bottom w:val="single" w:sz="6" w:space="0" w:color="auto"/>
+              <w:right w:val="single" w:sz="6" w:space="0" w:color="auto"/>
+            </w:tcBorders>
+            <w:vAlign w:val="center"/>
+            <w:hideMark/>
+          </w:tcPr>
+          <w:p>
+            <w:pPr>
+              <w:spacing w:after="480"/>
+              <w:rPr>
+                <w:sz w:val="24"/>
+                <w:szCs w:val="24"/>
+              </w:rPr>
+            </w:pPr>
+            <w:proofErr w:type="spellStart"/>
+            <w:r>
+              <w:rPr>
+                <w:b/>
+                <w:bCs/>
+              </w:rPr>
+              <w:t>Fn</w:t>
+            </w:r>
+            <w:proofErr w:type="spellEnd"/>
+            <w:r>
+              <w:rPr>
+                <w:b/>
+                <w:bCs/>
+              </w:rPr>
+              <w:t xml:space="preserve"> 3</w:t>
+            </w:r>
+          </w:p>
+        </w:tc>
+        <w:tc>
+          <w:tcPr>
+            <w:tcW w:w="0" w:type="auto"/>
+            <w:tcBorders>
+              <w:top w:val="single" w:sz="6" w:space="0" w:color="auto"/>
+              <w:left w:val="single" w:sz="6" w:space="0" w:color="auto"/>
+              <w:bottom w:val="single" w:sz="6" w:space="0" w:color="auto"/>
+              <w:right w:val="single" w:sz="6" w:space="0" w:color="auto"/>
+            </w:tcBorders>
+            <w:vAlign w:val="center"/>
+            <w:hideMark/>
+          </w:tcPr>
+          <w:p>
+            <w:pPr>
+              <w:spacing w:after="480"/>
+              <w:rPr>
+                <w:sz w:val="24"/>
+                <w:szCs w:val="24"/>
+              </w:rPr>
+            </w:pPr>
+            <w:proofErr w:type="spellStart"/>
+            <w:r>
+              <w:rPr>
+                <w:rStyle w:val="HTMLCode"/>
+                <w:rFonts w:eastAsiaTheme="minorHAnsi"/>
+              </w:rPr>
+              <w:t>Fetch_Rolling_History</w:t>
+            </w:r>
+            <w:proofErr w:type="spellEnd"/>
+          </w:p>
+        </w:tc>
+        <w:tc>
+          <w:tcPr>
+            <w:tcW w:w="0" w:type="auto"/>
+            <w:tcBorders>
+              <w:top w:val="single" w:sz="6" w:space="0" w:color="auto"/>
+              <w:left w:val="single" w:sz="6" w:space="0" w:color="auto"/>
+              <w:bottom w:val="single" w:sz="6" w:space="0" w:color="auto"/>
+              <w:right w:val="single" w:sz="6" w:space="0" w:color="auto"/>
+            </w:tcBorders>
+            <w:vAlign w:val="center"/>
+            <w:hideMark/>
+          </w:tcPr>
+          <w:p>
+            <w:pPr>
+              <w:spacing w:after="480"/>
+              <w:rPr>
+                <w:sz w:val="24"/>
+                <w:szCs w:val="24"/>
+              </w:rPr>
+            </w:pPr>
+            <w:r>
+              <w:rPr>
+                <w:b/>
+                <w:bCs/>
+              </w:rPr>
+              <w:t>Logic:</w:t>
+            </w:r>
+            <w:r>
+              <w:t xml:space="preserve"> Queries the </w:t>
+            </w:r>
+            <w:proofErr w:type="spellStart"/>
+            <w:r>
+              <w:rPr>
+                <w:rStyle w:val="HTMLCode"/>
+                <w:rFonts w:eastAsiaTheme="minorHAnsi"/>
+              </w:rPr>
+              <w:t>Recipe_Content_Vault</w:t>
+            </w:r>
+            <w:proofErr w:type="spellEnd"/>
+            <w:r>
+              <w:t xml:space="preserve">. Retrieves </w:t>
+            </w:r>
+            <w:proofErr w:type="spellStart"/>
+            <w:r>
+              <w:rPr>
+                <w:rStyle w:val="HTMLCode"/>
+                <w:rFonts w:eastAsiaTheme="minorHAnsi"/>
+              </w:rPr>
+              <w:t>hero_image</w:t>
+            </w:r>
+            <w:proofErr w:type="spellEnd"/>
+            <w:r>
+              <w:t xml:space="preserve"> and </w:t>
+            </w:r>
+            <w:proofErr w:type="spellStart"/>
+            <w:r>
+              <w:rPr>
+                <w:rStyle w:val="HTMLCode"/>
+                <w:rFonts w:eastAsiaTheme="minorHAnsi"/>
+              </w:rPr>
+              <w:t>prep_steps</w:t>
+            </w:r>
+            <w:proofErr w:type="spellEnd"/>
+            <w:r>
+              <w:t xml:space="preserve"> only for records newer than the boundary.</w:t>
+            </w:r>
+          </w:p>
+        </w:tc>
+      </w:tr>
+      <w:tr>
+        <w:trPr>
+          <w:tblCellSpacing w:w="15" w:type="dxa"/>
+        </w:trPr>
+        <w:tc>
+          <w:tcPr>
+            <w:tcW w:w="0" w:type="auto"/>
+            <w:tcBorders>
+              <w:top w:val="single" w:sz="6" w:space="0" w:color="auto"/>
+              <w:left w:val="single" w:sz="6" w:space="0" w:color="auto"/>
+              <w:bottom w:val="single" w:sz="6" w:space="0" w:color="auto"/>
+              <w:right w:val="single" w:sz="6" w:space="0" w:color="auto"/>
+            </w:tcBorders>
+            <w:vAlign w:val="center"/>
+            <w:hideMark/>
+          </w:tcPr>
+          <w:p>
+            <w:pPr>
+              <w:spacing w:after="480"/>
+              <w:rPr>
+                <w:sz w:val="24"/>
+                <w:szCs w:val="24"/>
+              </w:rPr>
+            </w:pPr>
+            <w:proofErr w:type="spellStart"/>
+            <w:r>
+              <w:rPr>
+                <w:b/>
+                <w:bCs/>
+              </w:rPr>
+              <w:t>Fn</w:t>
+            </w:r>
+            <w:proofErr w:type="spellEnd"/>
+            <w:r>
+              <w:rPr>
+                <w:b/>
+                <w:bCs/>
+              </w:rPr>
+              <w:t xml:space="preserve"> 4</w:t>
+            </w:r>
+          </w:p>
+        </w:tc>
+        <w:tc>
+          <w:tcPr>
+            <w:tcW w:w="0" w:type="auto"/>
+            <w:tcBorders>
+              <w:top w:val="single" w:sz="6" w:space="0" w:color="auto"/>
+              <w:left w:val="single" w:sz="6" w:space="0" w:color="auto"/>
+              <w:bottom w:val="single" w:sz="6" w:space="0" w:color="auto"/>
+              <w:right w:val="single" w:sz="6" w:space="0" w:color="auto"/>
+            </w:tcBorders>
+            <w:vAlign w:val="center"/>
+            <w:hideMark/>
+          </w:tcPr>
+          <w:p>
+            <w:pPr>
+              <w:spacing w:after="480"/>
+              <w:rPr>
+                <w:sz w:val="24"/>
+                <w:szCs w:val="24"/>
+              </w:rPr>
+            </w:pPr>
+            <w:proofErr w:type="spellStart"/>
+            <w:r>
+              <w:rPr>
+                <w:rStyle w:val="HTMLCode"/>
+                <w:rFonts w:eastAsiaTheme="minorHAnsi"/>
+              </w:rPr>
+              <w:t>Analyze_Taste_DNA</w:t>
+            </w:r>
+            <w:proofErr w:type="spellEnd"/>
+          </w:p>
+        </w:tc>
+        <w:tc>
+          <w:tcPr>
+            <w:tcW w:w="0" w:type="auto"/>
+            <w:tcBorders>
+              <w:top w:val="single" w:sz="6" w:space="0" w:color="auto"/>
+              <w:left w:val="single" w:sz="6" w:space="0" w:color="auto"/>
+              <w:bottom w:val="single" w:sz="6" w:space="0" w:color="auto"/>
+              <w:right w:val="single" w:sz="6" w:space="0" w:color="auto"/>
+            </w:tcBorders>
+            <w:vAlign w:val="center"/>
+            <w:hideMark/>
+          </w:tcPr>
+          <w:p>
+            <w:pPr>
+              <w:spacing w:after="480"/>
+              <w:rPr>
+                <w:sz w:val="24"/>
+                <w:szCs w:val="24"/>
+              </w:rPr>
+            </w:pPr>
+            <w:r>
+              <w:rPr>
+                <w:b/>
+                <w:bCs/>
+              </w:rPr>
+              <w:t>Logic:</w:t>
+            </w:r>
+            <w:r>
+              <w:t xml:space="preserve"> Parses the </w:t>
+            </w:r>
+            <w:proofErr w:type="spellStart"/>
+            <w:r>
+              <w:rPr>
+                <w:rStyle w:val="HTMLCode"/>
+                <w:rFonts w:eastAsiaTheme="minorHAnsi"/>
+              </w:rPr>
+              <w:t>prep_steps</w:t>
+            </w:r>
+            <w:proofErr w:type="spellEnd"/>
+            <w:r>
+              <w:t xml:space="preserve"> and ingredients from the fetch to identify "Energy Rhythms" and shifting user habits.</w:t>
+            </w:r>
+          </w:p>
+        </w:tc>
+      </w:tr>
+      <w:tr>
+        <w:trPr>
+          <w:tblCellSpacing w:w="15" w:type="dxa"/>
+        </w:trPr>
+        <w:tc>
+          <w:tcPr>
+            <w:tcW w:w="0" w:type="auto"/>
+            <w:tcBorders>
+              <w:top w:val="single" w:sz="6" w:space="0" w:color="auto"/>
+              <w:left w:val="single" w:sz="6" w:space="0" w:color="auto"/>
+              <w:bottom w:val="single" w:sz="6" w:space="0" w:color="auto"/>
+              <w:right w:val="single" w:sz="6" w:space="0" w:color="auto"/>
+            </w:tcBorders>
+            <w:vAlign w:val="center"/>
+            <w:hideMark/>
+          </w:tcPr>
+          <w:p>
+            <w:pPr>
+              <w:spacing w:after="480"/>
+              <w:rPr>
+                <w:sz w:val="24"/>
+                <w:szCs w:val="24"/>
+              </w:rPr>
+            </w:pPr>
+            <w:proofErr w:type="spellStart"/>
+            <w:r>
+              <w:rPr>
+                <w:b/>
+                <w:bCs/>
+              </w:rPr>
+              <w:t>Fn</w:t>
+            </w:r>
+            <w:proofErr w:type="spellEnd"/>
+            <w:r>
+              <w:rPr>
+                <w:b/>
+                <w:bCs/>
+              </w:rPr>
+              <w:t xml:space="preserve"> 5</w:t>
+            </w:r>
+          </w:p>
+        </w:tc>
+        <w:tc>
+          <w:tcPr>
+            <w:tcW w:w="0" w:type="auto"/>
+            <w:tcBorders>
+              <w:top w:val="single" w:sz="6" w:space="0" w:color="auto"/>
+              <w:left w:val="single" w:sz="6" w:space="0" w:color="auto"/>
+              <w:bottom w:val="single" w:sz="6" w:space="0" w:color="auto"/>
+              <w:right w:val="single" w:sz="6" w:space="0" w:color="auto"/>
+            </w:tcBorders>
+            <w:vAlign w:val="center"/>
+            <w:hideMark/>
+          </w:tcPr>
+          <w:p>
+            <w:pPr>
+              <w:spacing w:after="480"/>
+              <w:rPr>
+                <w:sz w:val="24"/>
+                <w:szCs w:val="24"/>
+              </w:rPr>
+            </w:pPr>
+            <w:proofErr w:type="spellStart"/>
+            <w:r>
+              <w:rPr>
+                <w:rStyle w:val="HTMLCode"/>
+                <w:rFonts w:eastAsiaTheme="minorHAnsi"/>
+              </w:rPr>
+              <w:t>Update_ML_Weightage</w:t>
+            </w:r>
+            <w:proofErr w:type="spellEnd"/>
+          </w:p>
+        </w:tc>
+        <w:tc>
+          <w:tcPr>
+            <w:tcW w:w="0" w:type="auto"/>
+            <w:tcBorders>
+              <w:top w:val="single" w:sz="6" w:space="0" w:color="auto"/>
+              <w:left w:val="single" w:sz="6" w:space="0" w:color="auto"/>
+              <w:bottom w:val="single" w:sz="6" w:space="0" w:color="auto"/>
+              <w:right w:val="single" w:sz="6" w:space="0" w:color="auto"/>
+            </w:tcBorders>
+            <w:vAlign w:val="center"/>
+            <w:hideMark/>
+          </w:tcPr>
+          <w:p>
+            <w:pPr>
+              <w:spacing w:after="480"/>
+              <w:rPr>
+                <w:sz w:val="24"/>
+                <w:szCs w:val="24"/>
+              </w:rPr>
+            </w:pPr>
+            <w:r>
+              <w:rPr>
+                <w:b/>
+                <w:bCs/>
+              </w:rPr>
+              <w:t>Logic:</w:t>
+            </w:r>
+            <w:r>
+              <w:t xml:space="preserve"> Adjusts the "Momentum Divergence" signal. If a price/habit hits a peak (e.g., ₹1,277) but RSI/Interest drops, it signals a "Wave 5" peak.</w:t>
+            </w:r>
+          </w:p>
+        </w:tc>
+      </w:tr>
+    </w:tbl>
+    <w:p/>
+    <w:p/>
     <w:sectPr>
       <w:pgSz w:w="11906" w:h="16838"/>
       <w:pgMar w:top="1440" w:right="1440" w:bottom="1440" w:left="1440" w:header="708" w:footer="708" w:gutter="0"/>
@@ -5443,6 +7070,155 @@
     </w:lvl>
   </w:abstractNum>
   <w:abstractNum w:abstractNumId="1">
+    <w:nsid w:val="0B1A20D5"/>
+    <w:multiLevelType w:val="multilevel"/>
+    <w:tmpl w:val="7B305DA0"/>
+    <w:lvl w:ilvl="0">
+      <w:start w:val="1"/>
+      <w:numFmt w:val="bullet"/>
+      <w:lvlText w:val=""/>
+      <w:lvlJc w:val="left"/>
+      <w:pPr>
+        <w:tabs>
+          <w:tab w:val="num" w:pos="720"/>
+        </w:tabs>
+        <w:ind w:left="720" w:hanging="360"/>
+      </w:pPr>
+      <w:rPr>
+        <w:rFonts w:ascii="Symbol" w:hAnsi="Symbol" w:hint="default"/>
+        <w:sz w:val="20"/>
+      </w:rPr>
+    </w:lvl>
+    <w:lvl w:ilvl="1" w:tentative="1">
+      <w:start w:val="1"/>
+      <w:numFmt w:val="bullet"/>
+      <w:lvlText w:val="o"/>
+      <w:lvlJc w:val="left"/>
+      <w:pPr>
+        <w:tabs>
+          <w:tab w:val="num" w:pos="1440"/>
+        </w:tabs>
+        <w:ind w:left="1440" w:hanging="360"/>
+      </w:pPr>
+      <w:rPr>
+        <w:rFonts w:ascii="Courier New" w:hAnsi="Courier New" w:hint="default"/>
+        <w:sz w:val="20"/>
+      </w:rPr>
+    </w:lvl>
+    <w:lvl w:ilvl="2" w:tentative="1">
+      <w:start w:val="1"/>
+      <w:numFmt w:val="bullet"/>
+      <w:lvlText w:val=""/>
+      <w:lvlJc w:val="left"/>
+      <w:pPr>
+        <w:tabs>
+          <w:tab w:val="num" w:pos="2160"/>
+        </w:tabs>
+        <w:ind w:left="2160" w:hanging="360"/>
+      </w:pPr>
+      <w:rPr>
+        <w:rFonts w:ascii="Wingdings" w:hAnsi="Wingdings" w:hint="default"/>
+        <w:sz w:val="20"/>
+      </w:rPr>
+    </w:lvl>
+    <w:lvl w:ilvl="3" w:tentative="1">
+      <w:start w:val="1"/>
+      <w:numFmt w:val="bullet"/>
+      <w:lvlText w:val=""/>
+      <w:lvlJc w:val="left"/>
+      <w:pPr>
+        <w:tabs>
+          <w:tab w:val="num" w:pos="2880"/>
+        </w:tabs>
+        <w:ind w:left="2880" w:hanging="360"/>
+      </w:pPr>
+      <w:rPr>
+        <w:rFonts w:ascii="Wingdings" w:hAnsi="Wingdings" w:hint="default"/>
+        <w:sz w:val="20"/>
+      </w:rPr>
+    </w:lvl>
+    <w:lvl w:ilvl="4" w:tentative="1">
+      <w:start w:val="1"/>
+      <w:numFmt w:val="bullet"/>
+      <w:lvlText w:val=""/>
+      <w:lvlJc w:val="left"/>
+      <w:pPr>
+        <w:tabs>
+          <w:tab w:val="num" w:pos="3600"/>
+        </w:tabs>
+        <w:ind w:left="3600" w:hanging="360"/>
+      </w:pPr>
+      <w:rPr>
+        <w:rFonts w:ascii="Wingdings" w:hAnsi="Wingdings" w:hint="default"/>
+        <w:sz w:val="20"/>
+      </w:rPr>
+    </w:lvl>
+    <w:lvl w:ilvl="5" w:tentative="1">
+      <w:start w:val="1"/>
+      <w:numFmt w:val="bullet"/>
+      <w:lvlText w:val=""/>
+      <w:lvlJc w:val="left"/>
+      <w:pPr>
+        <w:tabs>
+          <w:tab w:val="num" w:pos="4320"/>
+        </w:tabs>
+        <w:ind w:left="4320" w:hanging="360"/>
+      </w:pPr>
+      <w:rPr>
+        <w:rFonts w:ascii="Wingdings" w:hAnsi="Wingdings" w:hint="default"/>
+        <w:sz w:val="20"/>
+      </w:rPr>
+    </w:lvl>
+    <w:lvl w:ilvl="6" w:tentative="1">
+      <w:start w:val="1"/>
+      <w:numFmt w:val="bullet"/>
+      <w:lvlText w:val=""/>
+      <w:lvlJc w:val="left"/>
+      <w:pPr>
+        <w:tabs>
+          <w:tab w:val="num" w:pos="5040"/>
+        </w:tabs>
+        <w:ind w:left="5040" w:hanging="360"/>
+      </w:pPr>
+      <w:rPr>
+        <w:rFonts w:ascii="Wingdings" w:hAnsi="Wingdings" w:hint="default"/>
+        <w:sz w:val="20"/>
+      </w:rPr>
+    </w:lvl>
+    <w:lvl w:ilvl="7" w:tentative="1">
+      <w:start w:val="1"/>
+      <w:numFmt w:val="bullet"/>
+      <w:lvlText w:val=""/>
+      <w:lvlJc w:val="left"/>
+      <w:pPr>
+        <w:tabs>
+          <w:tab w:val="num" w:pos="5760"/>
+        </w:tabs>
+        <w:ind w:left="5760" w:hanging="360"/>
+      </w:pPr>
+      <w:rPr>
+        <w:rFonts w:ascii="Wingdings" w:hAnsi="Wingdings" w:hint="default"/>
+        <w:sz w:val="20"/>
+      </w:rPr>
+    </w:lvl>
+    <w:lvl w:ilvl="8" w:tentative="1">
+      <w:start w:val="1"/>
+      <w:numFmt w:val="bullet"/>
+      <w:lvlText w:val=""/>
+      <w:lvlJc w:val="left"/>
+      <w:pPr>
+        <w:tabs>
+          <w:tab w:val="num" w:pos="6480"/>
+        </w:tabs>
+        <w:ind w:left="6480" w:hanging="360"/>
+      </w:pPr>
+      <w:rPr>
+        <w:rFonts w:ascii="Wingdings" w:hAnsi="Wingdings" w:hint="default"/>
+        <w:sz w:val="20"/>
+      </w:rPr>
+    </w:lvl>
+  </w:abstractNum>
+  <w:abstractNum w:abstractNumId="2">
     <w:nsid w:val="0E5325CF"/>
     <w:multiLevelType w:val="multilevel"/>
     <w:tmpl w:val="5418B672"/>
@@ -5559,7 +7335,156 @@
       </w:pPr>
     </w:lvl>
   </w:abstractNum>
-  <w:abstractNum w:abstractNumId="2">
+  <w:abstractNum w:abstractNumId="3">
+    <w:nsid w:val="0F462605"/>
+    <w:multiLevelType w:val="multilevel"/>
+    <w:tmpl w:val="8884D6B0"/>
+    <w:lvl w:ilvl="0">
+      <w:start w:val="1"/>
+      <w:numFmt w:val="bullet"/>
+      <w:lvlText w:val=""/>
+      <w:lvlJc w:val="left"/>
+      <w:pPr>
+        <w:tabs>
+          <w:tab w:val="num" w:pos="720"/>
+        </w:tabs>
+        <w:ind w:left="720" w:hanging="360"/>
+      </w:pPr>
+      <w:rPr>
+        <w:rFonts w:ascii="Symbol" w:hAnsi="Symbol" w:hint="default"/>
+        <w:sz w:val="20"/>
+      </w:rPr>
+    </w:lvl>
+    <w:lvl w:ilvl="1" w:tentative="1">
+      <w:start w:val="1"/>
+      <w:numFmt w:val="bullet"/>
+      <w:lvlText w:val="o"/>
+      <w:lvlJc w:val="left"/>
+      <w:pPr>
+        <w:tabs>
+          <w:tab w:val="num" w:pos="1440"/>
+        </w:tabs>
+        <w:ind w:left="1440" w:hanging="360"/>
+      </w:pPr>
+      <w:rPr>
+        <w:rFonts w:ascii="Courier New" w:hAnsi="Courier New" w:hint="default"/>
+        <w:sz w:val="20"/>
+      </w:rPr>
+    </w:lvl>
+    <w:lvl w:ilvl="2" w:tentative="1">
+      <w:start w:val="1"/>
+      <w:numFmt w:val="bullet"/>
+      <w:lvlText w:val=""/>
+      <w:lvlJc w:val="left"/>
+      <w:pPr>
+        <w:tabs>
+          <w:tab w:val="num" w:pos="2160"/>
+        </w:tabs>
+        <w:ind w:left="2160" w:hanging="360"/>
+      </w:pPr>
+      <w:rPr>
+        <w:rFonts w:ascii="Wingdings" w:hAnsi="Wingdings" w:hint="default"/>
+        <w:sz w:val="20"/>
+      </w:rPr>
+    </w:lvl>
+    <w:lvl w:ilvl="3" w:tentative="1">
+      <w:start w:val="1"/>
+      <w:numFmt w:val="bullet"/>
+      <w:lvlText w:val=""/>
+      <w:lvlJc w:val="left"/>
+      <w:pPr>
+        <w:tabs>
+          <w:tab w:val="num" w:pos="2880"/>
+        </w:tabs>
+        <w:ind w:left="2880" w:hanging="360"/>
+      </w:pPr>
+      <w:rPr>
+        <w:rFonts w:ascii="Wingdings" w:hAnsi="Wingdings" w:hint="default"/>
+        <w:sz w:val="20"/>
+      </w:rPr>
+    </w:lvl>
+    <w:lvl w:ilvl="4" w:tentative="1">
+      <w:start w:val="1"/>
+      <w:numFmt w:val="bullet"/>
+      <w:lvlText w:val=""/>
+      <w:lvlJc w:val="left"/>
+      <w:pPr>
+        <w:tabs>
+          <w:tab w:val="num" w:pos="3600"/>
+        </w:tabs>
+        <w:ind w:left="3600" w:hanging="360"/>
+      </w:pPr>
+      <w:rPr>
+        <w:rFonts w:ascii="Wingdings" w:hAnsi="Wingdings" w:hint="default"/>
+        <w:sz w:val="20"/>
+      </w:rPr>
+    </w:lvl>
+    <w:lvl w:ilvl="5" w:tentative="1">
+      <w:start w:val="1"/>
+      <w:numFmt w:val="bullet"/>
+      <w:lvlText w:val=""/>
+      <w:lvlJc w:val="left"/>
+      <w:pPr>
+        <w:tabs>
+          <w:tab w:val="num" w:pos="4320"/>
+        </w:tabs>
+        <w:ind w:left="4320" w:hanging="360"/>
+      </w:pPr>
+      <w:rPr>
+        <w:rFonts w:ascii="Wingdings" w:hAnsi="Wingdings" w:hint="default"/>
+        <w:sz w:val="20"/>
+      </w:rPr>
+    </w:lvl>
+    <w:lvl w:ilvl="6" w:tentative="1">
+      <w:start w:val="1"/>
+      <w:numFmt w:val="bullet"/>
+      <w:lvlText w:val=""/>
+      <w:lvlJc w:val="left"/>
+      <w:pPr>
+        <w:tabs>
+          <w:tab w:val="num" w:pos="5040"/>
+        </w:tabs>
+        <w:ind w:left="5040" w:hanging="360"/>
+      </w:pPr>
+      <w:rPr>
+        <w:rFonts w:ascii="Wingdings" w:hAnsi="Wingdings" w:hint="default"/>
+        <w:sz w:val="20"/>
+      </w:rPr>
+    </w:lvl>
+    <w:lvl w:ilvl="7" w:tentative="1">
+      <w:start w:val="1"/>
+      <w:numFmt w:val="bullet"/>
+      <w:lvlText w:val=""/>
+      <w:lvlJc w:val="left"/>
+      <w:pPr>
+        <w:tabs>
+          <w:tab w:val="num" w:pos="5760"/>
+        </w:tabs>
+        <w:ind w:left="5760" w:hanging="360"/>
+      </w:pPr>
+      <w:rPr>
+        <w:rFonts w:ascii="Wingdings" w:hAnsi="Wingdings" w:hint="default"/>
+        <w:sz w:val="20"/>
+      </w:rPr>
+    </w:lvl>
+    <w:lvl w:ilvl="8" w:tentative="1">
+      <w:start w:val="1"/>
+      <w:numFmt w:val="bullet"/>
+      <w:lvlText w:val=""/>
+      <w:lvlJc w:val="left"/>
+      <w:pPr>
+        <w:tabs>
+          <w:tab w:val="num" w:pos="6480"/>
+        </w:tabs>
+        <w:ind w:left="6480" w:hanging="360"/>
+      </w:pPr>
+      <w:rPr>
+        <w:rFonts w:ascii="Wingdings" w:hAnsi="Wingdings" w:hint="default"/>
+        <w:sz w:val="20"/>
+      </w:rPr>
+    </w:lvl>
+  </w:abstractNum>
+  <w:abstractNum w:abstractNumId="4">
     <w:nsid w:val="1ECA6943"/>
     <w:multiLevelType w:val="multilevel"/>
     <w:tmpl w:val="06D0BBA6"/>
@@ -5708,7 +7633,7 @@
       </w:rPr>
     </w:lvl>
   </w:abstractNum>
-  <w:abstractNum w:abstractNumId="3">
+  <w:abstractNum w:abstractNumId="5">
     <w:nsid w:val="292E0E63"/>
     <w:multiLevelType w:val="multilevel"/>
     <w:tmpl w:val="3BD85060"/>
@@ -5857,7 +7782,7 @@
       </w:rPr>
     </w:lvl>
   </w:abstractNum>
-  <w:abstractNum w:abstractNumId="4">
+  <w:abstractNum w:abstractNumId="6">
     <w:nsid w:val="2DB11069"/>
     <w:multiLevelType w:val="multilevel"/>
     <w:tmpl w:val="94BA4016"/>
@@ -6006,7 +7931,156 @@
       </w:rPr>
     </w:lvl>
   </w:abstractNum>
-  <w:abstractNum w:abstractNumId="5">
+  <w:abstractNum w:abstractNumId="7">
+    <w:nsid w:val="34014FE0"/>
+    <w:multiLevelType w:val="multilevel"/>
+    <w:tmpl w:val="15D27C72"/>
+    <w:lvl w:ilvl="0">
+      <w:start w:val="1"/>
+      <w:numFmt w:val="bullet"/>
+      <w:lvlText w:val=""/>
+      <w:lvlJc w:val="left"/>
+      <w:pPr>
+        <w:tabs>
+          <w:tab w:val="num" w:pos="720"/>
+        </w:tabs>
+        <w:ind w:left="720" w:hanging="360"/>
+      </w:pPr>
+      <w:rPr>
+        <w:rFonts w:ascii="Symbol" w:hAnsi="Symbol" w:hint="default"/>
+        <w:sz w:val="20"/>
+      </w:rPr>
+    </w:lvl>
+    <w:lvl w:ilvl="1" w:tentative="1">
+      <w:start w:val="1"/>
+      <w:numFmt w:val="bullet"/>
+      <w:lvlText w:val="o"/>
+      <w:lvlJc w:val="left"/>
+      <w:pPr>
+        <w:tabs>
+          <w:tab w:val="num" w:pos="1440"/>
+        </w:tabs>
+        <w:ind w:left="1440" w:hanging="360"/>
+      </w:pPr>
+      <w:rPr>
+        <w:rFonts w:ascii="Courier New" w:hAnsi="Courier New" w:hint="default"/>
+        <w:sz w:val="20"/>
+      </w:rPr>
+    </w:lvl>
+    <w:lvl w:ilvl="2" w:tentative="1">
+      <w:start w:val="1"/>
+      <w:numFmt w:val="bullet"/>
+      <w:lvlText w:val=""/>
+      <w:lvlJc w:val="left"/>
+      <w:pPr>
+        <w:tabs>
+          <w:tab w:val="num" w:pos="2160"/>
+        </w:tabs>
+        <w:ind w:left="2160" w:hanging="360"/>
+      </w:pPr>
+      <w:rPr>
+        <w:rFonts w:ascii="Wingdings" w:hAnsi="Wingdings" w:hint="default"/>
+        <w:sz w:val="20"/>
+      </w:rPr>
+    </w:lvl>
+    <w:lvl w:ilvl="3" w:tentative="1">
+      <w:start w:val="1"/>
+      <w:numFmt w:val="bullet"/>
+      <w:lvlText w:val=""/>
+      <w:lvlJc w:val="left"/>
+      <w:pPr>
+        <w:tabs>
+          <w:tab w:val="num" w:pos="2880"/>
+        </w:tabs>
+        <w:ind w:left="2880" w:hanging="360"/>
+      </w:pPr>
+      <w:rPr>
+        <w:rFonts w:ascii="Wingdings" w:hAnsi="Wingdings" w:hint="default"/>
+        <w:sz w:val="20"/>
+      </w:rPr>
+    </w:lvl>
+    <w:lvl w:ilvl="4" w:tentative="1">
+      <w:start w:val="1"/>
+      <w:numFmt w:val="bullet"/>
+      <w:lvlText w:val=""/>
+      <w:lvlJc w:val="left"/>
+      <w:pPr>
+        <w:tabs>
+          <w:tab w:val="num" w:pos="3600"/>
+        </w:tabs>
+        <w:ind w:left="3600" w:hanging="360"/>
+      </w:pPr>
+      <w:rPr>
+        <w:rFonts w:ascii="Wingdings" w:hAnsi="Wingdings" w:hint="default"/>
+        <w:sz w:val="20"/>
+      </w:rPr>
+    </w:lvl>
+    <w:lvl w:ilvl="5" w:tentative="1">
+      <w:start w:val="1"/>
+      <w:numFmt w:val="bullet"/>
+      <w:lvlText w:val=""/>
+      <w:lvlJc w:val="left"/>
+      <w:pPr>
+        <w:tabs>
+          <w:tab w:val="num" w:pos="4320"/>
+        </w:tabs>
+        <w:ind w:left="4320" w:hanging="360"/>
+      </w:pPr>
+      <w:rPr>
+        <w:rFonts w:ascii="Wingdings" w:hAnsi="Wingdings" w:hint="default"/>
+        <w:sz w:val="20"/>
+      </w:rPr>
+    </w:lvl>
+    <w:lvl w:ilvl="6" w:tentative="1">
+      <w:start w:val="1"/>
+      <w:numFmt w:val="bullet"/>
+      <w:lvlText w:val=""/>
+      <w:lvlJc w:val="left"/>
+      <w:pPr>
+        <w:tabs>
+          <w:tab w:val="num" w:pos="5040"/>
+        </w:tabs>
+        <w:ind w:left="5040" w:hanging="360"/>
+      </w:pPr>
+      <w:rPr>
+        <w:rFonts w:ascii="Wingdings" w:hAnsi="Wingdings" w:hint="default"/>
+        <w:sz w:val="20"/>
+      </w:rPr>
+    </w:lvl>
+    <w:lvl w:ilvl="7" w:tentative="1">
+      <w:start w:val="1"/>
+      <w:numFmt w:val="bullet"/>
+      <w:lvlText w:val=""/>
+      <w:lvlJc w:val="left"/>
+      <w:pPr>
+        <w:tabs>
+          <w:tab w:val="num" w:pos="5760"/>
+        </w:tabs>
+        <w:ind w:left="5760" w:hanging="360"/>
+      </w:pPr>
+      <w:rPr>
+        <w:rFonts w:ascii="Wingdings" w:hAnsi="Wingdings" w:hint="default"/>
+        <w:sz w:val="20"/>
+      </w:rPr>
+    </w:lvl>
+    <w:lvl w:ilvl="8" w:tentative="1">
+      <w:start w:val="1"/>
+      <w:numFmt w:val="bullet"/>
+      <w:lvlText w:val=""/>
+      <w:lvlJc w:val="left"/>
+      <w:pPr>
+        <w:tabs>
+          <w:tab w:val="num" w:pos="6480"/>
+        </w:tabs>
+        <w:ind w:left="6480" w:hanging="360"/>
+      </w:pPr>
+      <w:rPr>
+        <w:rFonts w:ascii="Wingdings" w:hAnsi="Wingdings" w:hint="default"/>
+        <w:sz w:val="20"/>
+      </w:rPr>
+    </w:lvl>
+  </w:abstractNum>
+  <w:abstractNum w:abstractNumId="8">
     <w:nsid w:val="36BE65E0"/>
     <w:multiLevelType w:val="multilevel"/>
     <w:tmpl w:val="0B867012"/>
@@ -6119,7 +8193,7 @@
       </w:pPr>
     </w:lvl>
   </w:abstractNum>
-  <w:abstractNum w:abstractNumId="6">
+  <w:abstractNum w:abstractNumId="9">
     <w:nsid w:val="3AFB7C87"/>
     <w:multiLevelType w:val="multilevel"/>
     <w:tmpl w:val="3528AAE8"/>
@@ -6268,7 +8342,156 @@
       </w:rPr>
     </w:lvl>
   </w:abstractNum>
-  <w:abstractNum w:abstractNumId="7">
+  <w:abstractNum w:abstractNumId="10">
+    <w:nsid w:val="59197006"/>
+    <w:multiLevelType w:val="multilevel"/>
+    <w:tmpl w:val="B1E071DA"/>
+    <w:lvl w:ilvl="0">
+      <w:start w:val="1"/>
+      <w:numFmt w:val="bullet"/>
+      <w:lvlText w:val=""/>
+      <w:lvlJc w:val="left"/>
+      <w:pPr>
+        <w:tabs>
+          <w:tab w:val="num" w:pos="720"/>
+        </w:tabs>
+        <w:ind w:left="720" w:hanging="360"/>
+      </w:pPr>
+      <w:rPr>
+        <w:rFonts w:ascii="Symbol" w:hAnsi="Symbol" w:hint="default"/>
+        <w:sz w:val="20"/>
+      </w:rPr>
+    </w:lvl>
+    <w:lvl w:ilvl="1" w:tentative="1">
+      <w:start w:val="1"/>
+      <w:numFmt w:val="bullet"/>
+      <w:lvlText w:val="o"/>
+      <w:lvlJc w:val="left"/>
+      <w:pPr>
+        <w:tabs>
+          <w:tab w:val="num" w:pos="1440"/>
+        </w:tabs>
+        <w:ind w:left="1440" w:hanging="360"/>
+      </w:pPr>
+      <w:rPr>
+        <w:rFonts w:ascii="Courier New" w:hAnsi="Courier New" w:hint="default"/>
+        <w:sz w:val="20"/>
+      </w:rPr>
+    </w:lvl>
+    <w:lvl w:ilvl="2" w:tentative="1">
+      <w:start w:val="1"/>
+      <w:numFmt w:val="bullet"/>
+      <w:lvlText w:val=""/>
+      <w:lvlJc w:val="left"/>
+      <w:pPr>
+        <w:tabs>
+          <w:tab w:val="num" w:pos="2160"/>
+        </w:tabs>
+        <w:ind w:left="2160" w:hanging="360"/>
+      </w:pPr>
+      <w:rPr>
+        <w:rFonts w:ascii="Wingdings" w:hAnsi="Wingdings" w:hint="default"/>
+        <w:sz w:val="20"/>
+      </w:rPr>
+    </w:lvl>
+    <w:lvl w:ilvl="3" w:tentative="1">
+      <w:start w:val="1"/>
+      <w:numFmt w:val="bullet"/>
+      <w:lvlText w:val=""/>
+      <w:lvlJc w:val="left"/>
+      <w:pPr>
+        <w:tabs>
+          <w:tab w:val="num" w:pos="2880"/>
+        </w:tabs>
+        <w:ind w:left="2880" w:hanging="360"/>
+      </w:pPr>
+      <w:rPr>
+        <w:rFonts w:ascii="Wingdings" w:hAnsi="Wingdings" w:hint="default"/>
+        <w:sz w:val="20"/>
+      </w:rPr>
+    </w:lvl>
+    <w:lvl w:ilvl="4" w:tentative="1">
+      <w:start w:val="1"/>
+      <w:numFmt w:val="bullet"/>
+      <w:lvlText w:val=""/>
+      <w:lvlJc w:val="left"/>
+      <w:pPr>
+        <w:tabs>
+          <w:tab w:val="num" w:pos="3600"/>
+        </w:tabs>
+        <w:ind w:left="3600" w:hanging="360"/>
+      </w:pPr>
+      <w:rPr>
+        <w:rFonts w:ascii="Wingdings" w:hAnsi="Wingdings" w:hint="default"/>
+        <w:sz w:val="20"/>
+      </w:rPr>
+    </w:lvl>
+    <w:lvl w:ilvl="5" w:tentative="1">
+      <w:start w:val="1"/>
+      <w:numFmt w:val="bullet"/>
+      <w:lvlText w:val=""/>
+      <w:lvlJc w:val="left"/>
+      <w:pPr>
+        <w:tabs>
+          <w:tab w:val="num" w:pos="4320"/>
+        </w:tabs>
+        <w:ind w:left="4320" w:hanging="360"/>
+      </w:pPr>
+      <w:rPr>
+        <w:rFonts w:ascii="Wingdings" w:hAnsi="Wingdings" w:hint="default"/>
+        <w:sz w:val="20"/>
+      </w:rPr>
+    </w:lvl>
+    <w:lvl w:ilvl="6" w:tentative="1">
+      <w:start w:val="1"/>
+      <w:numFmt w:val="bullet"/>
+      <w:lvlText w:val=""/>
+      <w:lvlJc w:val="left"/>
+      <w:pPr>
+        <w:tabs>
+          <w:tab w:val="num" w:pos="5040"/>
+        </w:tabs>
+        <w:ind w:left="5040" w:hanging="360"/>
+      </w:pPr>
+      <w:rPr>
+        <w:rFonts w:ascii="Wingdings" w:hAnsi="Wingdings" w:hint="default"/>
+        <w:sz w:val="20"/>
+      </w:rPr>
+    </w:lvl>
+    <w:lvl w:ilvl="7" w:tentative="1">
+      <w:start w:val="1"/>
+      <w:numFmt w:val="bullet"/>
+      <w:lvlText w:val=""/>
+      <w:lvlJc w:val="left"/>
+      <w:pPr>
+        <w:tabs>
+          <w:tab w:val="num" w:pos="5760"/>
+        </w:tabs>
+        <w:ind w:left="5760" w:hanging="360"/>
+      </w:pPr>
+      <w:rPr>
+        <w:rFonts w:ascii="Wingdings" w:hAnsi="Wingdings" w:hint="default"/>
+        <w:sz w:val="20"/>
+      </w:rPr>
+    </w:lvl>
+    <w:lvl w:ilvl="8" w:tentative="1">
+      <w:start w:val="1"/>
+      <w:numFmt w:val="bullet"/>
+      <w:lvlText w:val=""/>
+      <w:lvlJc w:val="left"/>
+      <w:pPr>
+        <w:tabs>
+          <w:tab w:val="num" w:pos="6480"/>
+        </w:tabs>
+        <w:ind w:left="6480" w:hanging="360"/>
+      </w:pPr>
+      <w:rPr>
+        <w:rFonts w:ascii="Wingdings" w:hAnsi="Wingdings" w:hint="default"/>
+        <w:sz w:val="20"/>
+      </w:rPr>
+    </w:lvl>
+  </w:abstractNum>
+  <w:abstractNum w:abstractNumId="11">
     <w:nsid w:val="5FF20168"/>
     <w:multiLevelType w:val="multilevel"/>
     <w:tmpl w:val="32AA17EE"/>
@@ -6417,7 +8640,7 @@
       </w:rPr>
     </w:lvl>
   </w:abstractNum>
-  <w:abstractNum w:abstractNumId="8">
+  <w:abstractNum w:abstractNumId="12">
     <w:nsid w:val="600A2B86"/>
     <w:multiLevelType w:val="multilevel"/>
     <w:tmpl w:val="C4C40B38"/>
@@ -6566,7 +8789,7 @@
       </w:rPr>
     </w:lvl>
   </w:abstractNum>
-  <w:abstractNum w:abstractNumId="9">
+  <w:abstractNum w:abstractNumId="13">
     <w:nsid w:val="63C665E0"/>
     <w:multiLevelType w:val="multilevel"/>
     <w:tmpl w:val="2DCAFF9A"/>
@@ -6715,7 +8938,156 @@
       </w:rPr>
     </w:lvl>
   </w:abstractNum>
-  <w:abstractNum w:abstractNumId="10">
+  <w:abstractNum w:abstractNumId="14">
+    <w:nsid w:val="648225FF"/>
+    <w:multiLevelType w:val="multilevel"/>
+    <w:tmpl w:val="A9AC9D6A"/>
+    <w:lvl w:ilvl="0">
+      <w:start w:val="1"/>
+      <w:numFmt w:val="bullet"/>
+      <w:lvlText w:val=""/>
+      <w:lvlJc w:val="left"/>
+      <w:pPr>
+        <w:tabs>
+          <w:tab w:val="num" w:pos="720"/>
+        </w:tabs>
+        <w:ind w:left="720" w:hanging="360"/>
+      </w:pPr>
+      <w:rPr>
+        <w:rFonts w:ascii="Symbol" w:hAnsi="Symbol" w:hint="default"/>
+        <w:sz w:val="20"/>
+      </w:rPr>
+    </w:lvl>
+    <w:lvl w:ilvl="1" w:tentative="1">
+      <w:start w:val="1"/>
+      <w:numFmt w:val="bullet"/>
+      <w:lvlText w:val="o"/>
+      <w:lvlJc w:val="left"/>
+      <w:pPr>
+        <w:tabs>
+          <w:tab w:val="num" w:pos="1440"/>
+        </w:tabs>
+        <w:ind w:left="1440" w:hanging="360"/>
+      </w:pPr>
+      <w:rPr>
+        <w:rFonts w:ascii="Courier New" w:hAnsi="Courier New" w:hint="default"/>
+        <w:sz w:val="20"/>
+      </w:rPr>
+    </w:lvl>
+    <w:lvl w:ilvl="2" w:tentative="1">
+      <w:start w:val="1"/>
+      <w:numFmt w:val="bullet"/>
+      <w:lvlText w:val=""/>
+      <w:lvlJc w:val="left"/>
+      <w:pPr>
+        <w:tabs>
+          <w:tab w:val="num" w:pos="2160"/>
+        </w:tabs>
+        <w:ind w:left="2160" w:hanging="360"/>
+      </w:pPr>
+      <w:rPr>
+        <w:rFonts w:ascii="Wingdings" w:hAnsi="Wingdings" w:hint="default"/>
+        <w:sz w:val="20"/>
+      </w:rPr>
+    </w:lvl>
+    <w:lvl w:ilvl="3" w:tentative="1">
+      <w:start w:val="1"/>
+      <w:numFmt w:val="bullet"/>
+      <w:lvlText w:val=""/>
+      <w:lvlJc w:val="left"/>
+      <w:pPr>
+        <w:tabs>
+          <w:tab w:val="num" w:pos="2880"/>
+        </w:tabs>
+        <w:ind w:left="2880" w:hanging="360"/>
+      </w:pPr>
+      <w:rPr>
+        <w:rFonts w:ascii="Wingdings" w:hAnsi="Wingdings" w:hint="default"/>
+        <w:sz w:val="20"/>
+      </w:rPr>
+    </w:lvl>
+    <w:lvl w:ilvl="4" w:tentative="1">
+      <w:start w:val="1"/>
+      <w:numFmt w:val="bullet"/>
+      <w:lvlText w:val=""/>
+      <w:lvlJc w:val="left"/>
+      <w:pPr>
+        <w:tabs>
+          <w:tab w:val="num" w:pos="3600"/>
+        </w:tabs>
+        <w:ind w:left="3600" w:hanging="360"/>
+      </w:pPr>
+      <w:rPr>
+        <w:rFonts w:ascii="Wingdings" w:hAnsi="Wingdings" w:hint="default"/>
+        <w:sz w:val="20"/>
+      </w:rPr>
+    </w:lvl>
+    <w:lvl w:ilvl="5" w:tentative="1">
+      <w:start w:val="1"/>
+      <w:numFmt w:val="bullet"/>
+      <w:lvlText w:val=""/>
+      <w:lvlJc w:val="left"/>
+      <w:pPr>
+        <w:tabs>
+          <w:tab w:val="num" w:pos="4320"/>
+        </w:tabs>
+        <w:ind w:left="4320" w:hanging="360"/>
+      </w:pPr>
+      <w:rPr>
+        <w:rFonts w:ascii="Wingdings" w:hAnsi="Wingdings" w:hint="default"/>
+        <w:sz w:val="20"/>
+      </w:rPr>
+    </w:lvl>
+    <w:lvl w:ilvl="6" w:tentative="1">
+      <w:start w:val="1"/>
+      <w:numFmt w:val="bullet"/>
+      <w:lvlText w:val=""/>
+      <w:lvlJc w:val="left"/>
+      <w:pPr>
+        <w:tabs>
+          <w:tab w:val="num" w:pos="5040"/>
+        </w:tabs>
+        <w:ind w:left="5040" w:hanging="360"/>
+      </w:pPr>
+      <w:rPr>
+        <w:rFonts w:ascii="Wingdings" w:hAnsi="Wingdings" w:hint="default"/>
+        <w:sz w:val="20"/>
+      </w:rPr>
+    </w:lvl>
+    <w:lvl w:ilvl="7" w:tentative="1">
+      <w:start w:val="1"/>
+      <w:numFmt w:val="bullet"/>
+      <w:lvlText w:val=""/>
+      <w:lvlJc w:val="left"/>
+      <w:pPr>
+        <w:tabs>
+          <w:tab w:val="num" w:pos="5760"/>
+        </w:tabs>
+        <w:ind w:left="5760" w:hanging="360"/>
+      </w:pPr>
+      <w:rPr>
+        <w:rFonts w:ascii="Wingdings" w:hAnsi="Wingdings" w:hint="default"/>
+        <w:sz w:val="20"/>
+      </w:rPr>
+    </w:lvl>
+    <w:lvl w:ilvl="8" w:tentative="1">
+      <w:start w:val="1"/>
+      <w:numFmt w:val="bullet"/>
+      <w:lvlText w:val=""/>
+      <w:lvlJc w:val="left"/>
+      <w:pPr>
+        <w:tabs>
+          <w:tab w:val="num" w:pos="6480"/>
+        </w:tabs>
+        <w:ind w:left="6480" w:hanging="360"/>
+      </w:pPr>
+      <w:rPr>
+        <w:rFonts w:ascii="Wingdings" w:hAnsi="Wingdings" w:hint="default"/>
+        <w:sz w:val="20"/>
+      </w:rPr>
+    </w:lvl>
+  </w:abstractNum>
+  <w:abstractNum w:abstractNumId="15">
     <w:nsid w:val="66CA21A4"/>
     <w:multiLevelType w:val="multilevel"/>
     <w:tmpl w:val="754073FA"/>
@@ -6864,7 +9236,7 @@
       </w:rPr>
     </w:lvl>
   </w:abstractNum>
-  <w:abstractNum w:abstractNumId="11">
+  <w:abstractNum w:abstractNumId="16">
     <w:nsid w:val="707165F3"/>
     <w:multiLevelType w:val="multilevel"/>
     <w:tmpl w:val="EDCA0A52"/>
@@ -7013,7 +9385,7 @@
       </w:rPr>
     </w:lvl>
   </w:abstractNum>
-  <w:abstractNum w:abstractNumId="12">
+  <w:abstractNum w:abstractNumId="17">
     <w:nsid w:val="711D2FD2"/>
     <w:multiLevelType w:val="multilevel"/>
     <w:tmpl w:val="9CDE9F7C"/>
@@ -7162,7 +9534,7 @@
       </w:rPr>
     </w:lvl>
   </w:abstractNum>
-  <w:abstractNum w:abstractNumId="13">
+  <w:abstractNum w:abstractNumId="18">
     <w:nsid w:val="7B693F27"/>
     <w:multiLevelType w:val="multilevel"/>
     <w:tmpl w:val="0A3C109E"/>
@@ -7311,7 +9683,7 @@
       </w:rPr>
     </w:lvl>
   </w:abstractNum>
-  <w:abstractNum w:abstractNumId="14">
+  <w:abstractNum w:abstractNumId="19">
     <w:nsid w:val="7E026D8E"/>
     <w:multiLevelType w:val="multilevel"/>
     <w:tmpl w:val="7B7CE878"/>
@@ -7460,7 +9832,7 @@
       </w:rPr>
     </w:lvl>
   </w:abstractNum>
-  <w:abstractNum w:abstractNumId="15">
+  <w:abstractNum w:abstractNumId="20">
     <w:nsid w:val="7FDB4FE6"/>
     <w:multiLevelType w:val="multilevel"/>
     <w:tmpl w:val="BBD220D6"/>
@@ -7610,52 +9982,67 @@
     </w:lvl>
   </w:abstractNum>
   <w:num w:numId="1">
-    <w:abstractNumId w:val="7"/>
+    <w:abstractNumId w:val="11"/>
   </w:num>
   <w:num w:numId="2">
-    <w:abstractNumId w:val="6"/>
+    <w:abstractNumId w:val="9"/>
   </w:num>
   <w:num w:numId="3">
     <w:abstractNumId w:val="0"/>
   </w:num>
   <w:num w:numId="4">
+    <w:abstractNumId w:val="15"/>
+  </w:num>
+  <w:num w:numId="5">
+    <w:abstractNumId w:val="16"/>
+  </w:num>
+  <w:num w:numId="6">
+    <w:abstractNumId w:val="8"/>
+  </w:num>
+  <w:num w:numId="7">
+    <w:abstractNumId w:val="5"/>
+  </w:num>
+  <w:num w:numId="8">
+    <w:abstractNumId w:val="13"/>
+  </w:num>
+  <w:num w:numId="9">
+    <w:abstractNumId w:val="4"/>
+  </w:num>
+  <w:num w:numId="10">
+    <w:abstractNumId w:val="6"/>
+  </w:num>
+  <w:num w:numId="11">
+    <w:abstractNumId w:val="20"/>
+  </w:num>
+  <w:num w:numId="12">
+    <w:abstractNumId w:val="19"/>
+  </w:num>
+  <w:num w:numId="13">
+    <w:abstractNumId w:val="17"/>
+  </w:num>
+  <w:num w:numId="14">
+    <w:abstractNumId w:val="18"/>
+  </w:num>
+  <w:num w:numId="15">
+    <w:abstractNumId w:val="2"/>
+  </w:num>
+  <w:num w:numId="16">
+    <w:abstractNumId w:val="12"/>
+  </w:num>
+  <w:num w:numId="17">
     <w:abstractNumId w:val="10"/>
   </w:num>
-  <w:num w:numId="5">
-    <w:abstractNumId w:val="11"/>
+  <w:num w:numId="18">
+    <w:abstractNumId w:val="1"/>
   </w:num>
-  <w:num w:numId="6">
-    <w:abstractNumId w:val="5"/>
-  </w:num>
-  <w:num w:numId="7">
+  <w:num w:numId="19">
     <w:abstractNumId w:val="3"/>
   </w:num>
-  <w:num w:numId="8">
-    <w:abstractNumId w:val="9"/>
-  </w:num>
-  <w:num w:numId="9">
-    <w:abstractNumId w:val="2"/>
-  </w:num>
-  <w:num w:numId="10">
-    <w:abstractNumId w:val="4"/>
-  </w:num>
-  <w:num w:numId="11">
-    <w:abstractNumId w:val="15"/>
-  </w:num>
-  <w:num w:numId="12">
+  <w:num w:numId="20">
     <w:abstractNumId w:val="14"/>
   </w:num>
-  <w:num w:numId="13">
-    <w:abstractNumId w:val="12"/>
-  </w:num>
-  <w:num w:numId="14">
-    <w:abstractNumId w:val="13"/>
-  </w:num>
-  <w:num w:numId="15">
-    <w:abstractNumId w:val="1"/>
-  </w:num>
-  <w:num w:numId="16">
-    <w:abstractNumId w:val="8"/>
+  <w:num w:numId="21">
+    <w:abstractNumId w:val="7"/>
   </w:num>
 </w:numbering>
 </file>
@@ -7881,6 +10268,31 @@
       <w:lang w:eastAsia="en-IN" w:bidi="ta-IN"/>
     </w:rPr>
   </w:style>
+  <w:style w:type="paragraph" w:styleId="Heading4">
+    <w:name w:val="heading 4"/>
+    <w:basedOn w:val="Normal"/>
+    <w:next w:val="Normal"/>
+    <w:link w:val="Heading4Char"/>
+    <w:uiPriority w:val="9"/>
+    <w:semiHidden/>
+    <w:unhideWhenUsed/>
+    <w:qFormat/>
+    <w:rsid w:val="00D57DC5"/>
+    <w:pPr>
+      <w:keepNext/>
+      <w:keepLines/>
+      <w:spacing w:before="200" w:after="0"/>
+      <w:outlineLvl w:val="3"/>
+    </w:pPr>
+    <w:rPr>
+      <w:rFonts w:asciiTheme="majorHAnsi" w:eastAsiaTheme="majorEastAsia" w:hAnsiTheme="majorHAnsi" w:cstheme="majorBidi"/>
+      <w:b/>
+      <w:bCs/>
+      <w:i/>
+      <w:iCs/>
+      <w:color w:val="4F81BD" w:themeColor="accent1"/>
+    </w:rPr>
+  </w:style>
   <w:style w:type="character" w:default="1" w:styleId="DefaultParagraphFont">
     <w:name w:val="Default Paragraph Font"/>
     <w:uiPriority w:val="1"/>
@@ -7998,6 +10410,22 @@
       <w:rFonts w:ascii="Courier New" w:eastAsia="Times New Roman" w:hAnsi="Courier New" w:cs="Courier New"/>
       <w:sz w:val="20"/>
       <w:szCs w:val="20"/>
+    </w:rPr>
+  </w:style>
+  <w:style w:type="character" w:customStyle="1" w:styleId="Heading4Char">
+    <w:name w:val="Heading 4 Char"/>
+    <w:basedOn w:val="DefaultParagraphFont"/>
+    <w:link w:val="Heading4"/>
+    <w:uiPriority w:val="9"/>
+    <w:semiHidden/>
+    <w:rsid w:val="00D57DC5"/>
+    <w:rPr>
+      <w:rFonts w:asciiTheme="majorHAnsi" w:eastAsiaTheme="majorEastAsia" w:hAnsiTheme="majorHAnsi" w:cstheme="majorBidi"/>
+      <w:b/>
+      <w:bCs/>
+      <w:i/>
+      <w:iCs/>
+      <w:color w:val="4F81BD" w:themeColor="accent1"/>
     </w:rPr>
   </w:style>
 </w:styles>
@@ -8224,6 +10652,31 @@
       <w:lang w:eastAsia="en-IN" w:bidi="ta-IN"/>
     </w:rPr>
   </w:style>
+  <w:style w:type="paragraph" w:styleId="Heading4">
+    <w:name w:val="heading 4"/>
+    <w:basedOn w:val="Normal"/>
+    <w:next w:val="Normal"/>
+    <w:link w:val="Heading4Char"/>
+    <w:uiPriority w:val="9"/>
+    <w:semiHidden/>
+    <w:unhideWhenUsed/>
+    <w:qFormat/>
+    <w:rsid w:val="00D57DC5"/>
+    <w:pPr>
+      <w:keepNext/>
+      <w:keepLines/>
+      <w:spacing w:before="200" w:after="0"/>
+      <w:outlineLvl w:val="3"/>
+    </w:pPr>
+    <w:rPr>
+      <w:rFonts w:asciiTheme="majorHAnsi" w:eastAsiaTheme="majorEastAsia" w:hAnsiTheme="majorHAnsi" w:cstheme="majorBidi"/>
+      <w:b/>
+      <w:bCs/>
+      <w:i/>
+      <w:iCs/>
+      <w:color w:val="4F81BD" w:themeColor="accent1"/>
+    </w:rPr>
+  </w:style>
   <w:style w:type="character" w:default="1" w:styleId="DefaultParagraphFont">
     <w:name w:val="Default Paragraph Font"/>
     <w:uiPriority w:val="1"/>
@@ -8341,6 +10794,22 @@
       <w:rFonts w:ascii="Courier New" w:eastAsia="Times New Roman" w:hAnsi="Courier New" w:cs="Courier New"/>
       <w:sz w:val="20"/>
       <w:szCs w:val="20"/>
+    </w:rPr>
+  </w:style>
+  <w:style w:type="character" w:customStyle="1" w:styleId="Heading4Char">
+    <w:name w:val="Heading 4 Char"/>
+    <w:basedOn w:val="DefaultParagraphFont"/>
+    <w:link w:val="Heading4"/>
+    <w:uiPriority w:val="9"/>
+    <w:semiHidden/>
+    <w:rsid w:val="00D57DC5"/>
+    <w:rPr>
+      <w:rFonts w:asciiTheme="majorHAnsi" w:eastAsiaTheme="majorEastAsia" w:hAnsiTheme="majorHAnsi" w:cstheme="majorBidi"/>
+      <w:b/>
+      <w:bCs/>
+      <w:i/>
+      <w:iCs/>
+      <w:color w:val="4F81BD" w:themeColor="accent1"/>
     </w:rPr>
   </w:style>
 </w:styles>

</xml_diff>